<commit_message>
Feed confident social housing report matches into tracker and study
31 vetted matches (name, units, consistent dates) add Department project
number, programme, AHB, stage and quarter to the pipeline workbook, mark
turnkey and AHB schemes as public, and supply completion dates CIS lacked.
Uncertain and unmatched rows are omitted.

Co-Authored-By: Claude Opus 5.5 <noreply@anthropic.com>
Claude-Session: https://claude.ai/code/session_01NzU6RZjdYh3MCXCEtKHHfb
</commit_message>
<xml_diff>
--- a/limerick_pipeline/delivery_study/Limerick_Residential_Delivery_Study.docx
+++ b/limerick_pipeline/delivery_study/Limerick_Residential_Delivery_Study.docx
@@ -181,7 +181,7 @@
           <w:sz w:val="21"/>
           <w:szCs w:val="21"/>
         </w:rPr>
-        <w:t xml:space="preserve">(interquartile range 2.6 to 5.0 years, 44 schemes). Median build-out rates run from 4 dwellings per annum on schemes of 1–9 units to 50 on schemes of 100+ units, though the larger bands rest on very few completed schemes.</w:t>
+        <w:t xml:space="preserve">(interquartile range 2.6 to 5.1 years, 47 schemes). Median build-out rates run from 4 dwellings per annum on schemes of 1–9 units to 50 on schemes of 100+ units, though the larger bands rest on very few completed schemes.</w:t>
       </w:r>
     </w:p>
     <w:p>
@@ -204,7 +204,7 @@
           <w:sz w:val="21"/>
           <w:szCs w:val="21"/>
         </w:rPr>
-        <w:t xml:space="preserve">Public schemes (76 schemes, 1,764 units, 16% of units) have a median approval period of 0.3 years against 0.7 for private schemes. After permission, 34% of public schemes had started within two years against 51% of private schemes. Over the longer run the gap narrows: on permissions at least two years old, 72% of public units and 68% of private units have started.</w:t>
+        <w:t xml:space="preserve">Public schemes (84 schemes, 1,880 units, 17% of units) have a median approval period of 0.3 years against 0.7 for private schemes. After permission, 40% of public schemes had started within two years against 50% of private schemes. Over the longer run the gap narrows: on permissions at least two years old, 76% of public units and 68% of private units have started.</w:t>
       </w:r>
     </w:p>
     <w:p>
@@ -219,7 +219,7 @@
           <w:sz w:val="21"/>
           <w:szCs w:val="21"/>
         </w:rPr>
-        <w:t xml:space="preserve">5,780 permitted units have not started. </w:t>
+        <w:t xml:space="preserve">5,756 permitted units have not started. </w:t>
       </w:r>
       <w:r>
         <w:rPr>
@@ -273,7 +273,7 @@
           <w:sz w:val="21"/>
           <w:szCs w:val="21"/>
         </w:rPr>
-        <w:t xml:space="preserve">Completion certificates exist for 41 of the 44 schemes CIS records as complete, but they account for only 328 of the 1,226 units CIS reports.</w:t>
+        <w:t xml:space="preserve">Completion certificates exist for 44 of the 47 completed schemes, but they account for only 340 of their 1,275 units.</w:t>
       </w:r>
     </w:p>
     <w:p>
@@ -761,7 +761,7 @@
                 <w:sz w:val="17"/>
                 <w:szCs w:val="17"/>
               </w:rPr>
-              <w:t xml:space="preserve">CIS project updates (dated), CIS finish dates</w:t>
+              <w:t xml:space="preserve">CIS project updates (dated), CIS finish dates; Department of Housing social housing construction status report for matched public schemes</w:t>
             </w:r>
           </w:p>
         </w:tc>
@@ -793,7 +793,7 @@
                 <w:sz w:val="17"/>
                 <w:szCs w:val="17"/>
               </w:rPr>
-              <w:t xml:space="preserve">44 completed schemes</w:t>
+              <w:t xml:space="preserve">47 completed schemes</w:t>
             </w:r>
           </w:p>
         </w:tc>
@@ -863,7 +863,7 @@
                 <w:sz w:val="17"/>
                 <w:szCs w:val="17"/>
               </w:rPr>
-              <w:t xml:space="preserve">Grantee named in CIS records, CIS promoter, building control flags for local authority and approved housing body projects, Part 8 file numbers</w:t>
+              <w:t xml:space="preserve">Grantee named in CIS records, CIS promoter, building control flags for local authority and approved housing body projects, Part 8 file numbers, Department of Housing social housing construction status report (Q1 2026)</w:t>
             </w:r>
           </w:p>
         </w:tc>
@@ -1157,7 +1157,7 @@
           <w:sz w:val="21"/>
           <w:szCs w:val="21"/>
         </w:rPr>
-        <w:t xml:space="preserve">schemes promoted by Limerick City and County Council (including Part 8), approved housing bodies or the Land Development Agency. Private developer schemes sold or leased to a public body after permission (turnkey delivery) are classed as private unless a building control notice or CIS record identifies the public body.</w:t>
+        <w:t xml:space="preserve">schemes promoted by Limerick City and County Council (including Part 8), approved housing bodies or the Land Development Agency. Turnkey schemes bought by a public body are classed as public where the Department of Housing’s social housing construction status report (Q1 2026) could be matched to the scheme with confidence; other turnkeys remain classed as private.</w:t>
       </w:r>
     </w:p>
     <w:p>
@@ -1194,7 +1194,32 @@
         <w:rPr>
           <w:rFonts w:ascii="Arial" w:cs="Arial" w:eastAsia="Arial" w:hAnsi="Arial"/>
         </w:rPr>
-        <w:t xml:space="preserve">2.4 Limitations</w:t>
+        <w:t xml:space="preserve">2.4 Social housing construction report</w:t>
+      </w:r>
+    </w:p>
+    <w:p>
+      <w:pPr>
+        <w:spacing w:after="120" w:line="290"/>
+      </w:pPr>
+      <w:r>
+        <w:rPr>
+          <w:rFonts w:ascii="Arial" w:cs="Arial" w:eastAsia="Arial" w:hAnsi="Arial"/>
+          <w:sz w:val="21"/>
+          <w:szCs w:val="21"/>
+        </w:rPr>
+        <w:t xml:space="preserve">The Department of Housing’s quarterly status report lists social housing construction and turnkey projects by name, units, funding programme and stage, without planning references or coordinates. It was matched to the study schemes on name, address and unit count. 31 schemes (460 units) matched with confidence and consistent dates; these supply public ownership (including 5 turnkey purchases), and completion dates for 3 schemes that CIS had not recorded as complete. Buy and Renew, remedial works and rows that could not be matched with confidence were not used.</w:t>
+      </w:r>
+    </w:p>
+    <w:p>
+      <w:pPr>
+        <w:pStyle w:val="Heading2"/>
+        <w:spacing w:after="100" w:before="200"/>
+      </w:pPr>
+      <w:r>
+        <w:rPr>
+          <w:rFonts w:ascii="Arial" w:cs="Arial" w:eastAsia="Arial" w:hAnsi="Arial"/>
+        </w:rPr>
+        <w:t xml:space="preserve">2.5 Limitations</w:t>
       </w:r>
     </w:p>
     <w:p>
@@ -1701,7 +1726,7 @@
                 <w:sz w:val="17"/>
                 <w:szCs w:val="17"/>
               </w:rPr>
-              <w:t xml:space="preserve">1.8 (n=16)</w:t>
+              <w:t xml:space="preserve">1.7 (n=18)</w:t>
             </w:r>
           </w:p>
         </w:tc>
@@ -2033,7 +2058,7 @@
                 <w:sz w:val="17"/>
                 <w:szCs w:val="17"/>
               </w:rPr>
-              <w:t xml:space="preserve">1.4 (n=5)</w:t>
+              <w:t xml:space="preserve">1.4 (n=6)</w:t>
             </w:r>
           </w:p>
         </w:tc>
@@ -2065,7 +2090,7 @@
                 <w:sz w:val="17"/>
                 <w:szCs w:val="17"/>
               </w:rPr>
-              <w:t xml:space="preserve">17.9</w:t>
+              <w:t xml:space="preserve">21.5</w:t>
             </w:r>
           </w:p>
         </w:tc>
@@ -2531,7 +2556,7 @@
                 <w:sz w:val="17"/>
                 <w:szCs w:val="17"/>
               </w:rPr>
-              <w:t xml:space="preserve">1.8 (n=44)</w:t>
+              <w:t xml:space="preserve">1.8 (n=47)</w:t>
             </w:r>
           </w:p>
         </w:tc>
@@ -2563,7 +2588,7 @@
                 <w:sz w:val="17"/>
                 <w:szCs w:val="17"/>
               </w:rPr>
-              <w:t xml:space="preserve">7.7</w:t>
+              <w:t xml:space="preserve">8</w:t>
             </w:r>
           </w:p>
         </w:tc>
@@ -4495,7 +4520,7 @@
           <w:sz w:val="21"/>
           <w:szCs w:val="21"/>
         </w:rPr>
-        <w:t xml:space="preserve">Public schemes account for 76 of the 262 schemes and 1,764 units (16%). Most are local authority schemes (67 schemes, 1,265 units), followed by approved housing bodies (8 schemes, 214 units). The Land Development Agency has one scheme in the sample: the former Limerick Gasworks site on Dock Road (25/60780, 285 units), granted in February 2026 and at tender stage.</w:t>
+        <w:t xml:space="preserve">Public schemes account for 84 of the 262 schemes and 1,880 units (17%). Most are local authority schemes (67 schemes, 1,256 units), followed by approved housing bodies (16 schemes, 339 units). The Land Development Agency has one scheme in the sample: the former Limerick Gasworks site on Dock Road (25/60780, 285 units), granted in February 2026 and at tender stage.</w:t>
       </w:r>
     </w:p>
     <w:tbl>
@@ -4835,7 +4860,7 @@
                 <w:sz w:val="17"/>
                 <w:szCs w:val="17"/>
               </w:rPr>
-              <w:t xml:space="preserve">76</w:t>
+              <w:t xml:space="preserve">84</w:t>
             </w:r>
           </w:p>
         </w:tc>
@@ -4867,7 +4892,7 @@
                 <w:sz w:val="17"/>
                 <w:szCs w:val="17"/>
               </w:rPr>
-              <w:t xml:space="preserve">1,764</w:t>
+              <w:t xml:space="preserve">1,880</w:t>
             </w:r>
           </w:p>
         </w:tc>
@@ -4931,7 +4956,7 @@
                 <w:sz w:val="17"/>
                 <w:szCs w:val="17"/>
               </w:rPr>
-              <w:t xml:space="preserve">1.8 (n=29)</w:t>
+              <w:t xml:space="preserve">1.7 (n=36)</w:t>
             </w:r>
           </w:p>
         </w:tc>
@@ -4963,7 +4988,7 @@
                 <w:sz w:val="17"/>
                 <w:szCs w:val="17"/>
               </w:rPr>
-              <w:t xml:space="preserve">1.9 (n=13)</w:t>
+              <w:t xml:space="preserve">1.5 (n=18)</w:t>
             </w:r>
           </w:p>
         </w:tc>
@@ -4995,7 +5020,7 @@
                 <w:sz w:val="17"/>
                 <w:szCs w:val="17"/>
               </w:rPr>
-              <w:t xml:space="preserve">7.1</w:t>
+              <w:t xml:space="preserve">7.6</w:t>
             </w:r>
           </w:p>
         </w:tc>
@@ -5065,7 +5090,7 @@
                 <w:sz w:val="17"/>
                 <w:szCs w:val="17"/>
               </w:rPr>
-              <w:t xml:space="preserve">186</w:t>
+              <w:t xml:space="preserve">178</w:t>
             </w:r>
           </w:p>
         </w:tc>
@@ -5097,7 +5122,7 @@
                 <w:sz w:val="17"/>
                 <w:szCs w:val="17"/>
               </w:rPr>
-              <w:t xml:space="preserve">9,115</w:t>
+              <w:t xml:space="preserve">8,999</w:t>
             </w:r>
           </w:p>
         </w:tc>
@@ -5161,7 +5186,7 @@
                 <w:sz w:val="17"/>
                 <w:szCs w:val="17"/>
               </w:rPr>
-              <w:t xml:space="preserve">1.1 (n=102)</w:t>
+              <w:t xml:space="preserve">1 (n=95)</w:t>
             </w:r>
           </w:p>
         </w:tc>
@@ -5193,7 +5218,7 @@
                 <w:sz w:val="17"/>
                 <w:szCs w:val="17"/>
               </w:rPr>
-              <w:t xml:space="preserve">1.8 (n=31)</w:t>
+              <w:t xml:space="preserve">1.8 (n=29)</w:t>
             </w:r>
           </w:p>
         </w:tc>
@@ -5262,7 +5287,7 @@
           <w:sz w:val="21"/>
           <w:szCs w:val="21"/>
         </w:rPr>
-        <w:t xml:space="preserve">Public schemes get through planning faster, mainly because Part 8 approvals are not subject to further information requests or appeal. They are slower to start: 34% had started within two years of approval, against 51% of private schemes. In our experience, public schemes usually go to tender and seek funding approval after planning, which adds time before a contractor is on site.</w:t>
+        <w:t xml:space="preserve">Public schemes get through planning faster, mainly because Part 8 approvals are not subject to further information requests or appeal. They are slower to start: 40% had started within two years of approval, against 50% of private schemes. In our experience, public schemes usually go to tender and seek funding approval after planning, which adds time before a contractor is on site.</w:t>
       </w:r>
     </w:p>
     <w:p>
@@ -5644,7 +5669,7 @@
                 <w:sz w:val="17"/>
                 <w:szCs w:val="17"/>
               </w:rPr>
-              <w:t xml:space="preserve">6% (51)</w:t>
+              <w:t xml:space="preserve">7% (59)</w:t>
             </w:r>
           </w:p>
         </w:tc>
@@ -5676,7 +5701,7 @@
                 <w:sz w:val="17"/>
                 <w:szCs w:val="17"/>
               </w:rPr>
-              <w:t xml:space="preserve">34% (47)</w:t>
+              <w:t xml:space="preserve">40% (55)</w:t>
             </w:r>
           </w:p>
         </w:tc>
@@ -5708,7 +5733,7 @@
                 <w:sz w:val="17"/>
                 <w:szCs w:val="17"/>
               </w:rPr>
-              <w:t xml:space="preserve">45% (42)</w:t>
+              <w:t xml:space="preserve">52% (48)</w:t>
             </w:r>
           </w:p>
         </w:tc>
@@ -5740,7 +5765,7 @@
                 <w:sz w:val="17"/>
                 <w:szCs w:val="17"/>
               </w:rPr>
-              <w:t xml:space="preserve">58% (33)</w:t>
+              <w:t xml:space="preserve">63% (38)</w:t>
             </w:r>
           </w:p>
         </w:tc>
@@ -5772,7 +5797,7 @@
                 <w:sz w:val="17"/>
                 <w:szCs w:val="17"/>
               </w:rPr>
-              <w:t xml:space="preserve">54% (24)</w:t>
+              <w:t xml:space="preserve">58% (26)</w:t>
             </w:r>
           </w:p>
         </w:tc>
@@ -5842,7 +5867,7 @@
                 <w:sz w:val="17"/>
                 <w:szCs w:val="17"/>
               </w:rPr>
-              <w:t xml:space="preserve">30% (153)</w:t>
+              <w:t xml:space="preserve">31% (145)</w:t>
             </w:r>
           </w:p>
         </w:tc>
@@ -5874,7 +5899,7 @@
                 <w:sz w:val="17"/>
                 <w:szCs w:val="17"/>
               </w:rPr>
-              <w:t xml:space="preserve">51% (133)</w:t>
+              <w:t xml:space="preserve">50% (125)</w:t>
             </w:r>
           </w:p>
         </w:tc>
@@ -5906,7 +5931,7 @@
                 <w:sz w:val="17"/>
                 <w:szCs w:val="17"/>
               </w:rPr>
-              <w:t xml:space="preserve">59% (101)</w:t>
+              <w:t xml:space="preserve">57% (95)</w:t>
             </w:r>
           </w:p>
         </w:tc>
@@ -5938,7 +5963,7 @@
                 <w:sz w:val="17"/>
                 <w:szCs w:val="17"/>
               </w:rPr>
-              <w:t xml:space="preserve">66% (88)</w:t>
+              <w:t xml:space="preserve">64% (83)</w:t>
             </w:r>
           </w:p>
         </w:tc>
@@ -5970,7 +5995,7 @@
                 <w:sz w:val="17"/>
                 <w:szCs w:val="17"/>
               </w:rPr>
-              <w:t xml:space="preserve">77% (65)</w:t>
+              <w:t xml:space="preserve">76% (63)</w:t>
             </w:r>
           </w:p>
         </w:tc>
@@ -6007,7 +6032,7 @@
           <w:sz w:val="21"/>
           <w:szCs w:val="21"/>
         </w:rPr>
-        <w:t xml:space="preserve">Measured by units rather than schemes, public delivery holds up: on permissions at least two years old, 72% of public units have started against 68% of private units. The difference reflects a larger number of small public schemes that have not started alongside larger public schemes that have.</w:t>
+        <w:t xml:space="preserve">Measured by units rather than schemes, public delivery holds up: on permissions at least two years old, 76% of public units have started against 68% of private units. The difference reflects a larger number of small public schemes that have not started alongside larger public schemes that have.</w:t>
       </w:r>
     </w:p>
     <w:tbl>
@@ -6311,7 +6336,7 @@
                 <w:sz w:val="17"/>
                 <w:szCs w:val="17"/>
               </w:rPr>
-              <w:t xml:space="preserve">40</w:t>
+              <w:t xml:space="preserve">41</w:t>
             </w:r>
           </w:p>
         </w:tc>
@@ -6343,7 +6368,7 @@
                 <w:sz w:val="17"/>
                 <w:szCs w:val="17"/>
               </w:rPr>
-              <w:t xml:space="preserve">929</w:t>
+              <w:t xml:space="preserve">932</w:t>
             </w:r>
           </w:p>
         </w:tc>
@@ -6375,7 +6400,7 @@
                 <w:sz w:val="17"/>
                 <w:szCs w:val="17"/>
               </w:rPr>
-              <w:t xml:space="preserve">659</w:t>
+              <w:t xml:space="preserve">686</w:t>
             </w:r>
           </w:p>
         </w:tc>
@@ -6407,7 +6432,7 @@
                 <w:sz w:val="17"/>
                 <w:szCs w:val="17"/>
               </w:rPr>
-              <w:t xml:space="preserve">71%</w:t>
+              <w:t xml:space="preserve">74%</w:t>
             </w:r>
           </w:p>
         </w:tc>
@@ -6439,7 +6464,7 @@
                 <w:sz w:val="17"/>
                 <w:szCs w:val="17"/>
               </w:rPr>
-              <w:t xml:space="preserve">1.8</w:t>
+              <w:t xml:space="preserve">1.7</w:t>
             </w:r>
           </w:p>
         </w:tc>
@@ -6509,7 +6534,7 @@
                 <w:sz w:val="17"/>
                 <w:szCs w:val="17"/>
               </w:rPr>
-              <w:t xml:space="preserve">7</w:t>
+              <w:t xml:space="preserve">14</w:t>
             </w:r>
           </w:p>
         </w:tc>
@@ -6541,7 +6566,7 @@
                 <w:sz w:val="17"/>
                 <w:szCs w:val="17"/>
               </w:rPr>
-              <w:t xml:space="preserve">206</w:t>
+              <w:t xml:space="preserve">319</w:t>
             </w:r>
           </w:p>
         </w:tc>
@@ -6573,7 +6598,7 @@
                 <w:sz w:val="17"/>
                 <w:szCs w:val="17"/>
               </w:rPr>
-              <w:t xml:space="preserve">162</w:t>
+              <w:t xml:space="preserve">265</w:t>
             </w:r>
           </w:p>
         </w:tc>
@@ -6605,7 +6630,7 @@
                 <w:sz w:val="17"/>
                 <w:szCs w:val="17"/>
               </w:rPr>
-              <w:t xml:space="preserve">79%</w:t>
+              <w:t xml:space="preserve">83%</w:t>
             </w:r>
           </w:p>
         </w:tc>
@@ -6637,7 +6662,7 @@
                 <w:sz w:val="17"/>
                 <w:szCs w:val="17"/>
               </w:rPr>
-              <w:t xml:space="preserve">2.2</w:t>
+              <w:t xml:space="preserve">2</w:t>
             </w:r>
           </w:p>
         </w:tc>
@@ -6707,7 +6732,7 @@
                 <w:sz w:val="17"/>
                 <w:szCs w:val="17"/>
               </w:rPr>
-              <w:t xml:space="preserve">133</w:t>
+              <w:t xml:space="preserve">125</w:t>
             </w:r>
           </w:p>
         </w:tc>
@@ -6739,7 +6764,7 @@
                 <w:sz w:val="17"/>
                 <w:szCs w:val="17"/>
               </w:rPr>
-              <w:t xml:space="preserve">5,322</w:t>
+              <w:t xml:space="preserve">5,206</w:t>
             </w:r>
           </w:p>
         </w:tc>
@@ -6771,7 +6796,7 @@
                 <w:sz w:val="17"/>
                 <w:szCs w:val="17"/>
               </w:rPr>
-              <w:t xml:space="preserve">3,637</w:t>
+              <w:t xml:space="preserve">3,531</w:t>
             </w:r>
           </w:p>
         </w:tc>
@@ -6835,7 +6860,7 @@
                 <w:sz w:val="17"/>
                 <w:szCs w:val="17"/>
               </w:rPr>
-              <w:t xml:space="preserve">1.3</w:t>
+              <w:t xml:space="preserve">1.2</w:t>
             </w:r>
           </w:p>
         </w:tc>
@@ -6879,7 +6904,7 @@
           <w:sz w:val="21"/>
           <w:szCs w:val="21"/>
         </w:rPr>
-        <w:t xml:space="preserve">44 schemes in the sample have been completed. The median build period was 1.8 years. Build-out rates rise with scheme size: larger schemes run more units in parallel.</w:t>
+        <w:t xml:space="preserve">47 schemes in the sample have been completed. The median build period was 1.8 years. Build-out rates rise with scheme size: larger schemes run more units in parallel.</w:t>
       </w:r>
     </w:p>
     <w:p>
@@ -7225,7 +7250,7 @@
                 <w:sz w:val="17"/>
                 <w:szCs w:val="17"/>
               </w:rPr>
-              <w:t xml:space="preserve">44</w:t>
+              <w:t xml:space="preserve">47</w:t>
             </w:r>
           </w:p>
         </w:tc>
@@ -7289,7 +7314,7 @@
                 <w:sz w:val="17"/>
                 <w:szCs w:val="17"/>
               </w:rPr>
-              <w:t xml:space="preserve">7.7</w:t>
+              <w:t xml:space="preserve">8</w:t>
             </w:r>
           </w:p>
         </w:tc>
@@ -7321,7 +7346,7 @@
                 <w:sz w:val="17"/>
                 <w:szCs w:val="17"/>
               </w:rPr>
-              <w:t xml:space="preserve">4.2–17.7</w:t>
+              <w:t xml:space="preserve">4.2–17.8</w:t>
             </w:r>
           </w:p>
         </w:tc>
@@ -7391,7 +7416,7 @@
                 <w:sz w:val="17"/>
                 <w:szCs w:val="17"/>
               </w:rPr>
-              <w:t xml:space="preserve">16</w:t>
+              <w:t xml:space="preserve">18</w:t>
             </w:r>
           </w:p>
         </w:tc>
@@ -7423,7 +7448,7 @@
                 <w:sz w:val="17"/>
                 <w:szCs w:val="17"/>
               </w:rPr>
-              <w:t xml:space="preserve">1.8</w:t>
+              <w:t xml:space="preserve">1.7</w:t>
             </w:r>
           </w:p>
         </w:tc>
@@ -7487,7 +7512,7 @@
                 <w:sz w:val="17"/>
                 <w:szCs w:val="17"/>
               </w:rPr>
-              <w:t xml:space="preserve">2.3–5.1</w:t>
+              <w:t xml:space="preserve">2.3–5.8</w:t>
             </w:r>
           </w:p>
         </w:tc>
@@ -7723,7 +7748,7 @@
                 <w:sz w:val="17"/>
                 <w:szCs w:val="17"/>
               </w:rPr>
-              <w:t xml:space="preserve">5</w:t>
+              <w:t xml:space="preserve">6</w:t>
             </w:r>
           </w:p>
         </w:tc>
@@ -7787,7 +7812,7 @@
                 <w:sz w:val="17"/>
                 <w:szCs w:val="17"/>
               </w:rPr>
-              <w:t xml:space="preserve">17.9</w:t>
+              <w:t xml:space="preserve">21.5</w:t>
             </w:r>
           </w:p>
         </w:tc>
@@ -7819,7 +7844,7 @@
                 <w:sz w:val="17"/>
                 <w:szCs w:val="17"/>
               </w:rPr>
-              <w:t xml:space="preserve">17.7–27.2</w:t>
+              <w:t xml:space="preserve">17.7–26.6</w:t>
             </w:r>
           </w:p>
         </w:tc>
@@ -8221,7 +8246,7 @@
                 <w:sz w:val="17"/>
                 <w:szCs w:val="17"/>
               </w:rPr>
-              <w:t xml:space="preserve">21</w:t>
+              <w:t xml:space="preserve">22</w:t>
             </w:r>
           </w:p>
         </w:tc>
@@ -8253,7 +8278,7 @@
                 <w:sz w:val="17"/>
                 <w:szCs w:val="17"/>
               </w:rPr>
-              <w:t xml:space="preserve">1.8</w:t>
+              <w:t xml:space="preserve">1.7</w:t>
             </w:r>
           </w:p>
         </w:tc>
@@ -8285,7 +8310,7 @@
                 <w:sz w:val="17"/>
                 <w:szCs w:val="17"/>
               </w:rPr>
-              <w:t xml:space="preserve">4.3</w:t>
+              <w:t xml:space="preserve">4.2</w:t>
             </w:r>
           </w:p>
         </w:tc>
@@ -8317,7 +8342,7 @@
                 <w:sz w:val="17"/>
                 <w:szCs w:val="17"/>
               </w:rPr>
-              <w:t xml:space="preserve">2.4–12.2</w:t>
+              <w:t xml:space="preserve">2.6–12.1</w:t>
             </w:r>
           </w:p>
         </w:tc>
@@ -8387,7 +8412,7 @@
                 <w:sz w:val="17"/>
                 <w:szCs w:val="17"/>
               </w:rPr>
-              <w:t xml:space="preserve">9</w:t>
+              <w:t xml:space="preserve">10</w:t>
             </w:r>
           </w:p>
         </w:tc>
@@ -8419,7 +8444,7 @@
                 <w:sz w:val="17"/>
                 <w:szCs w:val="17"/>
               </w:rPr>
-              <w:t xml:space="preserve">1.9</w:t>
+              <w:t xml:space="preserve">1.8</w:t>
             </w:r>
           </w:p>
         </w:tc>
@@ -8451,7 +8476,7 @@
                 <w:sz w:val="17"/>
                 <w:szCs w:val="17"/>
               </w:rPr>
-              <w:t xml:space="preserve">10.6</w:t>
+              <w:t xml:space="preserve">9.3</w:t>
             </w:r>
           </w:p>
         </w:tc>
@@ -8483,7 +8508,7 @@
                 <w:sz w:val="17"/>
                 <w:szCs w:val="17"/>
               </w:rPr>
-              <w:t xml:space="preserve">5.3–11.6</w:t>
+              <w:t xml:space="preserve">5.8–11.4</w:t>
             </w:r>
           </w:p>
         </w:tc>
@@ -8553,7 +8578,7 @@
                 <w:sz w:val="17"/>
                 <w:szCs w:val="17"/>
               </w:rPr>
-              <w:t xml:space="preserve">6</w:t>
+              <w:t xml:space="preserve">7</w:t>
             </w:r>
           </w:p>
         </w:tc>
@@ -8585,7 +8610,7 @@
                 <w:sz w:val="17"/>
                 <w:szCs w:val="17"/>
               </w:rPr>
-              <w:t xml:space="preserve">2</w:t>
+              <w:t xml:space="preserve">1.9</w:t>
             </w:r>
           </w:p>
         </w:tc>
@@ -8617,7 +8642,7 @@
                 <w:sz w:val="17"/>
                 <w:szCs w:val="17"/>
               </w:rPr>
-              <w:t xml:space="preserve">34.3</w:t>
+              <w:t xml:space="preserve">26.5</w:t>
             </w:r>
           </w:p>
         </w:tc>
@@ -8649,7 +8674,7 @@
                 <w:sz w:val="17"/>
                 <w:szCs w:val="17"/>
               </w:rPr>
-              <w:t xml:space="preserve">12.9–48.2</w:t>
+              <w:t xml:space="preserve">16.7–46.2</w:t>
             </w:r>
           </w:p>
         </w:tc>
@@ -8994,7 +9019,7 @@
                 <w:sz w:val="17"/>
                 <w:szCs w:val="17"/>
               </w:rPr>
-              <w:t xml:space="preserve">94</w:t>
+              <w:t xml:space="preserve">93</w:t>
             </w:r>
           </w:p>
         </w:tc>
@@ -9026,7 +9051,7 @@
                 <w:sz w:val="17"/>
                 <w:szCs w:val="17"/>
               </w:rPr>
-              <w:t xml:space="preserve">5,469</w:t>
+              <w:t xml:space="preserve">5,445</w:t>
             </w:r>
           </w:p>
         </w:tc>
@@ -11057,7 +11082,7 @@
                 <w:sz w:val="17"/>
                 <w:szCs w:val="17"/>
               </w:rPr>
-              <w:t xml:space="preserve">659</w:t>
+              <w:t xml:space="preserve">683</w:t>
             </w:r>
           </w:p>
         </w:tc>
@@ -11089,7 +11114,7 @@
                 <w:sz w:val="17"/>
                 <w:szCs w:val="17"/>
               </w:rPr>
-              <w:t xml:space="preserve">71%</w:t>
+              <w:t xml:space="preserve">74%</w:t>
             </w:r>
           </w:p>
         </w:tc>
@@ -11158,7 +11183,7 @@
           <w:sz w:val="21"/>
           <w:szCs w:val="21"/>
         </w:rPr>
-        <w:t xml:space="preserve">Standard planning applications and Part 8 schemes start at similar rates by units (75% and 71%). Two of the six SHD permissions have started, accounting for 44% of their 1,287 units. Among the four not started, the largest are Raheen (384 units, CIS: commencement expected), Clonmacken Gardens (165 units) and Annacotty (137 units, now past expiry).</w:t>
+        <w:t xml:space="preserve">Standard planning applications and Part 8 schemes start at similar rates by units (75% and 74%). Two of the six SHD permissions have started, accounting for 44% of their 1,287 units. Among the four not started, the largest are Raheen (384 units, CIS: commencement expected), Clonmacken Gardens (165 units) and Annacotty (137 units, now past expiry).</w:t>
       </w:r>
     </w:p>
     <w:tbl>
@@ -12318,7 +12343,7 @@
                 <w:sz w:val="17"/>
                 <w:szCs w:val="17"/>
               </w:rPr>
-              <w:t xml:space="preserve">269</w:t>
+              <w:t xml:space="preserve">293</w:t>
             </w:r>
           </w:p>
         </w:tc>
@@ -12350,7 +12375,7 @@
                 <w:sz w:val="17"/>
                 <w:szCs w:val="17"/>
               </w:rPr>
-              <w:t xml:space="preserve">59%</w:t>
+              <w:t xml:space="preserve">64%</w:t>
             </w:r>
           </w:p>
         </w:tc>
@@ -12522,7 +12547,7 @@
           <w:sz w:val="21"/>
           <w:szCs w:val="21"/>
         </w:rPr>
-        <w:t xml:space="preserve">Of the 5,780 permitted units not started, 4,092 have more than three years left on their permission. The near-term pipeline at risk is smaller: 311 units are already past expiry, 360 expire within 12 months and 176 within 12 to 24 months.</w:t>
+        <w:t xml:space="preserve">Of the 5,756 permitted units not started, 4,092 have more than three years left on their permission. The near-term pipeline at risk is smaller: 311 units are already past expiry, 360 expire within 12 months and 176 within 12 to 24 months.</w:t>
       </w:r>
     </w:p>
     <w:tbl>
@@ -14404,7 +14429,7 @@
                 <w:sz w:val="15"/>
                 <w:szCs w:val="15"/>
               </w:rPr>
-              <w:t xml:space="preserve">24</w:t>
+              <w:t xml:space="preserve">23</w:t>
             </w:r>
           </w:p>
         </w:tc>
@@ -14564,7 +14589,7 @@
                 <w:sz w:val="15"/>
                 <w:szCs w:val="15"/>
               </w:rPr>
-              <w:t xml:space="preserve">125</w:t>
+              <w:t xml:space="preserve">101</w:t>
             </w:r>
           </w:p>
         </w:tc>
@@ -14628,7 +14653,7 @@
                 <w:sz w:val="15"/>
                 <w:szCs w:val="15"/>
               </w:rPr>
-              <w:t xml:space="preserve">336</w:t>
+              <w:t xml:space="preserve">312</w:t>
             </w:r>
           </w:p>
         </w:tc>
@@ -18807,7 +18832,7 @@
           <w:sz w:val="21"/>
           <w:szCs w:val="21"/>
         </w:rPr>
-        <w:t xml:space="preserve">Among older permissions, Limerick City East has the highest start rate (91% of units), followed by City West (67%) and City North (62%). The county LEAs have smaller volumes and lower start rates: 31 of 165 units in Adare-Rathkeale and 206 of 436 in Newcastle West. Of the unstarted units in City East, 93% are on permissions granted since January 2025.</w:t>
+        <w:t xml:space="preserve">Among older permissions, Limerick City East has the highest start rate (91% of units), followed by City West (68%) and City North (62%). The county LEAs have smaller volumes and lower start rates: 31 of 165 units in Adare-Rathkeale and 206 of 436 in Newcastle West. Of the unstarted units in City East, 93% are on permissions granted since January 2025.</w:t>
       </w:r>
     </w:p>
     <w:tbl>
@@ -19571,7 +19596,7 @@
                 <w:sz w:val="17"/>
                 <w:szCs w:val="17"/>
               </w:rPr>
-              <w:t xml:space="preserve">1,640</w:t>
+              <w:t xml:space="preserve">1,664</w:t>
             </w:r>
           </w:p>
         </w:tc>
@@ -19603,7 +19628,7 @@
                 <w:sz w:val="17"/>
                 <w:szCs w:val="17"/>
               </w:rPr>
-              <w:t xml:space="preserve">67%</w:t>
+              <w:t xml:space="preserve">68%</w:t>
             </w:r>
           </w:p>
         </w:tc>
@@ -21607,7 +21632,7 @@
                 <w:sz w:val="15"/>
                 <w:szCs w:val="15"/>
               </w:rPr>
-              <w:t xml:space="preserve">15</w:t>
+              <w:t xml:space="preserve">22</w:t>
             </w:r>
           </w:p>
         </w:tc>
@@ -21639,7 +21664,7 @@
                 <w:sz w:val="15"/>
                 <w:szCs w:val="15"/>
               </w:rPr>
-              <w:t xml:space="preserve">122</w:t>
+              <w:t xml:space="preserve">115</w:t>
             </w:r>
           </w:p>
         </w:tc>
@@ -21767,7 +21792,7 @@
                 <w:sz w:val="15"/>
                 <w:szCs w:val="15"/>
               </w:rPr>
-              <w:t xml:space="preserve">18%</w:t>
+              <w:t xml:space="preserve">24%</w:t>
             </w:r>
           </w:p>
         </w:tc>
@@ -22131,7 +22156,7 @@
                 <w:sz w:val="15"/>
                 <w:szCs w:val="15"/>
               </w:rPr>
-              <w:t xml:space="preserve">247</w:t>
+              <w:t xml:space="preserve">284</w:t>
             </w:r>
           </w:p>
         </w:tc>
@@ -22163,7 +22188,7 @@
                 <w:sz w:val="15"/>
                 <w:szCs w:val="15"/>
               </w:rPr>
-              <w:t xml:space="preserve">58</w:t>
+              <w:t xml:space="preserve">21</w:t>
             </w:r>
           </w:p>
         </w:tc>
@@ -22291,7 +22316,7 @@
                 <w:sz w:val="15"/>
                 <w:szCs w:val="15"/>
               </w:rPr>
-              <w:t xml:space="preserve">9%</w:t>
+              <w:t xml:space="preserve">14%</w:t>
             </w:r>
           </w:p>
         </w:tc>
@@ -22815,7 +22840,7 @@
                 <w:sz w:val="15"/>
                 <w:szCs w:val="15"/>
               </w:rPr>
-              <w:t xml:space="preserve">4%</w:t>
+              <w:t xml:space="preserve">9%</w:t>
             </w:r>
           </w:p>
         </w:tc>
@@ -23179,7 +23204,7 @@
                 <w:sz w:val="15"/>
                 <w:szCs w:val="15"/>
               </w:rPr>
-              <w:t xml:space="preserve">143</w:t>
+              <w:t xml:space="preserve">148</w:t>
             </w:r>
           </w:p>
         </w:tc>
@@ -23211,7 +23236,7 @@
                 <w:sz w:val="15"/>
                 <w:szCs w:val="15"/>
               </w:rPr>
-              <w:t xml:space="preserve">882</w:t>
+              <w:t xml:space="preserve">901</w:t>
             </w:r>
           </w:p>
         </w:tc>
@@ -23243,7 +23268,7 @@
                 <w:sz w:val="15"/>
                 <w:szCs w:val="15"/>
               </w:rPr>
-              <w:t xml:space="preserve">947</w:t>
+              <w:t xml:space="preserve">923</w:t>
             </w:r>
           </w:p>
         </w:tc>
@@ -23339,7 +23364,7 @@
                 <w:sz w:val="15"/>
                 <w:szCs w:val="15"/>
               </w:rPr>
-              <w:t xml:space="preserve">20%</w:t>
+              <w:t xml:space="preserve">22%</w:t>
             </w:r>
           </w:p>
         </w:tc>
@@ -25539,7 +25564,7 @@
                 <w:sz w:val="17"/>
                 <w:szCs w:val="17"/>
               </w:rPr>
-              <w:t xml:space="preserve">832</w:t>
+              <w:t xml:space="preserve">856</w:t>
             </w:r>
           </w:p>
         </w:tc>
@@ -25571,7 +25596,7 @@
                 <w:sz w:val="17"/>
                 <w:szCs w:val="17"/>
               </w:rPr>
-              <w:t xml:space="preserve">55%</w:t>
+              <w:t xml:space="preserve">57%</w:t>
             </w:r>
           </w:p>
         </w:tc>
@@ -26369,7 +26394,7 @@
                 <w:sz w:val="17"/>
                 <w:szCs w:val="17"/>
               </w:rPr>
-              <w:t xml:space="preserve">Completed schemes (CIS)</w:t>
+              <w:t xml:space="preserve">Completed schemes (CIS and Department social housing report)</w:t>
             </w:r>
           </w:p>
         </w:tc>
@@ -26401,7 +26426,7 @@
                 <w:sz w:val="17"/>
                 <w:szCs w:val="17"/>
               </w:rPr>
-              <w:t xml:space="preserve">44</w:t>
+              <w:t xml:space="preserve">47</w:t>
             </w:r>
           </w:p>
         </w:tc>
@@ -26471,7 +26496,7 @@
                 <w:sz w:val="17"/>
                 <w:szCs w:val="17"/>
               </w:rPr>
-              <w:t xml:space="preserve">41</w:t>
+              <w:t xml:space="preserve">44</w:t>
             </w:r>
           </w:p>
         </w:tc>
@@ -26509,7 +26534,7 @@
                 <w:sz w:val="17"/>
                 <w:szCs w:val="17"/>
               </w:rPr>
-              <w:t xml:space="preserve">Units on completed schemes (CIS)</w:t>
+              <w:t xml:space="preserve">Units on completed schemes</w:t>
             </w:r>
           </w:p>
         </w:tc>
@@ -26541,7 +26566,7 @@
                 <w:sz w:val="17"/>
                 <w:szCs w:val="17"/>
               </w:rPr>
-              <w:t xml:space="preserve">1,226</w:t>
+              <w:t xml:space="preserve">1,275</w:t>
             </w:r>
           </w:p>
         </w:tc>
@@ -26611,7 +26636,7 @@
                 <w:sz w:val="17"/>
                 <w:szCs w:val="17"/>
               </w:rPr>
-              <w:t xml:space="preserve">328</w:t>
+              <w:t xml:space="preserve">340</w:t>
             </w:r>
           </w:p>
         </w:tc>
@@ -26891,7 +26916,7 @@
                 <w:sz w:val="17"/>
                 <w:szCs w:val="17"/>
               </w:rPr>
-              <w:t xml:space="preserve">76</w:t>
+              <w:t xml:space="preserve">84</w:t>
             </w:r>
           </w:p>
         </w:tc>
@@ -26961,7 +26986,7 @@
                 <w:sz w:val="17"/>
                 <w:szCs w:val="17"/>
               </w:rPr>
-              <w:t xml:space="preserve">1,764</w:t>
+              <w:t xml:space="preserve">1,880</w:t>
             </w:r>
           </w:p>
         </w:tc>
@@ -26982,7 +27007,7 @@
           <w:sz w:val="21"/>
           <w:szCs w:val="21"/>
         </w:rPr>
-        <w:t xml:space="preserve">Completion certificates are the only official site-level record of completions. For the 44 schemes CIS records as complete, certificates exist for 41 but record 328 units against 1,226. This could reflect how units are entered on certificates, phased certificates not yet lodged, or schemes certified under a different reference.</w:t>
+        <w:t xml:space="preserve">Completion certificates are the only official site-level record of completions. For the 47 completed schemes, certificates exist for 44 but record 340 units against 1,275. This could reflect how units are entered on certificates, phased certificates not yet lodged, or schemes certified under a different reference.</w:t>
       </w:r>
     </w:p>
     <w:p>
@@ -27560,7 +27585,7 @@
                 <w:sz w:val="17"/>
                 <w:szCs w:val="17"/>
               </w:rPr>
-              <w:t xml:space="preserve">470</w:t>
+              <w:t xml:space="preserve">494</w:t>
             </w:r>
           </w:p>
         </w:tc>
@@ -27592,7 +27617,7 @@
                 <w:sz w:val="17"/>
                 <w:szCs w:val="17"/>
               </w:rPr>
-              <w:t xml:space="preserve">58%</w:t>
+              <w:t xml:space="preserve">61%</w:t>
             </w:r>
           </w:p>
         </w:tc>

</xml_diff>

<commit_message>
Reconcile with KPMG audit, remove Part 8 duplicates, add PBSA bedspaces
- Add 11 live Limerick schemes (377 units) from the KPMG audit that were
  missing from the CIS extracts, each confirmed in the planning register
- Mark 6 Part 8 schemes held twice in CIS (project number and council file)
  as duplicates
- Pending modifications no longer supersede granted schemes
- Reverse register check reads units from descriptions and drops amendments
- Bedspaces for permitted PBSA schemes from the PBSA schedule
- GeoPackage: student bedspaces on schemes, Clare metro schemes layer

Co-Authored-By: Claude Opus 5.5 <noreply@anthropic.com>
Claude-Session: https://claude.ai/code/session_01NzU6RZjdYh3MCXCEtKHHfb
</commit_message>
<xml_diff>
--- a/limerick_pipeline/delivery_study/Limerick_Residential_Delivery_Study.docx
+++ b/limerick_pipeline/delivery_study/Limerick_Residential_Delivery_Study.docx
@@ -112,7 +112,7 @@
           <w:sz w:val="21"/>
           <w:szCs w:val="21"/>
         </w:rPr>
-        <w:t xml:space="preserve">This study tracks 245 permitted residential schemes in County Limerick, totalling 10,522 units, from planning application to completion. It joins the national planning applications register, building control commencement notices and CIS project records at scheme level, and classifies each scheme as public (local authority, approved housing body or Land Development Agency) or private. The aim is to show how quickly permitted housing gets built, where it stalls, and which permissions are close to expiry.</w:t>
+        <w:t xml:space="preserve">This study tracks 251 permitted residential schemes in County Limerick, totalling 10,817 units, from planning application to completion. It joins the national planning applications register, building control commencement notices and CIS project records at scheme level, and classifies each scheme as public (local authority, approved housing body or Land Development Agency) or private. The aim is to show how quickly permitted housing gets built, where it stalls, and which permissions are close to expiry.</w:t>
       </w:r>
     </w:p>
     <w:p>
@@ -135,7 +135,7 @@
           <w:sz w:val="21"/>
           <w:szCs w:val="21"/>
         </w:rPr>
-        <w:t xml:space="preserve">The median time from application to permission is about 7 months. It is about 12 weeks where no further information is requested and there is no appeal, 0.6 years with a further information request, and 1.2 years on appeal. Further information was requested on 79% of private and LRD applications.</w:t>
+        <w:t xml:space="preserve">The median time from application to permission is about 7 months. It is about 12 weeks where no further information is requested and there is no appeal, 0.7 years with a further information request, and 1.3 years on appeal. Further information was requested on 79% of private and LRD applications.</w:t>
       </w:r>
     </w:p>
     <w:p>
@@ -158,7 +158,7 @@
           <w:sz w:val="21"/>
           <w:szCs w:val="21"/>
         </w:rPr>
-        <w:t xml:space="preserve">47% of permitted schemes had started within two years of permission and 71% within five years. For schemes that have started, the median gap between permission and start is 1.3 years.</w:t>
+        <w:t xml:space="preserve">47% of permitted schemes had started within two years of permission and 72% within five years. For schemes that have started, the median gap between permission and start is 1.3 years.</w:t>
       </w:r>
     </w:p>
     <w:p>
@@ -204,7 +204,7 @@
           <w:sz w:val="21"/>
           <w:szCs w:val="21"/>
         </w:rPr>
-        <w:t xml:space="preserve">Public schemes (84 schemes, 1,880 units, 17% of units) have a median approval period of 0.3 years against 0.7 for private schemes. After permission, 40% of public schemes had started within two years against 50% of private schemes. Over the longer run the gap narrows: on permissions at least two years old, 76% of public units and 68% of private units have started.</w:t>
+        <w:t xml:space="preserve">Public schemes (78 schemes, 1,768 units, 16% of units) have a median approval period of 0.3 years against 0.7 for private schemes. After permission, 43% of public schemes had started within two years against 49% of private schemes. Over the longer run the gap narrows: on permissions at least two years old, 81% of public units and 68% of private units have started.</w:t>
       </w:r>
     </w:p>
     <w:p>
@@ -219,7 +219,7 @@
           <w:sz w:val="21"/>
           <w:szCs w:val="21"/>
         </w:rPr>
-        <w:t xml:space="preserve">5,756 permitted units have not started. </w:t>
+        <w:t xml:space="preserve">5,862 permitted units have not started. </w:t>
       </w:r>
       <w:r>
         <w:rPr>
@@ -227,7 +227,7 @@
           <w:sz w:val="21"/>
           <w:szCs w:val="21"/>
         </w:rPr>
-        <w:t xml:space="preserve">Most sit on recent permissions: 4,092 units have more than three years left to run. The near-term risk is 847 units: 311 already past expiry and 536 expiring within two years.</w:t>
+        <w:t xml:space="preserve">Most sit on recent permissions: 4,200 units have more than three years left to run. The near-term risk is 906 units: 311 already past expiry and 595 expiring within two years.</w:t>
       </w:r>
     </w:p>
     <w:p>
@@ -242,7 +242,7 @@
           <w:sz w:val="21"/>
           <w:szCs w:val="21"/>
         </w:rPr>
-        <w:t xml:space="preserve">Limerick city holds 80% of permitted units. </w:t>
+        <w:t xml:space="preserve">Limerick city holds 81% of permitted units. </w:t>
       </w:r>
       <w:r>
         <w:rPr>
@@ -250,7 +250,7 @@
           <w:sz w:val="21"/>
           <w:szCs w:val="21"/>
         </w:rPr>
-        <w:t xml:space="preserve">Within the nine city neighbourhoods, Castletroy/Annacotty (2,837 units), Dooradoyle (1,857) and Caherdavin (1,316) carry the most permitted housing. The City Centre stands out: only 40% of units on older permissions have started, against 88% in Castletroy/Annacotty.</w:t>
+        <w:t xml:space="preserve">Within the nine city neighbourhoods, Castletroy/Annacotty (2,959 units), Dooradoyle (1,920) and Caherdavin (1,310) carry the most permitted housing. The City Centre stands out: only 45% of units on older permissions have started, against 89% in Castletroy/Annacotty.</w:t>
       </w:r>
     </w:p>
     <w:p>
@@ -691,7 +691,7 @@
                 <w:sz w:val="17"/>
                 <w:szCs w:val="17"/>
               </w:rPr>
-              <w:t xml:space="preserve">131 schemes with a measured start</w:t>
+              <w:t xml:space="preserve">135 schemes with a measured start</w:t>
             </w:r>
           </w:p>
         </w:tc>
@@ -1182,7 +1182,7 @@
           <w:sz w:val="21"/>
           <w:szCs w:val="21"/>
         </w:rPr>
-        <w:t xml:space="preserve">Limerick files Part 8 schemes in the planning register as “yy/8nnn”. CIS records many Part 8s under its own project numbers rather than the council file number, so these were matched to the register by location, date and unit count. The study includes 63 Part 8 schemes. 8 residential Part 8s in the register (80 units) were not held by CIS and have been added. Their start dates come from building control; their completion is not tracked, so those that have started are counted as under construction. Two further 2017 Part 8s have no recorded decision or commencement and are excluded: 178003 (27 units) and 178016 (20 units). Part 8 schemes before 2017 are not in the register.</w:t>
+        <w:t xml:space="preserve">Limerick files Part 8 schemes in the planning register as “yy/8nnn”. CIS records many Part 8s under its own project numbers rather than the council file number, so these were matched to the register by location, date and unit count. The study includes 57 Part 8 schemes. 8 residential Part 8s in the register (80 units) were not held by CIS and have been added. Their start dates come from building control; their completion is not tracked, so those that have started are counted as under construction. Two further 2017 Part 8s have no recorded decision or commencement and are excluded: 178003 (27 units) and 178016 (20 units). Part 8 schemes before 2017 are not in the register.</w:t>
       </w:r>
     </w:p>
     <w:p>
@@ -1219,7 +1219,32 @@
         <w:rPr>
           <w:rFonts w:ascii="Arial" w:cs="Arial" w:eastAsia="Arial" w:hAnsi="Arial"/>
         </w:rPr>
-        <w:t xml:space="preserve">2.5 Limitations</w:t>
+        <w:t xml:space="preserve">2.5 Reconciliation with the KPMG audit and student accommodation data</w:t>
+      </w:r>
+    </w:p>
+    <w:p>
+      <w:pPr>
+        <w:spacing w:after="120" w:line="290"/>
+      </w:pPr>
+      <w:r>
+        <w:rPr>
+          <w:rFonts w:ascii="Arial" w:cs="Arial" w:eastAsia="Arial" w:hAnsi="Arial"/>
+          <w:sz w:val="21"/>
+          <w:szCs w:val="21"/>
+        </w:rPr>
+        <w:t xml:space="preserve">The scheme list was checked against the KPMG audit of the Limerick city and suburbs pipeline. 11 live Limerick schemes (377 units) in that audit were missing from our CIS extracts and have been added, after confirming each one in the planning register. Schemes the audit lists that the register shows as refused, withdrawn or invalid were not added, and two audit schemes in County Clare fall outside this study. The check also found 6 Part 8 schemes (112 units) held twice in CIS, once under a CIS project number and once under the council file number; each is now counted once. Bedspace counts for permitted student accommodation schemes are taken from the purpose-built student accommodation (PBSA) schedule supplied for this study; existing student accommodation is not part of the pipeline.</w:t>
+      </w:r>
+    </w:p>
+    <w:p>
+      <w:pPr>
+        <w:pStyle w:val="Heading2"/>
+        <w:spacing w:after="100" w:before="200"/>
+      </w:pPr>
+      <w:r>
+        <w:rPr>
+          <w:rFonts w:ascii="Arial" w:cs="Arial" w:eastAsia="Arial" w:hAnsi="Arial"/>
+        </w:rPr>
+        <w:t xml:space="preserve">2.6 Limitations</w:t>
       </w:r>
     </w:p>
     <w:p>
@@ -1662,7 +1687,7 @@
                 <w:sz w:val="17"/>
                 <w:szCs w:val="17"/>
               </w:rPr>
-              <w:t xml:space="preserve">0.5 (n=67)</w:t>
+              <w:t xml:space="preserve">0.5 (n=65)</w:t>
             </w:r>
           </w:p>
         </w:tc>
@@ -1828,7 +1853,7 @@
                 <w:sz w:val="17"/>
                 <w:szCs w:val="17"/>
               </w:rPr>
-              <w:t xml:space="preserve">0.5 (n=61)</w:t>
+              <w:t xml:space="preserve">0.5 (n=64)</w:t>
             </w:r>
           </w:p>
         </w:tc>
@@ -1860,7 +1885,7 @@
                 <w:sz w:val="17"/>
                 <w:szCs w:val="17"/>
               </w:rPr>
-              <w:t xml:space="preserve">1.4 (n=32)</w:t>
+              <w:t xml:space="preserve">1.4 (n=34)</w:t>
             </w:r>
           </w:p>
         </w:tc>
@@ -1994,7 +2019,7 @@
                 <w:sz w:val="17"/>
                 <w:szCs w:val="17"/>
               </w:rPr>
-              <w:t xml:space="preserve">0.5 (n=44)</w:t>
+              <w:t xml:space="preserve">0.6 (n=48)</w:t>
             </w:r>
           </w:p>
         </w:tc>
@@ -2026,7 +2051,7 @@
                 <w:sz w:val="17"/>
                 <w:szCs w:val="17"/>
               </w:rPr>
-              <w:t xml:space="preserve">1.6 (n=22)</w:t>
+              <w:t xml:space="preserve">1.6 (n=23)</w:t>
             </w:r>
           </w:p>
         </w:tc>
@@ -2326,7 +2351,7 @@
                 <w:sz w:val="17"/>
                 <w:szCs w:val="17"/>
               </w:rPr>
-              <w:t xml:space="preserve">0.5 (n=22)</w:t>
+              <w:t xml:space="preserve">0.5 (n=23)</w:t>
             </w:r>
           </w:p>
         </w:tc>
@@ -2358,7 +2383,7 @@
                 <w:sz w:val="17"/>
                 <w:szCs w:val="17"/>
               </w:rPr>
-              <w:t xml:space="preserve">1.7 (n=8)</w:t>
+              <w:t xml:space="preserve">1.6 (n=9)</w:t>
             </w:r>
           </w:p>
         </w:tc>
@@ -2492,7 +2517,7 @@
                 <w:sz w:val="17"/>
                 <w:szCs w:val="17"/>
               </w:rPr>
-              <w:t xml:space="preserve">0.5 (n=234)</w:t>
+              <w:t xml:space="preserve">0.6 (n=240)</w:t>
             </w:r>
           </w:p>
         </w:tc>
@@ -2524,7 +2549,7 @@
                 <w:sz w:val="17"/>
                 <w:szCs w:val="17"/>
               </w:rPr>
-              <w:t xml:space="preserve">1.3 (n=131)</w:t>
+              <w:t xml:space="preserve">1.3 (n=135)</w:t>
             </w:r>
           </w:p>
         </w:tc>
@@ -2632,7 +2657,7 @@
           <w:sz w:val="21"/>
           <w:szCs w:val="21"/>
         </w:rPr>
-        <w:t xml:space="preserve">Further information requests and appeals account for most of the variation in approval times. Where the Council asked for further information, the median rose from 0.2 to 0.6 years. Appealed decisions took a median of 1.2 years. Further information was requested on 79% of the applications in this group.</w:t>
+        <w:t xml:space="preserve">Further information requests and appeals account for most of the variation in approval times. Where the Council asked for further information, the median rose from 0.2 to 0.7 years. Appealed decisions took a median of 1.3 years. Further information was requested on 79% of the applications in this group.</w:t>
       </w:r>
     </w:p>
     <w:tbl>
@@ -3066,7 +3091,7 @@
                 <w:sz w:val="17"/>
                 <w:szCs w:val="17"/>
               </w:rPr>
-              <w:t xml:space="preserve">118</w:t>
+              <w:t xml:space="preserve">125</w:t>
             </w:r>
           </w:p>
         </w:tc>
@@ -3098,7 +3123,7 @@
                 <w:sz w:val="17"/>
                 <w:szCs w:val="17"/>
               </w:rPr>
-              <w:t xml:space="preserve">0.6</w:t>
+              <w:t xml:space="preserve">0.7</w:t>
             </w:r>
           </w:p>
         </w:tc>
@@ -3232,7 +3257,7 @@
                 <w:sz w:val="17"/>
                 <w:szCs w:val="17"/>
               </w:rPr>
-              <w:t xml:space="preserve">44</w:t>
+              <w:t xml:space="preserve">47</w:t>
             </w:r>
           </w:p>
         </w:tc>
@@ -3264,7 +3289,7 @@
                 <w:sz w:val="17"/>
                 <w:szCs w:val="17"/>
               </w:rPr>
-              <w:t xml:space="preserve">1.2</w:t>
+              <w:t xml:space="preserve">1.3</w:t>
             </w:r>
           </w:p>
         </w:tc>
@@ -3328,7 +3353,7 @@
                 <w:sz w:val="17"/>
                 <w:szCs w:val="17"/>
               </w:rPr>
-              <w:t xml:space="preserve">1.6</w:t>
+              <w:t xml:space="preserve">1.7</w:t>
             </w:r>
           </w:p>
         </w:tc>
@@ -3450,7 +3475,7 @@
           <w:sz w:val="21"/>
           <w:szCs w:val="21"/>
         </w:rPr>
-        <w:t xml:space="preserve">About a quarter of schemes start within a year of permission and 47% within two years. By five years, 71% have started. Schemes of 25–99 units have the highest start rate by five years (84%); schemes of 1–24 units reach 67%. The 100+ band has too few older permissions to measure beyond four years.</w:t>
+        <w:t xml:space="preserve">About a quarter of schemes start within a year of permission and 47% within two years. By five years, 72% have started. Schemes of 25–99 units have the highest start rate by five years (84%); schemes of 1–24 units reach 68%. The 100+ band has too few older permissions to measure beyond four years.</w:t>
       </w:r>
     </w:p>
     <w:tbl>
@@ -3754,7 +3779,7 @@
                 <w:sz w:val="17"/>
                 <w:szCs w:val="17"/>
               </w:rPr>
-              <w:t xml:space="preserve">26% (117)</w:t>
+              <w:t xml:space="preserve">27% (118)</w:t>
             </w:r>
           </w:p>
         </w:tc>
@@ -3786,7 +3811,7 @@
                 <w:sz w:val="17"/>
                 <w:szCs w:val="17"/>
               </w:rPr>
-              <w:t xml:space="preserve">46% (106)</w:t>
+              <w:t xml:space="preserve">47% (106)</w:t>
             </w:r>
           </w:p>
         </w:tc>
@@ -3818,7 +3843,7 @@
                 <w:sz w:val="17"/>
                 <w:szCs w:val="17"/>
               </w:rPr>
-              <w:t xml:space="preserve">51% (83)</w:t>
+              <w:t xml:space="preserve">54% (82)</w:t>
             </w:r>
           </w:p>
         </w:tc>
@@ -3850,7 +3875,7 @@
                 <w:sz w:val="17"/>
                 <w:szCs w:val="17"/>
               </w:rPr>
-              <w:t xml:space="preserve">62% (72)</w:t>
+              <w:t xml:space="preserve">64% (70)</w:t>
             </w:r>
           </w:p>
         </w:tc>
@@ -3882,7 +3907,7 @@
                 <w:sz w:val="17"/>
                 <w:szCs w:val="17"/>
               </w:rPr>
-              <w:t xml:space="preserve">67% (51)</w:t>
+              <w:t xml:space="preserve">68% (50)</w:t>
             </w:r>
           </w:p>
         </w:tc>
@@ -3952,7 +3977,7 @@
                 <w:sz w:val="17"/>
                 <w:szCs w:val="17"/>
               </w:rPr>
-              <w:t xml:space="preserve">23% (71)</w:t>
+              <w:t xml:space="preserve">22% (73)</w:t>
             </w:r>
           </w:p>
         </w:tc>
@@ -3984,7 +4009,7 @@
                 <w:sz w:val="17"/>
                 <w:szCs w:val="17"/>
               </w:rPr>
-              <w:t xml:space="preserve">47% (60)</w:t>
+              <w:t xml:space="preserve">46% (61)</w:t>
             </w:r>
           </w:p>
         </w:tc>
@@ -4016,7 +4041,7 @@
                 <w:sz w:val="17"/>
                 <w:szCs w:val="17"/>
               </w:rPr>
-              <w:t xml:space="preserve">65% (48)</w:t>
+              <w:t xml:space="preserve">63% (49)</w:t>
             </w:r>
           </w:p>
         </w:tc>
@@ -4150,7 +4175,7 @@
                 <w:sz w:val="17"/>
                 <w:szCs w:val="17"/>
               </w:rPr>
-              <w:t xml:space="preserve">8% (13)</w:t>
+              <w:t xml:space="preserve">14% (14)</w:t>
             </w:r>
           </w:p>
         </w:tc>
@@ -4182,7 +4207,7 @@
                 <w:sz w:val="17"/>
                 <w:szCs w:val="17"/>
               </w:rPr>
-              <w:t xml:space="preserve">55% (11)</w:t>
+              <w:t xml:space="preserve">58% (12)</w:t>
             </w:r>
           </w:p>
         </w:tc>
@@ -4348,7 +4373,7 @@
                 <w:sz w:val="17"/>
                 <w:szCs w:val="17"/>
               </w:rPr>
-              <w:t xml:space="preserve">24% (204)</w:t>
+              <w:t xml:space="preserve">25% (208)</w:t>
             </w:r>
           </w:p>
         </w:tc>
@@ -4380,7 +4405,7 @@
                 <w:sz w:val="17"/>
                 <w:szCs w:val="17"/>
               </w:rPr>
-              <w:t xml:space="preserve">47% (180)</w:t>
+              <w:t xml:space="preserve">47% (182)</w:t>
             </w:r>
           </w:p>
         </w:tc>
@@ -4412,7 +4437,7 @@
                 <w:sz w:val="17"/>
                 <w:szCs w:val="17"/>
               </w:rPr>
-              <w:t xml:space="preserve">55% (143)</w:t>
+              <w:t xml:space="preserve">57% (143)</w:t>
             </w:r>
           </w:p>
         </w:tc>
@@ -4444,7 +4469,7 @@
                 <w:sz w:val="17"/>
                 <w:szCs w:val="17"/>
               </w:rPr>
-              <w:t xml:space="preserve">64% (121)</w:t>
+              <w:t xml:space="preserve">65% (119)</w:t>
             </w:r>
           </w:p>
         </w:tc>
@@ -4476,7 +4501,7 @@
                 <w:sz w:val="17"/>
                 <w:szCs w:val="17"/>
               </w:rPr>
-              <w:t xml:space="preserve">71% (89)</w:t>
+              <w:t xml:space="preserve">72% (88)</w:t>
             </w:r>
           </w:p>
         </w:tc>
@@ -4520,7 +4545,7 @@
           <w:sz w:val="21"/>
           <w:szCs w:val="21"/>
         </w:rPr>
-        <w:t xml:space="preserve">Public schemes account for 84 of the 262 schemes and 1,880 units (17%). Most are local authority schemes (67 schemes, 1,256 units), followed by approved housing bodies (16 schemes, 339 units). The Land Development Agency has one scheme in the sample: the former Limerick Gasworks site on Dock Road (25/60780, 285 units), granted in February 2026 and at tender stage.</w:t>
+        <w:t xml:space="preserve">Public schemes account for 78 of the 266 schemes and 1,768 units (16%). Most are local authority schemes (61 schemes, 1,144 units), followed by approved housing bodies (16 schemes, 339 units). The Land Development Agency has one scheme in the sample: the former Limerick Gasworks site on Dock Road (25/60780, 285 units), granted in February 2026 and at tender stage.</w:t>
       </w:r>
     </w:p>
     <w:tbl>
@@ -4860,7 +4885,7 @@
                 <w:sz w:val="17"/>
                 <w:szCs w:val="17"/>
               </w:rPr>
-              <w:t xml:space="preserve">84</w:t>
+              <w:t xml:space="preserve">78</w:t>
             </w:r>
           </w:p>
         </w:tc>
@@ -4892,7 +4917,7 @@
                 <w:sz w:val="17"/>
                 <w:szCs w:val="17"/>
               </w:rPr>
-              <w:t xml:space="preserve">1,880</w:t>
+              <w:t xml:space="preserve">1,768</w:t>
             </w:r>
           </w:p>
         </w:tc>
@@ -5090,7 +5115,7 @@
                 <w:sz w:val="17"/>
                 <w:szCs w:val="17"/>
               </w:rPr>
-              <w:t xml:space="preserve">178</w:t>
+              <w:t xml:space="preserve">188</w:t>
             </w:r>
           </w:p>
         </w:tc>
@@ -5122,7 +5147,7 @@
                 <w:sz w:val="17"/>
                 <w:szCs w:val="17"/>
               </w:rPr>
-              <w:t xml:space="preserve">8,999</w:t>
+              <w:t xml:space="preserve">9,312</w:t>
             </w:r>
           </w:p>
         </w:tc>
@@ -5186,7 +5211,7 @@
                 <w:sz w:val="17"/>
                 <w:szCs w:val="17"/>
               </w:rPr>
-              <w:t xml:space="preserve">1 (n=95)</w:t>
+              <w:t xml:space="preserve">1 (n=99)</w:t>
             </w:r>
           </w:p>
         </w:tc>
@@ -5287,7 +5312,7 @@
           <w:sz w:val="21"/>
           <w:szCs w:val="21"/>
         </w:rPr>
-        <w:t xml:space="preserve">Public schemes get through planning faster, mainly because Part 8 approvals are not subject to further information requests or appeal. They are slower to start: 40% had started within two years of approval, against 50% of private schemes. In our experience, public schemes usually go to tender and seek funding approval after planning, which adds time before a contractor is on site.</w:t>
+        <w:t xml:space="preserve">Public schemes get through planning faster, mainly because Part 8 approvals are not subject to further information requests or appeal. They are slower to start: 43% had started within two years of approval, against 49% of private schemes. In our experience, public schemes usually go to tender and seek funding approval after planning, which adds time before a contractor is on site.</w:t>
       </w:r>
     </w:p>
     <w:p>
@@ -5669,7 +5694,7 @@
                 <w:sz w:val="17"/>
                 <w:szCs w:val="17"/>
               </w:rPr>
-              <w:t xml:space="preserve">7% (59)</w:t>
+              <w:t xml:space="preserve">7% (54)</w:t>
             </w:r>
           </w:p>
         </w:tc>
@@ -5701,7 +5726,7 @@
                 <w:sz w:val="17"/>
                 <w:szCs w:val="17"/>
               </w:rPr>
-              <w:t xml:space="preserve">40% (55)</w:t>
+              <w:t xml:space="preserve">43% (51)</w:t>
             </w:r>
           </w:p>
         </w:tc>
@@ -5733,7 +5758,7 @@
                 <w:sz w:val="17"/>
                 <w:szCs w:val="17"/>
               </w:rPr>
-              <w:t xml:space="preserve">52% (48)</w:t>
+              <w:t xml:space="preserve">57% (44)</w:t>
             </w:r>
           </w:p>
         </w:tc>
@@ -5765,7 +5790,7 @@
                 <w:sz w:val="17"/>
                 <w:szCs w:val="17"/>
               </w:rPr>
-              <w:t xml:space="preserve">63% (38)</w:t>
+              <w:t xml:space="preserve">67% (36)</w:t>
             </w:r>
           </w:p>
         </w:tc>
@@ -5797,7 +5822,7 @@
                 <w:sz w:val="17"/>
                 <w:szCs w:val="17"/>
               </w:rPr>
-              <w:t xml:space="preserve">58% (26)</w:t>
+              <w:t xml:space="preserve">60% (25)</w:t>
             </w:r>
           </w:p>
         </w:tc>
@@ -5867,7 +5892,7 @@
                 <w:sz w:val="17"/>
                 <w:szCs w:val="17"/>
               </w:rPr>
-              <w:t xml:space="preserve">31% (145)</w:t>
+              <w:t xml:space="preserve">31% (154)</w:t>
             </w:r>
           </w:p>
         </w:tc>
@@ -5899,7 +5924,7 @@
                 <w:sz w:val="17"/>
                 <w:szCs w:val="17"/>
               </w:rPr>
-              <w:t xml:space="preserve">50% (125)</w:t>
+              <w:t xml:space="preserve">49% (131)</w:t>
             </w:r>
           </w:p>
         </w:tc>
@@ -5931,7 +5956,7 @@
                 <w:sz w:val="17"/>
                 <w:szCs w:val="17"/>
               </w:rPr>
-              <w:t xml:space="preserve">57% (95)</w:t>
+              <w:t xml:space="preserve">57% (99)</w:t>
             </w:r>
           </w:p>
         </w:tc>
@@ -6032,7 +6057,7 @@
           <w:sz w:val="21"/>
           <w:szCs w:val="21"/>
         </w:rPr>
-        <w:t xml:space="preserve">Measured by units rather than schemes, public delivery holds up: on permissions at least two years old, 76% of public units have started against 68% of private units. The difference reflects a larger number of small public schemes that have not started alongside larger public schemes that have.</w:t>
+        <w:t xml:space="preserve">Measured by units rather than schemes, public delivery holds up: on permissions at least two years old, 81% of public units have started against 68% of private units. The difference reflects a larger number of small public schemes that have not started alongside larger public schemes that have.</w:t>
       </w:r>
     </w:p>
     <w:tbl>
@@ -6336,7 +6361,7 @@
                 <w:sz w:val="17"/>
                 <w:szCs w:val="17"/>
               </w:rPr>
-              <w:t xml:space="preserve">41</w:t>
+              <w:t xml:space="preserve">37</w:t>
             </w:r>
           </w:p>
         </w:tc>
@@ -6368,7 +6393,7 @@
                 <w:sz w:val="17"/>
                 <w:szCs w:val="17"/>
               </w:rPr>
-              <w:t xml:space="preserve">932</w:t>
+              <w:t xml:space="preserve">856</w:t>
             </w:r>
           </w:p>
         </w:tc>
@@ -6432,7 +6457,7 @@
                 <w:sz w:val="17"/>
                 <w:szCs w:val="17"/>
               </w:rPr>
-              <w:t xml:space="preserve">74%</w:t>
+              <w:t xml:space="preserve">80%</w:t>
             </w:r>
           </w:p>
         </w:tc>
@@ -6732,7 +6757,7 @@
                 <w:sz w:val="17"/>
                 <w:szCs w:val="17"/>
               </w:rPr>
-              <w:t xml:space="preserve">125</w:t>
+              <w:t xml:space="preserve">131</w:t>
             </w:r>
           </w:p>
         </w:tc>
@@ -6764,7 +6789,7 @@
                 <w:sz w:val="17"/>
                 <w:szCs w:val="17"/>
               </w:rPr>
-              <w:t xml:space="preserve">5,206</w:t>
+              <w:t xml:space="preserve">5,444</w:t>
             </w:r>
           </w:p>
         </w:tc>
@@ -6796,7 +6821,7 @@
                 <w:sz w:val="17"/>
                 <w:szCs w:val="17"/>
               </w:rPr>
-              <w:t xml:space="preserve">3,531</w:t>
+              <w:t xml:space="preserve">3,689</w:t>
             </w:r>
           </w:p>
         </w:tc>
@@ -6860,7 +6885,7 @@
                 <w:sz w:val="17"/>
                 <w:szCs w:val="17"/>
               </w:rPr>
-              <w:t xml:space="preserve">1.2</w:t>
+              <w:t xml:space="preserve">1.1</w:t>
             </w:r>
           </w:p>
         </w:tc>
@@ -8798,7 +8823,7 @@
           <w:sz w:val="21"/>
           <w:szCs w:val="21"/>
         </w:rPr>
-        <w:t xml:space="preserve">Permissions have run ahead of starts in most years. In the first nine months of 2026, 2,795 units were granted, including several large LRD schemes in Castletroy, Mungret, Singland and Dock Road. Starts peaked in 2024 at 1,089 units. Completions are low relative to starts because most recently started schemes are still under construction.</w:t>
+        <w:t xml:space="preserve">Permissions have run ahead of starts in most years. In the first nine months of 2026, 2,795 units were granted, including several large LRD schemes in Castletroy, Mungret, Singland and Dock Road. Starts peaked in 2024 at 1,223 units. Completions are low relative to starts because most recently started schemes are still under construction.</w:t>
       </w:r>
     </w:p>
     <w:p>
@@ -8823,7 +8848,7 @@
           <w:sz w:val="21"/>
           <w:szCs w:val="21"/>
         </w:rPr>
-        <w:t xml:space="preserve">CIS rarely records why a scheme has not progressed. 10 schemes carry notes such as “on hold” or “no movement”, one was quashed following a legal challenge, and two sites were reported for sale. The planning and building control record gives a fuller picture of where delivery slows.</w:t>
+        <w:t xml:space="preserve">CIS rarely records why a scheme has not progressed. 9 schemes carry notes such as “on hold” or “no movement”, one was quashed following a legal challenge, and two sites were reported for sale. The planning and building control record gives a fuller picture of where delivery slows.</w:t>
       </w:r>
     </w:p>
     <w:tbl>
@@ -9019,7 +9044,7 @@
                 <w:sz w:val="17"/>
                 <w:szCs w:val="17"/>
               </w:rPr>
-              <w:t xml:space="preserve">93</w:t>
+              <w:t xml:space="preserve">95</w:t>
             </w:r>
           </w:p>
         </w:tc>
@@ -9051,7 +9076,7 @@
                 <w:sz w:val="17"/>
                 <w:szCs w:val="17"/>
               </w:rPr>
-              <w:t xml:space="preserve">5,445</w:t>
+              <w:t xml:space="preserve">5,551</w:t>
             </w:r>
           </w:p>
         </w:tc>
@@ -9223,7 +9248,7 @@
                 <w:sz w:val="17"/>
                 <w:szCs w:val="17"/>
               </w:rPr>
-              <w:t xml:space="preserve">5</w:t>
+              <w:t xml:space="preserve">4</w:t>
             </w:r>
           </w:p>
         </w:tc>
@@ -9255,7 +9280,7 @@
                 <w:sz w:val="17"/>
                 <w:szCs w:val="17"/>
               </w:rPr>
-              <w:t xml:space="preserve">192</w:t>
+              <w:t xml:space="preserve">156</w:t>
             </w:r>
           </w:p>
         </w:tc>
@@ -9325,7 +9350,7 @@
                 <w:sz w:val="17"/>
                 <w:szCs w:val="17"/>
               </w:rPr>
-              <w:t xml:space="preserve">10</w:t>
+              <w:t xml:space="preserve">9</w:t>
             </w:r>
           </w:p>
         </w:tc>
@@ -9357,7 +9382,7 @@
                 <w:sz w:val="17"/>
                 <w:szCs w:val="17"/>
               </w:rPr>
-              <w:t xml:space="preserve">702</w:t>
+              <w:t xml:space="preserve">666</w:t>
             </w:r>
           </w:p>
         </w:tc>
@@ -9631,7 +9656,7 @@
                 <w:sz w:val="17"/>
                 <w:szCs w:val="17"/>
               </w:rPr>
-              <w:t xml:space="preserve">153</w:t>
+              <w:t xml:space="preserve">161</w:t>
             </w:r>
           </w:p>
         </w:tc>
@@ -9663,7 +9688,7 @@
                 <w:sz w:val="17"/>
                 <w:szCs w:val="17"/>
               </w:rPr>
-              <w:t xml:space="preserve">6,284</w:t>
+              <w:t xml:space="preserve">6,454</w:t>
             </w:r>
           </w:p>
         </w:tc>
@@ -9733,7 +9758,7 @@
                 <w:sz w:val="17"/>
                 <w:szCs w:val="17"/>
               </w:rPr>
-              <w:t xml:space="preserve">44</w:t>
+              <w:t xml:space="preserve">47</w:t>
             </w:r>
           </w:p>
         </w:tc>
@@ -9765,7 +9790,7 @@
                 <w:sz w:val="17"/>
                 <w:szCs w:val="17"/>
               </w:rPr>
-              <w:t xml:space="preserve">2,534</w:t>
+              <w:t xml:space="preserve">2,689</w:t>
             </w:r>
           </w:p>
         </w:tc>
@@ -10120,7 +10145,7 @@
           <w:sz w:val="21"/>
           <w:szCs w:val="21"/>
         </w:rPr>
-        <w:t xml:space="preserve">The tables below cover permissions granted at least two years before September 2026 (180 schemes, 6,457 units), so every scheme has had time to start. 69% of those units have started.</w:t>
+        <w:t xml:space="preserve">The tables below cover permissions granted at least two years before September 2026 (182 schemes, 6,619 units), so every scheme has had time to start. 70% of those units have started.</w:t>
       </w:r>
     </w:p>
     <w:tbl>
@@ -10424,7 +10449,7 @@
                 <w:sz w:val="17"/>
                 <w:szCs w:val="17"/>
               </w:rPr>
-              <w:t xml:space="preserve">132</w:t>
+              <w:t xml:space="preserve">137</w:t>
             </w:r>
           </w:p>
         </w:tc>
@@ -10456,7 +10481,7 @@
                 <w:sz w:val="17"/>
                 <w:szCs w:val="17"/>
               </w:rPr>
-              <w:t xml:space="preserve">4,048</w:t>
+              <w:t xml:space="preserve">4,164</w:t>
             </w:r>
           </w:p>
         </w:tc>
@@ -10488,7 +10513,7 @@
                 <w:sz w:val="17"/>
                 <w:szCs w:val="17"/>
               </w:rPr>
-              <w:t xml:space="preserve">3,035</w:t>
+              <w:t xml:space="preserve">3,071</w:t>
             </w:r>
           </w:p>
         </w:tc>
@@ -10520,7 +10545,7 @@
                 <w:sz w:val="17"/>
                 <w:szCs w:val="17"/>
               </w:rPr>
-              <w:t xml:space="preserve">75%</w:t>
+              <w:t xml:space="preserve">74%</w:t>
             </w:r>
           </w:p>
         </w:tc>
@@ -10622,7 +10647,7 @@
                 <w:sz w:val="17"/>
                 <w:szCs w:val="17"/>
               </w:rPr>
-              <w:t xml:space="preserve">2</w:t>
+              <w:t xml:space="preserve">3</w:t>
             </w:r>
           </w:p>
         </w:tc>
@@ -10654,7 +10679,7 @@
                 <w:sz w:val="17"/>
                 <w:szCs w:val="17"/>
               </w:rPr>
-              <w:t xml:space="preserve">193</w:t>
+              <w:t xml:space="preserve">315</w:t>
             </w:r>
           </w:p>
         </w:tc>
@@ -10686,7 +10711,7 @@
                 <w:sz w:val="17"/>
                 <w:szCs w:val="17"/>
               </w:rPr>
-              <w:t xml:space="preserve">193</w:t>
+              <w:t xml:space="preserve">315</w:t>
             </w:r>
           </w:p>
         </w:tc>
@@ -10750,7 +10775,7 @@
                 <w:sz w:val="17"/>
                 <w:szCs w:val="17"/>
               </w:rPr>
-              <w:t xml:space="preserve">1.3</w:t>
+              <w:t xml:space="preserve">1</w:t>
             </w:r>
           </w:p>
         </w:tc>
@@ -11018,7 +11043,7 @@
                 <w:sz w:val="17"/>
                 <w:szCs w:val="17"/>
               </w:rPr>
-              <w:t xml:space="preserve">40</w:t>
+              <w:t xml:space="preserve">36</w:t>
             </w:r>
           </w:p>
         </w:tc>
@@ -11050,7 +11075,7 @@
                 <w:sz w:val="17"/>
                 <w:szCs w:val="17"/>
               </w:rPr>
-              <w:t xml:space="preserve">929</w:t>
+              <w:t xml:space="preserve">853</w:t>
             </w:r>
           </w:p>
         </w:tc>
@@ -11114,7 +11139,7 @@
                 <w:sz w:val="17"/>
                 <w:szCs w:val="17"/>
               </w:rPr>
-              <w:t xml:space="preserve">74%</w:t>
+              <w:t xml:space="preserve">80%</w:t>
             </w:r>
           </w:p>
         </w:tc>
@@ -11183,7 +11208,7 @@
           <w:sz w:val="21"/>
           <w:szCs w:val="21"/>
         </w:rPr>
-        <w:t xml:space="preserve">Standard planning applications and Part 8 schemes start at similar rates by units (75% and 74%). Two of the six SHD permissions have started, accounting for 44% of their 1,287 units. Among the four not started, the largest are Raheen (384 units, CIS: commencement expected), Clonmacken Gardens (165 units) and Annacotty (137 units, now past expiry).</w:t>
+        <w:t xml:space="preserve">Standard planning applications and Part 8 schemes start at similar rates by units (74% and 80%). Two of the six SHD permissions have started, accounting for 44% of their 1,287 units. Among the four not started, the largest are Raheen (384 units, CIS: commencement expected), Clonmacken Gardens (165 units) and Annacotty (137 units, now past expiry).</w:t>
       </w:r>
     </w:p>
     <w:tbl>
@@ -11487,7 +11512,7 @@
                 <w:sz w:val="17"/>
                 <w:szCs w:val="17"/>
               </w:rPr>
-              <w:t xml:space="preserve">72</w:t>
+              <w:t xml:space="preserve">74</w:t>
             </w:r>
           </w:p>
         </w:tc>
@@ -11519,7 +11544,7 @@
                 <w:sz w:val="17"/>
                 <w:szCs w:val="17"/>
               </w:rPr>
-              <w:t xml:space="preserve">1,334</w:t>
+              <w:t xml:space="preserve">1,367</w:t>
             </w:r>
           </w:p>
         </w:tc>
@@ -11551,7 +11576,7 @@
                 <w:sz w:val="17"/>
                 <w:szCs w:val="17"/>
               </w:rPr>
-              <w:t xml:space="preserve">942</w:t>
+              <w:t xml:space="preserve">954</w:t>
             </w:r>
           </w:p>
         </w:tc>
@@ -11583,7 +11608,7 @@
                 <w:sz w:val="17"/>
                 <w:szCs w:val="17"/>
               </w:rPr>
-              <w:t xml:space="preserve">71%</w:t>
+              <w:t xml:space="preserve">70%</w:t>
             </w:r>
           </w:p>
         </w:tc>
@@ -11685,7 +11710,7 @@
                 <w:sz w:val="17"/>
                 <w:szCs w:val="17"/>
               </w:rPr>
-              <w:t xml:space="preserve">24</w:t>
+              <w:t xml:space="preserve">25</w:t>
             </w:r>
           </w:p>
         </w:tc>
@@ -11717,7 +11742,7 @@
                 <w:sz w:val="17"/>
                 <w:szCs w:val="17"/>
               </w:rPr>
-              <w:t xml:space="preserve">2,753</w:t>
+              <w:t xml:space="preserve">2,875</w:t>
             </w:r>
           </w:p>
         </w:tc>
@@ -11749,7 +11774,7 @@
                 <w:sz w:val="17"/>
                 <w:szCs w:val="17"/>
               </w:rPr>
-              <w:t xml:space="preserve">1,882</w:t>
+              <w:t xml:space="preserve">2,004</w:t>
             </w:r>
           </w:p>
         </w:tc>
@@ -11781,7 +11806,7 @@
                 <w:sz w:val="17"/>
                 <w:szCs w:val="17"/>
               </w:rPr>
-              <w:t xml:space="preserve">68%</w:t>
+              <w:t xml:space="preserve">70%</w:t>
             </w:r>
           </w:p>
         </w:tc>
@@ -11813,7 +11838,7 @@
                 <w:sz w:val="17"/>
                 <w:szCs w:val="17"/>
               </w:rPr>
-              <w:t xml:space="preserve">1.6</w:t>
+              <w:t xml:space="preserve">1.5</w:t>
             </w:r>
           </w:p>
         </w:tc>
@@ -11883,7 +11908,7 @@
                 <w:sz w:val="17"/>
                 <w:szCs w:val="17"/>
               </w:rPr>
-              <w:t xml:space="preserve">54</w:t>
+              <w:t xml:space="preserve">55</w:t>
             </w:r>
           </w:p>
         </w:tc>
@@ -11915,7 +11940,7 @@
                 <w:sz w:val="17"/>
                 <w:szCs w:val="17"/>
               </w:rPr>
-              <w:t xml:space="preserve">1,803</w:t>
+              <w:t xml:space="preserve">1,837</w:t>
             </w:r>
           </w:p>
         </w:tc>
@@ -11947,7 +11972,7 @@
                 <w:sz w:val="17"/>
                 <w:szCs w:val="17"/>
               </w:rPr>
-              <w:t xml:space="preserve">1,339</w:t>
+              <w:t xml:space="preserve">1,363</w:t>
             </w:r>
           </w:p>
         </w:tc>
@@ -12279,7 +12304,7 @@
                 <w:sz w:val="17"/>
                 <w:szCs w:val="17"/>
               </w:rPr>
-              <w:t xml:space="preserve">25</w:t>
+              <w:t xml:space="preserve">23</w:t>
             </w:r>
           </w:p>
         </w:tc>
@@ -12311,7 +12336,7 @@
                 <w:sz w:val="17"/>
                 <w:szCs w:val="17"/>
               </w:rPr>
-              <w:t xml:space="preserve">455</w:t>
+              <w:t xml:space="preserve">428</w:t>
             </w:r>
           </w:p>
         </w:tc>
@@ -12375,7 +12400,7 @@
                 <w:sz w:val="17"/>
                 <w:szCs w:val="17"/>
               </w:rPr>
-              <w:t xml:space="preserve">64%</w:t>
+              <w:t xml:space="preserve">68%</w:t>
             </w:r>
           </w:p>
         </w:tc>
@@ -12547,7 +12572,7 @@
           <w:sz w:val="21"/>
           <w:szCs w:val="21"/>
         </w:rPr>
-        <w:t xml:space="preserve">Of the 5,756 permitted units not started, 4,092 have more than three years left on their permission. The near-term pipeline at risk is smaller: 311 units are already past expiry, 360 expire within 12 months and 176 within 12 to 24 months.</w:t>
+        <w:t xml:space="preserve">Of the 5,862 permitted units not started, 4,200 have more than three years left on their permission. The near-term pipeline at risk is smaller: 311 units are already past expiry, 360 expire within 12 months and 235 within 12 to 24 months.</w:t>
       </w:r>
     </w:p>
     <w:tbl>
@@ -13547,7 +13572,7 @@
                 <w:sz w:val="15"/>
                 <w:szCs w:val="15"/>
               </w:rPr>
-              <w:t xml:space="preserve">5</w:t>
+              <w:t xml:space="preserve">7</w:t>
             </w:r>
           </w:p>
         </w:tc>
@@ -13707,7 +13732,7 @@
                 <w:sz w:val="15"/>
                 <w:szCs w:val="15"/>
               </w:rPr>
-              <w:t xml:space="preserve">54</w:t>
+              <w:t xml:space="preserve">113</w:t>
             </w:r>
           </w:p>
         </w:tc>
@@ -13771,7 +13796,7 @@
                 <w:sz w:val="15"/>
                 <w:szCs w:val="15"/>
               </w:rPr>
-              <w:t xml:space="preserve">176</w:t>
+              <w:t xml:space="preserve">235</w:t>
             </w:r>
           </w:p>
         </w:tc>
@@ -13841,7 +13866,7 @@
                 <w:sz w:val="15"/>
                 <w:szCs w:val="15"/>
               </w:rPr>
-              <w:t xml:space="preserve">19</w:t>
+              <w:t xml:space="preserve">20</w:t>
             </w:r>
           </w:p>
         </w:tc>
@@ -14001,7 +14026,7 @@
                 <w:sz w:val="15"/>
                 <w:szCs w:val="15"/>
               </w:rPr>
-              <w:t xml:space="preserve">95</w:t>
+              <w:t xml:space="preserve">116</w:t>
             </w:r>
           </w:p>
         </w:tc>
@@ -14065,7 +14090,7 @@
                 <w:sz w:val="15"/>
                 <w:szCs w:val="15"/>
               </w:rPr>
-              <w:t xml:space="preserve">505</w:t>
+              <w:t xml:space="preserve">526</w:t>
             </w:r>
           </w:p>
         </w:tc>
@@ -14135,7 +14160,7 @@
                 <w:sz w:val="15"/>
                 <w:szCs w:val="15"/>
               </w:rPr>
-              <w:t xml:space="preserve">39</w:t>
+              <w:t xml:space="preserve">43</w:t>
             </w:r>
           </w:p>
         </w:tc>
@@ -14263,7 +14288,7 @@
                 <w:sz w:val="15"/>
                 <w:szCs w:val="15"/>
               </w:rPr>
-              <w:t xml:space="preserve">202</w:t>
+              <w:t xml:space="preserve">262</w:t>
             </w:r>
           </w:p>
         </w:tc>
@@ -14295,7 +14320,7 @@
                 <w:sz w:val="15"/>
                 <w:szCs w:val="15"/>
               </w:rPr>
-              <w:t xml:space="preserve">1,593</w:t>
+              <w:t xml:space="preserve">1,641</w:t>
             </w:r>
           </w:p>
         </w:tc>
@@ -14359,7 +14384,7 @@
                 <w:sz w:val="15"/>
                 <w:szCs w:val="15"/>
               </w:rPr>
-              <w:t xml:space="preserve">4,092</w:t>
+              <w:t xml:space="preserve">4,200</w:t>
             </w:r>
           </w:p>
         </w:tc>
@@ -14429,7 +14454,7 @@
                 <w:sz w:val="15"/>
                 <w:szCs w:val="15"/>
               </w:rPr>
-              <w:t xml:space="preserve">23</w:t>
+              <w:t xml:space="preserve">18</w:t>
             </w:r>
           </w:p>
         </w:tc>
@@ -14493,7 +14518,7 @@
                 <w:sz w:val="15"/>
                 <w:szCs w:val="15"/>
               </w:rPr>
-              <w:t xml:space="preserve">12</w:t>
+              <w:t xml:space="preserve">3</w:t>
             </w:r>
           </w:p>
         </w:tc>
@@ -14557,7 +14582,7 @@
                 <w:sz w:val="15"/>
                 <w:szCs w:val="15"/>
               </w:rPr>
-              <w:t xml:space="preserve">61</w:t>
+              <w:t xml:space="preserve">55</w:t>
             </w:r>
           </w:p>
         </w:tc>
@@ -14589,7 +14614,7 @@
                 <w:sz w:val="15"/>
                 <w:szCs w:val="15"/>
               </w:rPr>
-              <w:t xml:space="preserve">101</w:t>
+              <w:t xml:space="preserve">52</w:t>
             </w:r>
           </w:p>
         </w:tc>
@@ -14621,7 +14646,7 @@
                 <w:sz w:val="15"/>
                 <w:szCs w:val="15"/>
               </w:rPr>
-              <w:t xml:space="preserve">90</w:t>
+              <w:t xml:space="preserve">72</w:t>
             </w:r>
           </w:p>
         </w:tc>
@@ -14653,7 +14678,7 @@
                 <w:sz w:val="15"/>
                 <w:szCs w:val="15"/>
               </w:rPr>
-              <w:t xml:space="preserve">312</w:t>
+              <w:t xml:space="preserve">230</w:t>
             </w:r>
           </w:p>
         </w:tc>
@@ -18340,6 +18365,204 @@
                 <w:sz w:val="17"/>
                 <w:szCs w:val="17"/>
               </w:rPr>
+              <w:t xml:space="preserve">Apartment/Retail Development, Dooradoyle</w:t>
+            </w:r>
+          </w:p>
+        </w:tc>
+        <w:tc>
+          <w:tcPr>
+            <w:tcW w:type="dxa" w:w="1250"/>
+            <w:tcBorders>
+              <w:top w:val="single" w:color="D0CFCA" w:sz="4"/>
+              <w:left w:val="single" w:color="D0CFCA" w:sz="4"/>
+              <w:bottom w:val="single" w:color="D0CFCA" w:sz="4"/>
+              <w:right w:val="single" w:color="D0CFCA" w:sz="4"/>
+            </w:tcBorders>
+            <w:tcMar>
+              <w:top w:type="dxa" w:w="50"/>
+              <w:left w:type="dxa" w:w="90"/>
+              <w:bottom w:type="dxa" w:w="50"/>
+              <w:right w:type="dxa" w:w="90"/>
+            </w:tcMar>
+          </w:tcPr>
+          <w:p>
+            <w:pPr>
+              <w:keepNext/>
+              <w:jc w:val="right"/>
+            </w:pPr>
+            <w:r>
+              <w:rPr>
+                <w:rFonts w:ascii="Arial" w:cs="Arial" w:eastAsia="Arial" w:hAnsi="Arial"/>
+                <w:color w:val="0B0B0B"/>
+                <w:sz w:val="17"/>
+                <w:szCs w:val="17"/>
+              </w:rPr>
+              <w:t xml:space="preserve">221107</w:t>
+            </w:r>
+          </w:p>
+        </w:tc>
+        <w:tc>
+          <w:tcPr>
+            <w:tcW w:type="dxa" w:w="1900"/>
+            <w:tcBorders>
+              <w:top w:val="single" w:color="D0CFCA" w:sz="4"/>
+              <w:left w:val="single" w:color="D0CFCA" w:sz="4"/>
+              <w:bottom w:val="single" w:color="D0CFCA" w:sz="4"/>
+              <w:right w:val="single" w:color="D0CFCA" w:sz="4"/>
+            </w:tcBorders>
+            <w:tcMar>
+              <w:top w:type="dxa" w:w="50"/>
+              <w:left w:type="dxa" w:w="90"/>
+              <w:bottom w:type="dxa" w:w="50"/>
+              <w:right w:type="dxa" w:w="90"/>
+            </w:tcMar>
+          </w:tcPr>
+          <w:p>
+            <w:pPr>
+              <w:keepNext/>
+              <w:jc w:val="right"/>
+            </w:pPr>
+            <w:r>
+              <w:rPr>
+                <w:rFonts w:ascii="Arial" w:cs="Arial" w:eastAsia="Arial" w:hAnsi="Arial"/>
+                <w:color w:val="0B0B0B"/>
+                <w:sz w:val="17"/>
+                <w:szCs w:val="17"/>
+              </w:rPr>
+              <w:t xml:space="preserve">Dooradoyle</w:t>
+            </w:r>
+          </w:p>
+        </w:tc>
+        <w:tc>
+          <w:tcPr>
+            <w:tcW w:type="dxa" w:w="900"/>
+            <w:tcBorders>
+              <w:top w:val="single" w:color="D0CFCA" w:sz="4"/>
+              <w:left w:val="single" w:color="D0CFCA" w:sz="4"/>
+              <w:bottom w:val="single" w:color="D0CFCA" w:sz="4"/>
+              <w:right w:val="single" w:color="D0CFCA" w:sz="4"/>
+            </w:tcBorders>
+            <w:tcMar>
+              <w:top w:type="dxa" w:w="50"/>
+              <w:left w:type="dxa" w:w="90"/>
+              <w:bottom w:type="dxa" w:w="50"/>
+              <w:right w:type="dxa" w:w="90"/>
+            </w:tcMar>
+          </w:tcPr>
+          <w:p>
+            <w:pPr>
+              <w:keepNext/>
+              <w:jc w:val="right"/>
+            </w:pPr>
+            <w:r>
+              <w:rPr>
+                <w:rFonts w:ascii="Arial" w:cs="Arial" w:eastAsia="Arial" w:hAnsi="Arial"/>
+                <w:color w:val="0B0B0B"/>
+                <w:sz w:val="17"/>
+                <w:szCs w:val="17"/>
+              </w:rPr>
+              <w:t xml:space="preserve">Private</w:t>
+            </w:r>
+          </w:p>
+        </w:tc>
+        <w:tc>
+          <w:tcPr>
+            <w:tcW w:type="dxa" w:w="700"/>
+            <w:tcBorders>
+              <w:top w:val="single" w:color="D0CFCA" w:sz="4"/>
+              <w:left w:val="single" w:color="D0CFCA" w:sz="4"/>
+              <w:bottom w:val="single" w:color="D0CFCA" w:sz="4"/>
+              <w:right w:val="single" w:color="D0CFCA" w:sz="4"/>
+            </w:tcBorders>
+            <w:tcMar>
+              <w:top w:type="dxa" w:w="50"/>
+              <w:left w:type="dxa" w:w="90"/>
+              <w:bottom w:type="dxa" w:w="50"/>
+              <w:right w:type="dxa" w:w="90"/>
+            </w:tcMar>
+          </w:tcPr>
+          <w:p>
+            <w:pPr>
+              <w:keepNext/>
+              <w:jc w:val="right"/>
+            </w:pPr>
+            <w:r>
+              <w:rPr>
+                <w:rFonts w:ascii="Arial" w:cs="Arial" w:eastAsia="Arial" w:hAnsi="Arial"/>
+                <w:color w:val="0B0B0B"/>
+                <w:sz w:val="17"/>
+                <w:szCs w:val="17"/>
+              </w:rPr>
+              <w:t xml:space="preserve">30</w:t>
+            </w:r>
+          </w:p>
+        </w:tc>
+        <w:tc>
+          <w:tcPr>
+            <w:tcW w:type="dxa" w:w="1562"/>
+            <w:tcBorders>
+              <w:top w:val="single" w:color="D0CFCA" w:sz="4"/>
+              <w:left w:val="single" w:color="D0CFCA" w:sz="4"/>
+              <w:bottom w:val="single" w:color="D0CFCA" w:sz="4"/>
+              <w:right w:val="single" w:color="D0CFCA" w:sz="4"/>
+            </w:tcBorders>
+            <w:tcMar>
+              <w:top w:type="dxa" w:w="50"/>
+              <w:left w:type="dxa" w:w="90"/>
+              <w:bottom w:type="dxa" w:w="50"/>
+              <w:right w:type="dxa" w:w="90"/>
+            </w:tcMar>
+          </w:tcPr>
+          <w:p>
+            <w:pPr>
+              <w:keepNext/>
+              <w:jc w:val="right"/>
+            </w:pPr>
+            <w:r>
+              <w:rPr>
+                <w:rFonts w:ascii="Arial" w:cs="Arial" w:eastAsia="Arial" w:hAnsi="Arial"/>
+                <w:color w:val="0B0B0B"/>
+                <w:sz w:val="17"/>
+                <w:szCs w:val="17"/>
+              </w:rPr>
+              <w:t xml:space="preserve">13/06/2028</w:t>
+            </w:r>
+          </w:p>
+        </w:tc>
+      </w:tr>
+      <w:tr>
+        <w:trPr>
+          <w:cantSplit/>
+          <w:tblHeader w:val="off"/>
+        </w:trPr>
+        <w:tc>
+          <w:tcPr>
+            <w:tcW w:type="dxa" w:w="3100"/>
+            <w:tcBorders>
+              <w:top w:val="single" w:color="D0CFCA" w:sz="4"/>
+              <w:left w:val="single" w:color="D0CFCA" w:sz="4"/>
+              <w:bottom w:val="single" w:color="D0CFCA" w:sz="4"/>
+              <w:right w:val="single" w:color="D0CFCA" w:sz="4"/>
+            </w:tcBorders>
+            <w:tcMar>
+              <w:top w:type="dxa" w:w="50"/>
+              <w:left w:type="dxa" w:w="90"/>
+              <w:bottom w:type="dxa" w:w="50"/>
+              <w:right w:type="dxa" w:w="90"/>
+            </w:tcMar>
+          </w:tcPr>
+          <w:p>
+            <w:pPr>
+              <w:keepNext/>
+              <w:jc w:val="left"/>
+            </w:pPr>
+            <w:r>
+              <w:rPr>
+                <w:rFonts w:ascii="Arial" w:cs="Arial" w:eastAsia="Arial" w:hAnsi="Arial"/>
+                <w:color w:val="0B0B0B"/>
+                <w:sz w:val="17"/>
+                <w:szCs w:val="17"/>
+              </w:rPr>
               <w:t xml:space="preserve">Residential Development, Limerick</w:t>
             </w:r>
           </w:p>
@@ -18501,6 +18724,204 @@
                 <w:szCs w:val="17"/>
               </w:rPr>
               <w:t xml:space="preserve">03/07/2028</w:t>
+            </w:r>
+          </w:p>
+        </w:tc>
+      </w:tr>
+      <w:tr>
+        <w:trPr>
+          <w:cantSplit/>
+          <w:tblHeader w:val="off"/>
+        </w:trPr>
+        <w:tc>
+          <w:tcPr>
+            <w:tcW w:type="dxa" w:w="3100"/>
+            <w:tcBorders>
+              <w:top w:val="single" w:color="D0CFCA" w:sz="4"/>
+              <w:left w:val="single" w:color="D0CFCA" w:sz="4"/>
+              <w:bottom w:val="single" w:color="D0CFCA" w:sz="4"/>
+              <w:right w:val="single" w:color="D0CFCA" w:sz="4"/>
+            </w:tcBorders>
+            <w:tcMar>
+              <w:top w:type="dxa" w:w="50"/>
+              <w:left w:type="dxa" w:w="90"/>
+              <w:bottom w:type="dxa" w:w="50"/>
+              <w:right w:type="dxa" w:w="90"/>
+            </w:tcMar>
+          </w:tcPr>
+          <w:p>
+            <w:pPr>
+              <w:keepNext/>
+              <w:jc w:val="left"/>
+            </w:pPr>
+            <w:r>
+              <w:rPr>
+                <w:rFonts w:ascii="Arial" w:cs="Arial" w:eastAsia="Arial" w:hAnsi="Arial"/>
+                <w:color w:val="0B0B0B"/>
+                <w:sz w:val="17"/>
+                <w:szCs w:val="17"/>
+              </w:rPr>
+              <w:t xml:space="preserve">Apartment Development, Limerick</w:t>
+            </w:r>
+          </w:p>
+        </w:tc>
+        <w:tc>
+          <w:tcPr>
+            <w:tcW w:type="dxa" w:w="1250"/>
+            <w:tcBorders>
+              <w:top w:val="single" w:color="D0CFCA" w:sz="4"/>
+              <w:left w:val="single" w:color="D0CFCA" w:sz="4"/>
+              <w:bottom w:val="single" w:color="D0CFCA" w:sz="4"/>
+              <w:right w:val="single" w:color="D0CFCA" w:sz="4"/>
+            </w:tcBorders>
+            <w:tcMar>
+              <w:top w:type="dxa" w:w="50"/>
+              <w:left w:type="dxa" w:w="90"/>
+              <w:bottom w:type="dxa" w:w="50"/>
+              <w:right w:type="dxa" w:w="90"/>
+            </w:tcMar>
+          </w:tcPr>
+          <w:p>
+            <w:pPr>
+              <w:keepNext/>
+              <w:jc w:val="right"/>
+            </w:pPr>
+            <w:r>
+              <w:rPr>
+                <w:rFonts w:ascii="Arial" w:cs="Arial" w:eastAsia="Arial" w:hAnsi="Arial"/>
+                <w:color w:val="0B0B0B"/>
+                <w:sz w:val="17"/>
+                <w:szCs w:val="17"/>
+              </w:rPr>
+              <w:t xml:space="preserve">221003</w:t>
+            </w:r>
+          </w:p>
+        </w:tc>
+        <w:tc>
+          <w:tcPr>
+            <w:tcW w:type="dxa" w:w="1900"/>
+            <w:tcBorders>
+              <w:top w:val="single" w:color="D0CFCA" w:sz="4"/>
+              <w:left w:val="single" w:color="D0CFCA" w:sz="4"/>
+              <w:bottom w:val="single" w:color="D0CFCA" w:sz="4"/>
+              <w:right w:val="single" w:color="D0CFCA" w:sz="4"/>
+            </w:tcBorders>
+            <w:tcMar>
+              <w:top w:type="dxa" w:w="50"/>
+              <w:left w:type="dxa" w:w="90"/>
+              <w:bottom w:type="dxa" w:w="50"/>
+              <w:right w:type="dxa" w:w="90"/>
+            </w:tcMar>
+          </w:tcPr>
+          <w:p>
+            <w:pPr>
+              <w:keepNext/>
+              <w:jc w:val="right"/>
+            </w:pPr>
+            <w:r>
+              <w:rPr>
+                <w:rFonts w:ascii="Arial" w:cs="Arial" w:eastAsia="Arial" w:hAnsi="Arial"/>
+                <w:color w:val="0B0B0B"/>
+                <w:sz w:val="17"/>
+                <w:szCs w:val="17"/>
+              </w:rPr>
+              <w:t xml:space="preserve">City Centre</w:t>
+            </w:r>
+          </w:p>
+        </w:tc>
+        <w:tc>
+          <w:tcPr>
+            <w:tcW w:type="dxa" w:w="900"/>
+            <w:tcBorders>
+              <w:top w:val="single" w:color="D0CFCA" w:sz="4"/>
+              <w:left w:val="single" w:color="D0CFCA" w:sz="4"/>
+              <w:bottom w:val="single" w:color="D0CFCA" w:sz="4"/>
+              <w:right w:val="single" w:color="D0CFCA" w:sz="4"/>
+            </w:tcBorders>
+            <w:tcMar>
+              <w:top w:type="dxa" w:w="50"/>
+              <w:left w:type="dxa" w:w="90"/>
+              <w:bottom w:type="dxa" w:w="50"/>
+              <w:right w:type="dxa" w:w="90"/>
+            </w:tcMar>
+          </w:tcPr>
+          <w:p>
+            <w:pPr>
+              <w:keepNext/>
+              <w:jc w:val="right"/>
+            </w:pPr>
+            <w:r>
+              <w:rPr>
+                <w:rFonts w:ascii="Arial" w:cs="Arial" w:eastAsia="Arial" w:hAnsi="Arial"/>
+                <w:color w:val="0B0B0B"/>
+                <w:sz w:val="17"/>
+                <w:szCs w:val="17"/>
+              </w:rPr>
+              <w:t xml:space="preserve">Private</w:t>
+            </w:r>
+          </w:p>
+        </w:tc>
+        <w:tc>
+          <w:tcPr>
+            <w:tcW w:type="dxa" w:w="700"/>
+            <w:tcBorders>
+              <w:top w:val="single" w:color="D0CFCA" w:sz="4"/>
+              <w:left w:val="single" w:color="D0CFCA" w:sz="4"/>
+              <w:bottom w:val="single" w:color="D0CFCA" w:sz="4"/>
+              <w:right w:val="single" w:color="D0CFCA" w:sz="4"/>
+            </w:tcBorders>
+            <w:tcMar>
+              <w:top w:type="dxa" w:w="50"/>
+              <w:left w:type="dxa" w:w="90"/>
+              <w:bottom w:type="dxa" w:w="50"/>
+              <w:right w:type="dxa" w:w="90"/>
+            </w:tcMar>
+          </w:tcPr>
+          <w:p>
+            <w:pPr>
+              <w:keepNext/>
+              <w:jc w:val="right"/>
+            </w:pPr>
+            <w:r>
+              <w:rPr>
+                <w:rFonts w:ascii="Arial" w:cs="Arial" w:eastAsia="Arial" w:hAnsi="Arial"/>
+                <w:color w:val="0B0B0B"/>
+                <w:sz w:val="17"/>
+                <w:szCs w:val="17"/>
+              </w:rPr>
+              <w:t xml:space="preserve">29</w:t>
+            </w:r>
+          </w:p>
+        </w:tc>
+        <w:tc>
+          <w:tcPr>
+            <w:tcW w:type="dxa" w:w="1562"/>
+            <w:tcBorders>
+              <w:top w:val="single" w:color="D0CFCA" w:sz="4"/>
+              <w:left w:val="single" w:color="D0CFCA" w:sz="4"/>
+              <w:bottom w:val="single" w:color="D0CFCA" w:sz="4"/>
+              <w:right w:val="single" w:color="D0CFCA" w:sz="4"/>
+            </w:tcBorders>
+            <w:tcMar>
+              <w:top w:type="dxa" w:w="50"/>
+              <w:left w:type="dxa" w:w="90"/>
+              <w:bottom w:type="dxa" w:w="50"/>
+              <w:right w:type="dxa" w:w="90"/>
+            </w:tcMar>
+          </w:tcPr>
+          <w:p>
+            <w:pPr>
+              <w:keepNext/>
+              <w:jc w:val="right"/>
+            </w:pPr>
+            <w:r>
+              <w:rPr>
+                <w:rFonts w:ascii="Arial" w:cs="Arial" w:eastAsia="Arial" w:hAnsi="Arial"/>
+                <w:color w:val="0B0B0B"/>
+                <w:sz w:val="17"/>
+                <w:szCs w:val="17"/>
+              </w:rPr>
+              <w:t xml:space="preserve">11/07/2028</w:t>
             </w:r>
           </w:p>
         </w:tc>
@@ -18768,7 +19189,7 @@
       <w:r>
         <w:drawing>
           <wp:inline distT="0" distB="0" distL="0" distR="0">
-            <wp:extent cx="5760000" cy="2700659"/>
+            <wp:extent cx="5760000" cy="2728982"/>
             <wp:effectExtent t="0" r="0" b="0" l="0"/>
             <wp:docPr id="7" name="charts/c4_status_by_lea.png" descr="charts/c4_status_by_lea.png" title="charts/c4_status_by_lea.png"/>
             <wp:cNvGraphicFramePr>
@@ -18793,7 +19214,7 @@
                   <pic:spPr bwMode="auto">
                     <a:xfrm>
                       <a:off x="0" y="0"/>
-                      <a:ext cx="5760000" cy="2700659"/>
+                      <a:ext cx="5760000" cy="2728982"/>
                     </a:xfrm>
                     <a:prstGeom prst="rect">
                       <a:avLst/>
@@ -18832,7 +19253,7 @@
           <w:sz w:val="21"/>
           <w:szCs w:val="21"/>
         </w:rPr>
-        <w:t xml:space="preserve">Among older permissions, Limerick City East has the highest start rate (91% of units), followed by City West (68%) and City North (62%). The county LEAs have smaller volumes and lower start rates: 31 of 165 units in Adare-Rathkeale and 206 of 436 in Newcastle West. Of the unstarted units in City East, 93% are on permissions granted since January 2025.</w:t>
+        <w:t xml:space="preserve">Among older permissions, Limerick City East has the highest start rate (91% of units), followed by City West (68%) and City North (62%). The county LEAs have smaller volumes and lower start rates: 31 of 165 units in Adare-Rathkeale and 206 of 418 in Newcastle West. Of the unstarted units in City East, 93% are on permissions granted since January 2025.</w:t>
       </w:r>
     </w:p>
     <w:tbl>
@@ -19136,7 +19557,7 @@
                 <w:sz w:val="17"/>
                 <w:szCs w:val="17"/>
               </w:rPr>
-              <w:t xml:space="preserve">38</w:t>
+              <w:t xml:space="preserve">39</w:t>
             </w:r>
           </w:p>
         </w:tc>
@@ -19168,7 +19589,7 @@
                 <w:sz w:val="17"/>
                 <w:szCs w:val="17"/>
               </w:rPr>
-              <w:t xml:space="preserve">1,712</w:t>
+              <w:t xml:space="preserve">1,834</w:t>
             </w:r>
           </w:p>
         </w:tc>
@@ -19200,7 +19621,7 @@
                 <w:sz w:val="17"/>
                 <w:szCs w:val="17"/>
               </w:rPr>
-              <w:t xml:space="preserve">1,551</w:t>
+              <w:t xml:space="preserve">1,673</w:t>
             </w:r>
           </w:p>
         </w:tc>
@@ -19264,7 +19685,7 @@
                 <w:sz w:val="17"/>
                 <w:szCs w:val="17"/>
               </w:rPr>
-              <w:t xml:space="preserve">1.3</w:t>
+              <w:t xml:space="preserve">1.2</w:t>
             </w:r>
           </w:p>
         </w:tc>
@@ -19532,7 +19953,7 @@
                 <w:sz w:val="17"/>
                 <w:szCs w:val="17"/>
               </w:rPr>
-              <w:t xml:space="preserve">56</w:t>
+              <w:t xml:space="preserve">59</w:t>
             </w:r>
           </w:p>
         </w:tc>
@@ -19564,7 +19985,7 @@
                 <w:sz w:val="17"/>
                 <w:szCs w:val="17"/>
               </w:rPr>
-              <w:t xml:space="preserve">2,450</w:t>
+              <w:t xml:space="preserve">2,517</w:t>
             </w:r>
           </w:p>
         </w:tc>
@@ -19596,7 +20017,7 @@
                 <w:sz w:val="17"/>
                 <w:szCs w:val="17"/>
               </w:rPr>
-              <w:t xml:space="preserve">1,664</w:t>
+              <w:t xml:space="preserve">1,700</w:t>
             </w:r>
           </w:p>
         </w:tc>
@@ -19928,7 +20349,7 @@
                 <w:sz w:val="17"/>
                 <w:szCs w:val="17"/>
               </w:rPr>
-              <w:t xml:space="preserve">24</w:t>
+              <w:t xml:space="preserve">23</w:t>
             </w:r>
           </w:p>
         </w:tc>
@@ -19960,7 +20381,7 @@
                 <w:sz w:val="17"/>
                 <w:szCs w:val="17"/>
               </w:rPr>
-              <w:t xml:space="preserve">332</w:t>
+              <w:t xml:space="preserve">323</w:t>
             </w:r>
           </w:p>
         </w:tc>
@@ -20024,7 +20445,7 @@
                 <w:sz w:val="17"/>
                 <w:szCs w:val="17"/>
               </w:rPr>
-              <w:t xml:space="preserve">58%</w:t>
+              <w:t xml:space="preserve">59%</w:t>
             </w:r>
           </w:p>
         </w:tc>
@@ -20126,7 +20547,7 @@
                 <w:sz w:val="17"/>
                 <w:szCs w:val="17"/>
               </w:rPr>
-              <w:t xml:space="preserve">18</w:t>
+              <w:t xml:space="preserve">17</w:t>
             </w:r>
           </w:p>
         </w:tc>
@@ -20158,7 +20579,7 @@
                 <w:sz w:val="17"/>
                 <w:szCs w:val="17"/>
               </w:rPr>
-              <w:t xml:space="preserve">436</w:t>
+              <w:t xml:space="preserve">418</w:t>
             </w:r>
           </w:p>
         </w:tc>
@@ -20222,7 +20643,7 @@
                 <w:sz w:val="17"/>
                 <w:szCs w:val="17"/>
               </w:rPr>
-              <w:t xml:space="preserve">47%</w:t>
+              <w:t xml:space="preserve">49%</w:t>
             </w:r>
           </w:p>
         </w:tc>
@@ -20360,7 +20781,7 @@
           <w:sz w:val="21"/>
           <w:szCs w:val="21"/>
         </w:rPr>
-        <w:t xml:space="preserve">The nine city neighbourhoods hold 8,459 permitted units across 149 schemes, 80% of the county total. The boundaries follow the Council’s grouping of 42 Electoral Divisions; King’s Island (coded 1a) is shown separately from the rest of the City Centre. Mungret, Patrickswell and the county towns fall outside the nine neighbourhoods and are reported as outside.</w:t>
+        <w:t xml:space="preserve">The nine city neighbourhoods hold 8,781 permitted units across 157 schemes, 81% of the county total. The boundaries follow the Council’s grouping of 42 Electoral Divisions; King’s Island (coded 1a) is shown separately from the rest of the City Centre. Mungret, Patrickswell and the county towns fall outside the nine neighbourhoods and are reported as outside.</w:t>
       </w:r>
     </w:p>
     <w:p>
@@ -20387,7 +20808,7 @@
       <w:r>
         <w:drawing>
           <wp:inline distT="0" distB="0" distL="0" distR="0">
-            <wp:extent cx="5760000" cy="3119404"/>
+            <wp:extent cx="5760000" cy="3121341"/>
             <wp:effectExtent t="0" r="0" b="0" l="0"/>
             <wp:docPr id="9" name="charts/c9_status_by_nbhd.png" descr="charts/c9_status_by_nbhd.png" title="charts/c9_status_by_nbhd.png"/>
             <wp:cNvGraphicFramePr>
@@ -20412,7 +20833,7 @@
                   <pic:spPr bwMode="auto">
                     <a:xfrm>
                       <a:off x="0" y="0"/>
-                      <a:ext cx="5760000" cy="3119404"/>
+                      <a:ext cx="5760000" cy="3121341"/>
                     </a:xfrm>
                     <a:prstGeom prst="rect">
                       <a:avLst/>
@@ -20814,7 +21235,7 @@
                 <w:sz w:val="15"/>
                 <w:szCs w:val="15"/>
               </w:rPr>
-              <w:t xml:space="preserve">38</w:t>
+              <w:t xml:space="preserve">40</w:t>
             </w:r>
           </w:p>
         </w:tc>
@@ -20878,7 +21299,7 @@
                 <w:sz w:val="15"/>
                 <w:szCs w:val="15"/>
               </w:rPr>
-              <w:t xml:space="preserve">103</w:t>
+              <w:t xml:space="preserve">127</w:t>
             </w:r>
           </w:p>
         </w:tc>
@@ -20910,7 +21331,7 @@
                 <w:sz w:val="15"/>
                 <w:szCs w:val="15"/>
               </w:rPr>
-              <w:t xml:space="preserve">672</w:t>
+              <w:t xml:space="preserve">715</w:t>
             </w:r>
           </w:p>
         </w:tc>
@@ -20974,7 +21395,7 @@
                 <w:sz w:val="15"/>
                 <w:szCs w:val="15"/>
               </w:rPr>
-              <w:t xml:space="preserve">913</w:t>
+              <w:t xml:space="preserve">980</w:t>
             </w:r>
           </w:p>
         </w:tc>
@@ -21006,7 +21427,7 @@
                 <w:sz w:val="15"/>
                 <w:szCs w:val="15"/>
               </w:rPr>
-              <w:t xml:space="preserve">48%</w:t>
+              <w:t xml:space="preserve">40%</w:t>
             </w:r>
           </w:p>
         </w:tc>
@@ -21338,7 +21759,7 @@
                 <w:sz w:val="15"/>
                 <w:szCs w:val="15"/>
               </w:rPr>
-              <w:t xml:space="preserve">3</w:t>
+              <w:t xml:space="preserve">4</w:t>
             </w:r>
           </w:p>
         </w:tc>
@@ -21434,7 +21855,7 @@
                 <w:sz w:val="15"/>
                 <w:szCs w:val="15"/>
               </w:rPr>
-              <w:t xml:space="preserve">25</w:t>
+              <w:t xml:space="preserve">40</w:t>
             </w:r>
           </w:p>
         </w:tc>
@@ -21498,7 +21919,7 @@
                 <w:sz w:val="15"/>
                 <w:szCs w:val="15"/>
               </w:rPr>
-              <w:t xml:space="preserve">75</w:t>
+              <w:t xml:space="preserve">90</w:t>
             </w:r>
           </w:p>
         </w:tc>
@@ -21600,7 +22021,7 @@
                 <w:sz w:val="15"/>
                 <w:szCs w:val="15"/>
               </w:rPr>
-              <w:t xml:space="preserve">14</w:t>
+              <w:t xml:space="preserve">16</w:t>
             </w:r>
           </w:p>
         </w:tc>
@@ -21664,7 +22085,7 @@
                 <w:sz w:val="15"/>
                 <w:szCs w:val="15"/>
               </w:rPr>
-              <w:t xml:space="preserve">115</w:t>
+              <w:t xml:space="preserve">146</w:t>
             </w:r>
           </w:p>
         </w:tc>
@@ -21696,7 +22117,7 @@
                 <w:sz w:val="15"/>
                 <w:szCs w:val="15"/>
               </w:rPr>
-              <w:t xml:space="preserve">102</w:t>
+              <w:t xml:space="preserve">132</w:t>
             </w:r>
           </w:p>
         </w:tc>
@@ -21760,7 +22181,7 @@
                 <w:sz w:val="15"/>
                 <w:szCs w:val="15"/>
               </w:rPr>
-              <w:t xml:space="preserve">243</w:t>
+              <w:t xml:space="preserve">304</w:t>
             </w:r>
           </w:p>
         </w:tc>
@@ -21792,7 +22213,7 @@
                 <w:sz w:val="15"/>
                 <w:szCs w:val="15"/>
               </w:rPr>
-              <w:t xml:space="preserve">24%</w:t>
+              <w:t xml:space="preserve">19%</w:t>
             </w:r>
           </w:p>
         </w:tc>
@@ -21862,7 +22283,7 @@
                 <w:sz w:val="15"/>
                 <w:szCs w:val="15"/>
               </w:rPr>
-              <w:t xml:space="preserve">31</w:t>
+              <w:t xml:space="preserve">32</w:t>
             </w:r>
           </w:p>
         </w:tc>
@@ -21926,7 +22347,7 @@
                 <w:sz w:val="15"/>
                 <w:szCs w:val="15"/>
               </w:rPr>
-              <w:t xml:space="preserve">624</w:t>
+              <w:t xml:space="preserve">746</w:t>
             </w:r>
           </w:p>
         </w:tc>
@@ -22022,7 +22443,7 @@
                 <w:sz w:val="15"/>
                 <w:szCs w:val="15"/>
               </w:rPr>
-              <w:t xml:space="preserve">2,837</w:t>
+              <w:t xml:space="preserve">2,959</w:t>
             </w:r>
           </w:p>
         </w:tc>
@@ -22386,7 +22807,7 @@
                 <w:sz w:val="15"/>
                 <w:szCs w:val="15"/>
               </w:rPr>
-              <w:t xml:space="preserve">19</w:t>
+              <w:t xml:space="preserve">22</w:t>
             </w:r>
           </w:p>
         </w:tc>
@@ -22450,7 +22871,7 @@
                 <w:sz w:val="15"/>
                 <w:szCs w:val="15"/>
               </w:rPr>
-              <w:t xml:space="preserve">737</w:t>
+              <w:t xml:space="preserve">749</w:t>
             </w:r>
           </w:p>
         </w:tc>
@@ -22482,7 +22903,7 @@
                 <w:sz w:val="15"/>
                 <w:szCs w:val="15"/>
               </w:rPr>
-              <w:t xml:space="preserve">1,022</w:t>
+              <w:t xml:space="preserve">1,073</w:t>
             </w:r>
           </w:p>
         </w:tc>
@@ -22546,7 +22967,7 @@
                 <w:sz w:val="15"/>
                 <w:szCs w:val="15"/>
               </w:rPr>
-              <w:t xml:space="preserve">1,857</w:t>
+              <w:t xml:space="preserve">1,920</w:t>
             </w:r>
           </w:p>
         </w:tc>
@@ -22578,7 +22999,7 @@
                 <w:sz w:val="15"/>
                 <w:szCs w:val="15"/>
               </w:rPr>
-              <w:t xml:space="preserve">15%</w:t>
+              <w:t xml:space="preserve">14%</w:t>
             </w:r>
           </w:p>
         </w:tc>
@@ -22910,7 +23331,7 @@
                 <w:sz w:val="15"/>
                 <w:szCs w:val="15"/>
               </w:rPr>
-              <w:t xml:space="preserve">25</w:t>
+              <w:t xml:space="preserve">24</w:t>
             </w:r>
           </w:p>
         </w:tc>
@@ -23006,7 +23427,7 @@
                 <w:sz w:val="15"/>
                 <w:szCs w:val="15"/>
               </w:rPr>
-              <w:t xml:space="preserve">613</w:t>
+              <w:t xml:space="preserve">607</w:t>
             </w:r>
           </w:p>
         </w:tc>
@@ -23070,7 +23491,7 @@
                 <w:sz w:val="15"/>
                 <w:szCs w:val="15"/>
               </w:rPr>
-              <w:t xml:space="preserve">1,316</w:t>
+              <w:t xml:space="preserve">1,310</w:t>
             </w:r>
           </w:p>
         </w:tc>
@@ -23102,7 +23523,7 @@
                 <w:sz w:val="15"/>
                 <w:szCs w:val="15"/>
               </w:rPr>
-              <w:t xml:space="preserve">20%</w:t>
+              <w:t xml:space="preserve">19%</w:t>
             </w:r>
           </w:p>
         </w:tc>
@@ -23172,7 +23593,7 @@
                 <w:sz w:val="15"/>
                 <w:szCs w:val="15"/>
               </w:rPr>
-              <w:t xml:space="preserve">94</w:t>
+              <w:t xml:space="preserve">92</w:t>
             </w:r>
           </w:p>
         </w:tc>
@@ -23268,7 +23689,7 @@
                 <w:sz w:val="15"/>
                 <w:szCs w:val="15"/>
               </w:rPr>
-              <w:t xml:space="preserve">923</w:t>
+              <w:t xml:space="preserve">896</w:t>
             </w:r>
           </w:p>
         </w:tc>
@@ -23332,7 +23753,7 @@
                 <w:sz w:val="15"/>
                 <w:szCs w:val="15"/>
               </w:rPr>
-              <w:t xml:space="preserve">2,063</w:t>
+              <w:t xml:space="preserve">2,036</w:t>
             </w:r>
           </w:p>
         </w:tc>
@@ -23364,7 +23785,7 @@
                 <w:sz w:val="15"/>
                 <w:szCs w:val="15"/>
               </w:rPr>
-              <w:t xml:space="preserve">22%</w:t>
+              <w:t xml:space="preserve">20%</w:t>
             </w:r>
           </w:p>
         </w:tc>
@@ -23401,7 +23822,7 @@
           <w:sz w:val="21"/>
           <w:szCs w:val="21"/>
         </w:rPr>
-        <w:t xml:space="preserve">Castletroy/Annacotty carries the largest volume, mostly large private permissions: 1,590 of its units have not yet started, almost all on permissions granted in 2025 and 2026. Dooradoyle is similar: 1,022 units not started, most on 2025–26 permissions. In Caherdavin, by contrast, the unstarted units are on older permissions.</w:t>
+        <w:t xml:space="preserve">Castletroy/Annacotty carries the largest volume, mostly large private permissions: 1,590 of its units have not yet started, almost all on permissions granted in 2025 and 2026. Dooradoyle is similar: 1,073 units not started, most on 2025–26 permissions. In Caherdavin, by contrast, the unstarted units are on older permissions.</w:t>
       </w:r>
     </w:p>
     <w:p>
@@ -23414,7 +23835,7 @@
           <w:sz w:val="21"/>
           <w:szCs w:val="21"/>
         </w:rPr>
-        <w:t xml:space="preserve">The City Centre is different. Apart from King’s Island (one older scheme, not started), it has the lowest start rate in the city on older permissions: 40% of 405 units. 727 of its 913 permitted units have not started. Its public share (48%) is driven by the LDA’s 285-unit Dock Road scheme. The other unstarted schemes are mostly small private apartment and mixed-use schemes, a median of 13 units, several of them conversions of existing buildings.</w:t>
+        <w:t xml:space="preserve">The City Centre is different. Apart from King’s Island (one older scheme, not started), it has the lowest start rate in the city on older permissions: 45% of 409 units. 770 of its 980 permitted units have not started. Its public share (40%) is driven by the LDA’s 285-unit Dock Road scheme. The other unstarted schemes are mostly small private apartment and mixed-use schemes, a median of 13 units, several of them conversions of existing buildings.</w:t>
       </w:r>
     </w:p>
     <w:tbl>
@@ -23750,7 +24171,7 @@
                 <w:sz w:val="17"/>
                 <w:szCs w:val="17"/>
               </w:rPr>
-              <w:t xml:space="preserve">405</w:t>
+              <w:t xml:space="preserve">409</w:t>
             </w:r>
           </w:p>
         </w:tc>
@@ -23782,7 +24203,7 @@
                 <w:sz w:val="17"/>
                 <w:szCs w:val="17"/>
               </w:rPr>
-              <w:t xml:space="preserve">160</w:t>
+              <w:t xml:space="preserve">184</w:t>
             </w:r>
           </w:p>
         </w:tc>
@@ -23814,7 +24235,7 @@
                 <w:sz w:val="17"/>
                 <w:szCs w:val="17"/>
               </w:rPr>
-              <w:t xml:space="preserve">40%</w:t>
+              <w:t xml:space="preserve">45%</w:t>
             </w:r>
           </w:p>
         </w:tc>
@@ -23846,7 +24267,7 @@
                 <w:sz w:val="17"/>
                 <w:szCs w:val="17"/>
               </w:rPr>
-              <w:t xml:space="preserve">1.5</w:t>
+              <w:t xml:space="preserve">1.6</w:t>
             </w:r>
           </w:p>
         </w:tc>
@@ -24510,7 +24931,7 @@
                 <w:sz w:val="17"/>
                 <w:szCs w:val="17"/>
               </w:rPr>
-              <w:t xml:space="preserve">23</w:t>
+              <w:t xml:space="preserve">24</w:t>
             </w:r>
           </w:p>
         </w:tc>
@@ -24542,7 +24963,7 @@
                 <w:sz w:val="17"/>
                 <w:szCs w:val="17"/>
               </w:rPr>
-              <w:t xml:space="preserve">1,241</w:t>
+              <w:t xml:space="preserve">1,363</w:t>
             </w:r>
           </w:p>
         </w:tc>
@@ -24574,7 +24995,7 @@
                 <w:sz w:val="17"/>
                 <w:szCs w:val="17"/>
               </w:rPr>
-              <w:t xml:space="preserve">1,092</w:t>
+              <w:t xml:space="preserve">1,214</w:t>
             </w:r>
           </w:p>
         </w:tc>
@@ -24606,7 +25027,7 @@
                 <w:sz w:val="17"/>
                 <w:szCs w:val="17"/>
               </w:rPr>
-              <w:t xml:space="preserve">88%</w:t>
+              <w:t xml:space="preserve">89%</w:t>
             </w:r>
           </w:p>
         </w:tc>
@@ -24638,7 +25059,7 @@
                 <w:sz w:val="17"/>
                 <w:szCs w:val="17"/>
               </w:rPr>
-              <w:t xml:space="preserve">1.7</w:t>
+              <w:t xml:space="preserve">1.5</w:t>
             </w:r>
           </w:p>
         </w:tc>
@@ -24906,7 +25327,7 @@
                 <w:sz w:val="17"/>
                 <w:szCs w:val="17"/>
               </w:rPr>
-              <w:t xml:space="preserve">13</w:t>
+              <w:t xml:space="preserve">16</w:t>
             </w:r>
           </w:p>
         </w:tc>
@@ -24938,7 +25359,7 @@
                 <w:sz w:val="17"/>
                 <w:szCs w:val="17"/>
               </w:rPr>
-              <w:t xml:space="preserve">1,219</w:t>
+              <w:t xml:space="preserve">1,282</w:t>
             </w:r>
           </w:p>
         </w:tc>
@@ -24970,7 +25391,7 @@
                 <w:sz w:val="17"/>
                 <w:szCs w:val="17"/>
               </w:rPr>
-              <w:t xml:space="preserve">835</w:t>
+              <w:t xml:space="preserve">847</w:t>
             </w:r>
           </w:p>
         </w:tc>
@@ -25002,7 +25423,7 @@
                 <w:sz w:val="17"/>
                 <w:szCs w:val="17"/>
               </w:rPr>
-              <w:t xml:space="preserve">68%</w:t>
+              <w:t xml:space="preserve">66%</w:t>
             </w:r>
           </w:p>
         </w:tc>
@@ -25034,7 +25455,7 @@
                 <w:sz w:val="17"/>
                 <w:szCs w:val="17"/>
               </w:rPr>
-              <w:t xml:space="preserve">0.7</w:t>
+              <w:t xml:space="preserve">0.8</w:t>
             </w:r>
           </w:p>
         </w:tc>
@@ -25500,7 +25921,7 @@
                 <w:sz w:val="17"/>
                 <w:szCs w:val="17"/>
               </w:rPr>
-              <w:t xml:space="preserve">72</w:t>
+              <w:t xml:space="preserve">70</w:t>
             </w:r>
           </w:p>
         </w:tc>
@@ -25532,7 +25953,7 @@
                 <w:sz w:val="17"/>
                 <w:szCs w:val="17"/>
               </w:rPr>
-              <w:t xml:space="preserve">1,503</w:t>
+              <w:t xml:space="preserve">1,476</w:t>
             </w:r>
           </w:p>
         </w:tc>
@@ -25596,7 +26017,7 @@
                 <w:sz w:val="17"/>
                 <w:szCs w:val="17"/>
               </w:rPr>
-              <w:t xml:space="preserve">57%</w:t>
+              <w:t xml:space="preserve">58%</w:t>
             </w:r>
           </w:p>
         </w:tc>
@@ -25778,7 +26199,7 @@
           <w:sz w:val="21"/>
           <w:szCs w:val="21"/>
         </w:rPr>
-        <w:t xml:space="preserve">About 847 units are past expiry or will expire within two years without starting. Contacting the owners of the larger schemes on the watchlist would establish which are likely to proceed, which need an extension, and which are unlikely to be built.</w:t>
+        <w:t xml:space="preserve">About 906 units are past expiry or will expire within two years without starting. Contacting the owners of the larger schemes on the watchlist would establish which are likely to proceed, which need an extension, and which are unlikely to be built.</w:t>
       </w:r>
     </w:p>
     <w:p>
@@ -25806,7 +26227,7 @@
           <w:sz w:val="21"/>
           <w:szCs w:val="21"/>
         </w:rPr>
-        <w:t xml:space="preserve">About 3,746 unstarted units sit on permissions less than two years old, mostly large schemes in Castletroy/Annacotty, Dooradoyle, the City Centre and Mungret. Roughly half of permissions start within two years, so a 12-month check on each is worthwhile.</w:t>
+        <w:t xml:space="preserve">About 3,848 unstarted units sit on permissions less than two years old, mostly large schemes in Castletroy/Annacotty, Dooradoyle, the City Centre and Mungret. Roughly half of permissions start within two years, so a 12-month check on each is worthwhile.</w:t>
       </w:r>
     </w:p>
     <w:p>
@@ -26146,7 +26567,7 @@
                 <w:sz w:val="17"/>
                 <w:szCs w:val="17"/>
               </w:rPr>
-              <w:t xml:space="preserve">262</w:t>
+              <w:t xml:space="preserve">266</w:t>
             </w:r>
           </w:p>
         </w:tc>
@@ -26216,7 +26637,7 @@
                 <w:sz w:val="17"/>
                 <w:szCs w:val="17"/>
               </w:rPr>
-              <w:t xml:space="preserve">245</w:t>
+              <w:t xml:space="preserve">251</w:t>
             </w:r>
           </w:p>
         </w:tc>
@@ -26286,7 +26707,7 @@
                 <w:sz w:val="17"/>
                 <w:szCs w:val="17"/>
               </w:rPr>
-              <w:t xml:space="preserve">127</w:t>
+              <w:t xml:space="preserve">131</w:t>
             </w:r>
           </w:p>
         </w:tc>
@@ -26706,7 +27127,7 @@
                 <w:sz w:val="17"/>
                 <w:szCs w:val="17"/>
               </w:rPr>
-              <w:t xml:space="preserve">63</w:t>
+              <w:t xml:space="preserve">57</w:t>
             </w:r>
           </w:p>
         </w:tc>
@@ -26916,7 +27337,7 @@
                 <w:sz w:val="17"/>
                 <w:szCs w:val="17"/>
               </w:rPr>
-              <w:t xml:space="preserve">84</w:t>
+              <w:t xml:space="preserve">78</w:t>
             </w:r>
           </w:p>
         </w:tc>
@@ -26986,7 +27407,7 @@
                 <w:sz w:val="17"/>
                 <w:szCs w:val="17"/>
               </w:rPr>
-              <w:t xml:space="preserve">1,880</w:t>
+              <w:t xml:space="preserve">1,768</w:t>
             </w:r>
           </w:p>
         </w:tc>
@@ -27323,7 +27744,7 @@
                 <w:sz w:val="17"/>
                 <w:szCs w:val="17"/>
               </w:rPr>
-              <w:t xml:space="preserve">56</w:t>
+              <w:t xml:space="preserve">55</w:t>
             </w:r>
           </w:p>
         </w:tc>
@@ -27355,7 +27776,7 @@
                 <w:sz w:val="17"/>
                 <w:szCs w:val="17"/>
               </w:rPr>
-              <w:t xml:space="preserve">306</w:t>
+              <w:t xml:space="preserve">297</w:t>
             </w:r>
           </w:p>
         </w:tc>
@@ -27419,7 +27840,7 @@
                 <w:sz w:val="17"/>
                 <w:szCs w:val="17"/>
               </w:rPr>
-              <w:t xml:space="preserve">71%</w:t>
+              <w:t xml:space="preserve">73%</w:t>
             </w:r>
           </w:p>
         </w:tc>
@@ -27521,7 +27942,7 @@
                 <w:sz w:val="17"/>
                 <w:szCs w:val="17"/>
               </w:rPr>
-              <w:t xml:space="preserve">50</w:t>
+              <w:t xml:space="preserve">51</w:t>
             </w:r>
           </w:p>
         </w:tc>
@@ -27553,7 +27974,7 @@
                 <w:sz w:val="17"/>
                 <w:szCs w:val="17"/>
               </w:rPr>
-              <w:t xml:space="preserve">814</w:t>
+              <w:t xml:space="preserve">840</w:t>
             </w:r>
           </w:p>
         </w:tc>
@@ -27585,7 +28006,7 @@
                 <w:sz w:val="17"/>
                 <w:szCs w:val="17"/>
               </w:rPr>
-              <w:t xml:space="preserve">494</w:t>
+              <w:t xml:space="preserve">530</w:t>
             </w:r>
           </w:p>
         </w:tc>
@@ -27617,7 +28038,7 @@
                 <w:sz w:val="17"/>
                 <w:szCs w:val="17"/>
               </w:rPr>
-              <w:t xml:space="preserve">61%</w:t>
+              <w:t xml:space="preserve">63%</w:t>
             </w:r>
           </w:p>
         </w:tc>
@@ -27719,7 +28140,7 @@
                 <w:sz w:val="17"/>
                 <w:szCs w:val="17"/>
               </w:rPr>
-              <w:t xml:space="preserve">32</w:t>
+              <w:t xml:space="preserve">33</w:t>
             </w:r>
           </w:p>
         </w:tc>
@@ -27751,7 +28172,7 @@
                 <w:sz w:val="17"/>
                 <w:szCs w:val="17"/>
               </w:rPr>
-              <w:t xml:space="preserve">1,100</w:t>
+              <w:t xml:space="preserve">1,123</w:t>
             </w:r>
           </w:p>
         </w:tc>
@@ -27815,7 +28236,7 @@
                 <w:sz w:val="17"/>
                 <w:szCs w:val="17"/>
               </w:rPr>
-              <w:t xml:space="preserve">59%</w:t>
+              <w:t xml:space="preserve">58%</w:t>
             </w:r>
           </w:p>
         </w:tc>
@@ -28115,7 +28536,7 @@
                 <w:sz w:val="17"/>
                 <w:szCs w:val="17"/>
               </w:rPr>
-              <w:t xml:space="preserve">11</w:t>
+              <w:t xml:space="preserve">12</w:t>
             </w:r>
           </w:p>
         </w:tc>
@@ -28147,7 +28568,7 @@
                 <w:sz w:val="17"/>
                 <w:szCs w:val="17"/>
               </w:rPr>
-              <w:t xml:space="preserve">2,128</w:t>
+              <w:t xml:space="preserve">2,250</w:t>
             </w:r>
           </w:p>
         </w:tc>
@@ -28179,7 +28600,7 @@
                 <w:sz w:val="17"/>
                 <w:szCs w:val="17"/>
               </w:rPr>
-              <w:t xml:space="preserve">1,442</w:t>
+              <w:t xml:space="preserve">1,564</w:t>
             </w:r>
           </w:p>
         </w:tc>
@@ -28211,7 +28632,7 @@
                 <w:sz w:val="17"/>
                 <w:szCs w:val="17"/>
               </w:rPr>
-              <w:t xml:space="preserve">68%</w:t>
+              <w:t xml:space="preserve">70%</w:t>
             </w:r>
           </w:p>
         </w:tc>
@@ -28243,7 +28664,7 @@
                 <w:sz w:val="17"/>
                 <w:szCs w:val="17"/>
               </w:rPr>
-              <w:t xml:space="preserve">1.7</w:t>
+              <w:t xml:space="preserve">1.6</w:t>
             </w:r>
           </w:p>
         </w:tc>

</xml_diff>

<commit_message>
Match building control notices citing ABP case numbers without prefix
Commencement notices written as 22-313124 or 313124-22 were not linked to
the SHD; Raheen (ABP-313124-22, 384 units) is under construction since
April 2024, not unstarted. Report and GeoPackage regenerated.

Co-Authored-By: Claude Opus 5.5 <noreply@anthropic.com>
Claude-Session: https://claude.ai/code/session_01NzU6RZjdYh3MCXCEtKHHfb
</commit_message>
<xml_diff>
--- a/limerick_pipeline/delivery_study/Limerick_Residential_Delivery_Study.docx
+++ b/limerick_pipeline/delivery_study/Limerick_Residential_Delivery_Study.docx
@@ -158,7 +158,7 @@
           <w:sz w:val="21"/>
           <w:szCs w:val="21"/>
         </w:rPr>
-        <w:t xml:space="preserve">47% of permitted schemes had started within two years of permission and 72% within five years. For schemes that have started, the median gap between permission and start is 1.3 years.</w:t>
+        <w:t xml:space="preserve">48% of permitted schemes had started within two years of permission and 72% within five years. For schemes that have started, the median gap between permission and start is 1.3 years.</w:t>
       </w:r>
     </w:p>
     <w:p>
@@ -204,7 +204,7 @@
           <w:sz w:val="21"/>
           <w:szCs w:val="21"/>
         </w:rPr>
-        <w:t xml:space="preserve">Public schemes (78 schemes, 1,768 units, 16% of units) have a median approval period of 0.3 years against 0.7 for private schemes. After permission, 43% of public schemes had started within two years against 49% of private schemes. Over the longer run the gap narrows: on permissions at least two years old, 81% of public units and 68% of private units have started.</w:t>
+        <w:t xml:space="preserve">Public schemes (78 schemes, 1,768 units, 16% of units) have a median approval period of 0.3 years against 0.7 for private schemes. After permission, 43% of public schemes had started within two years against 50% of private schemes. Over the longer run the gap narrows: on permissions at least two years old, 81% of public units and 75% of private units have started.</w:t>
       </w:r>
     </w:p>
     <w:p>
@@ -219,7 +219,7 @@
           <w:sz w:val="21"/>
           <w:szCs w:val="21"/>
         </w:rPr>
-        <w:t xml:space="preserve">5,862 permitted units have not started. </w:t>
+        <w:t xml:space="preserve">5,478 permitted units have not started. </w:t>
       </w:r>
       <w:r>
         <w:rPr>
@@ -227,7 +227,7 @@
           <w:sz w:val="21"/>
           <w:szCs w:val="21"/>
         </w:rPr>
-        <w:t xml:space="preserve">Most sit on recent permissions: 4,200 units have more than three years left to run. The near-term risk is 906 units: 311 already past expiry and 595 expiring within two years.</w:t>
+        <w:t xml:space="preserve">Most sit on recent permissions: 3,816 units have more than three years left to run. The near-term risk is 906 units: 311 already past expiry and 595 expiring within two years.</w:t>
       </w:r>
     </w:p>
     <w:p>
@@ -691,7 +691,7 @@
                 <w:sz w:val="17"/>
                 <w:szCs w:val="17"/>
               </w:rPr>
-              <w:t xml:space="preserve">135 schemes with a measured start</w:t>
+              <w:t xml:space="preserve">136 schemes with a measured start</w:t>
             </w:r>
           </w:p>
         </w:tc>
@@ -2383,7 +2383,7 @@
                 <w:sz w:val="17"/>
                 <w:szCs w:val="17"/>
               </w:rPr>
-              <w:t xml:space="preserve">1.6 (n=9)</w:t>
+              <w:t xml:space="preserve">1.7 (n=10)</w:t>
             </w:r>
           </w:p>
         </w:tc>
@@ -2549,7 +2549,7 @@
                 <w:sz w:val="17"/>
                 <w:szCs w:val="17"/>
               </w:rPr>
-              <w:t xml:space="preserve">1.3 (n=135)</w:t>
+              <w:t xml:space="preserve">1.3 (n=136)</w:t>
             </w:r>
           </w:p>
         </w:tc>
@@ -3475,7 +3475,7 @@
           <w:sz w:val="21"/>
           <w:szCs w:val="21"/>
         </w:rPr>
-        <w:t xml:space="preserve">About a quarter of schemes start within a year of permission and 47% within two years. By five years, 72% have started. Schemes of 25–99 units have the highest start rate by five years (84%); schemes of 1–24 units reach 68%. The 100+ band has too few older permissions to measure beyond four years.</w:t>
+        <w:t xml:space="preserve">About a quarter of schemes start within a year of permission and 48% within two years. By five years, 72% have started. Schemes of 25–99 units have the highest start rate by five years (84%); schemes of 1–24 units reach 68%. The 100+ band has too few older permissions to measure beyond four years.</w:t>
       </w:r>
     </w:p>
     <w:tbl>
@@ -4207,7 +4207,7 @@
                 <w:sz w:val="17"/>
                 <w:szCs w:val="17"/>
               </w:rPr>
-              <w:t xml:space="preserve">58% (12)</w:t>
+              <w:t xml:space="preserve">67% (12)</w:t>
             </w:r>
           </w:p>
         </w:tc>
@@ -4239,7 +4239,7 @@
                 <w:sz w:val="17"/>
                 <w:szCs w:val="17"/>
               </w:rPr>
-              <w:t xml:space="preserve">56% (9)</w:t>
+              <w:t xml:space="preserve">67% (9)</w:t>
             </w:r>
           </w:p>
         </w:tc>
@@ -4271,7 +4271,7 @@
                 <w:sz w:val="17"/>
                 <w:szCs w:val="17"/>
               </w:rPr>
-              <w:t xml:space="preserve">50% (8)</w:t>
+              <w:t xml:space="preserve">62% (8)</w:t>
             </w:r>
           </w:p>
         </w:tc>
@@ -4405,7 +4405,7 @@
                 <w:sz w:val="17"/>
                 <w:szCs w:val="17"/>
               </w:rPr>
-              <w:t xml:space="preserve">47% (182)</w:t>
+              <w:t xml:space="preserve">48% (182)</w:t>
             </w:r>
           </w:p>
         </w:tc>
@@ -4469,7 +4469,7 @@
                 <w:sz w:val="17"/>
                 <w:szCs w:val="17"/>
               </w:rPr>
-              <w:t xml:space="preserve">65% (119)</w:t>
+              <w:t xml:space="preserve">66% (119)</w:t>
             </w:r>
           </w:p>
         </w:tc>
@@ -5211,7 +5211,7 @@
                 <w:sz w:val="17"/>
                 <w:szCs w:val="17"/>
               </w:rPr>
-              <w:t xml:space="preserve">1 (n=99)</w:t>
+              <w:t xml:space="preserve">1 (n=100)</w:t>
             </w:r>
           </w:p>
         </w:tc>
@@ -5312,7 +5312,7 @@
           <w:sz w:val="21"/>
           <w:szCs w:val="21"/>
         </w:rPr>
-        <w:t xml:space="preserve">Public schemes get through planning faster, mainly because Part 8 approvals are not subject to further information requests or appeal. They are slower to start: 43% had started within two years of approval, against 49% of private schemes. In our experience, public schemes usually go to tender and seek funding approval after planning, which adds time before a contractor is on site.</w:t>
+        <w:t xml:space="preserve">Public schemes get through planning faster, mainly because Part 8 approvals are not subject to further information requests or appeal. They are slower to start: 43% had started within two years of approval, against 50% of private schemes. In our experience, public schemes usually go to tender and seek funding approval after planning, which adds time before a contractor is on site.</w:t>
       </w:r>
     </w:p>
     <w:p>
@@ -5924,7 +5924,7 @@
                 <w:sz w:val="17"/>
                 <w:szCs w:val="17"/>
               </w:rPr>
-              <w:t xml:space="preserve">49% (131)</w:t>
+              <w:t xml:space="preserve">50% (131)</w:t>
             </w:r>
           </w:p>
         </w:tc>
@@ -5956,7 +5956,7 @@
                 <w:sz w:val="17"/>
                 <w:szCs w:val="17"/>
               </w:rPr>
-              <w:t xml:space="preserve">57% (99)</w:t>
+              <w:t xml:space="preserve">58% (99)</w:t>
             </w:r>
           </w:p>
         </w:tc>
@@ -5988,7 +5988,7 @@
                 <w:sz w:val="17"/>
                 <w:szCs w:val="17"/>
               </w:rPr>
-              <w:t xml:space="preserve">64% (83)</w:t>
+              <w:t xml:space="preserve">65% (83)</w:t>
             </w:r>
           </w:p>
         </w:tc>
@@ -6057,7 +6057,7 @@
           <w:sz w:val="21"/>
           <w:szCs w:val="21"/>
         </w:rPr>
-        <w:t xml:space="preserve">Measured by units rather than schemes, public delivery holds up: on permissions at least two years old, 81% of public units have started against 68% of private units. The difference reflects a larger number of small public schemes that have not started alongside larger public schemes that have.</w:t>
+        <w:t xml:space="preserve">Measured by units rather than schemes, public delivery holds up: on permissions at least two years old, 81% of public units have started against 75% of private units. The difference reflects a larger number of small public schemes that have not started alongside larger public schemes that have.</w:t>
       </w:r>
     </w:p>
     <w:tbl>
@@ -6821,7 +6821,7 @@
                 <w:sz w:val="17"/>
                 <w:szCs w:val="17"/>
               </w:rPr>
-              <w:t xml:space="preserve">3,689</w:t>
+              <w:t xml:space="preserve">4,073</w:t>
             </w:r>
           </w:p>
         </w:tc>
@@ -6853,7 +6853,7 @@
                 <w:sz w:val="17"/>
                 <w:szCs w:val="17"/>
               </w:rPr>
-              <w:t xml:space="preserve">68%</w:t>
+              <w:t xml:space="preserve">75%</w:t>
             </w:r>
           </w:p>
         </w:tc>
@@ -6885,7 +6885,7 @@
                 <w:sz w:val="17"/>
                 <w:szCs w:val="17"/>
               </w:rPr>
-              <w:t xml:space="preserve">1.1</w:t>
+              <w:t xml:space="preserve">1.2</w:t>
             </w:r>
           </w:p>
         </w:tc>
@@ -8823,7 +8823,7 @@
           <w:sz w:val="21"/>
           <w:szCs w:val="21"/>
         </w:rPr>
-        <w:t xml:space="preserve">Permissions have run ahead of starts in most years. In the first nine months of 2026, 2,795 units were granted, including several large LRD schemes in Castletroy, Mungret, Singland and Dock Road. Starts peaked in 2024 at 1,223 units. Completions are low relative to starts because most recently started schemes are still under construction.</w:t>
+        <w:t xml:space="preserve">Permissions have run ahead of starts in most years. In the first nine months of 2026, 2,795 units were granted, including several large LRD schemes in Castletroy, Mungret, Singland and Dock Road. Starts peaked in 2024 at 1,607 units. Completions are low relative to starts because most recently started schemes are still under construction.</w:t>
       </w:r>
     </w:p>
     <w:p>
@@ -9044,7 +9044,7 @@
                 <w:sz w:val="17"/>
                 <w:szCs w:val="17"/>
               </w:rPr>
-              <w:t xml:space="preserve">95</w:t>
+              <w:t xml:space="preserve">94</w:t>
             </w:r>
           </w:p>
         </w:tc>
@@ -9076,7 +9076,7 @@
                 <w:sz w:val="17"/>
                 <w:szCs w:val="17"/>
               </w:rPr>
-              <w:t xml:space="preserve">5,551</w:t>
+              <w:t xml:space="preserve">5,167</w:t>
             </w:r>
           </w:p>
         </w:tc>
@@ -10145,7 +10145,7 @@
           <w:sz w:val="21"/>
           <w:szCs w:val="21"/>
         </w:rPr>
-        <w:t xml:space="preserve">The tables below cover permissions granted at least two years before September 2026 (182 schemes, 6,619 units), so every scheme has had time to start. 70% of those units have started.</w:t>
+        <w:t xml:space="preserve">The tables below cover permissions granted at least two years before September 2026 (182 schemes, 6,619 units), so every scheme has had time to start. 76% of those units have started.</w:t>
       </w:r>
     </w:p>
     <w:tbl>
@@ -10909,7 +10909,7 @@
                 <w:sz w:val="17"/>
                 <w:szCs w:val="17"/>
               </w:rPr>
-              <w:t xml:space="preserve">571</w:t>
+              <w:t xml:space="preserve">955</w:t>
             </w:r>
           </w:p>
         </w:tc>
@@ -10941,7 +10941,7 @@
                 <w:sz w:val="17"/>
                 <w:szCs w:val="17"/>
               </w:rPr>
-              <w:t xml:space="preserve">44%</w:t>
+              <w:t xml:space="preserve">74%</w:t>
             </w:r>
           </w:p>
         </w:tc>
@@ -10973,7 +10973,7 @@
                 <w:sz w:val="17"/>
                 <w:szCs w:val="17"/>
               </w:rPr>
-              <w:t xml:space="preserve">1.6</w:t>
+              <w:t xml:space="preserve">1.8</w:t>
             </w:r>
           </w:p>
         </w:tc>
@@ -11208,7 +11208,7 @@
           <w:sz w:val="21"/>
           <w:szCs w:val="21"/>
         </w:rPr>
-        <w:t xml:space="preserve">Standard planning applications and Part 8 schemes start at similar rates by units (74% and 80%). Two of the six SHD permissions have started, accounting for 44% of their 1,287 units. Among the four not started, the largest are Raheen (384 units, CIS: commencement expected), Clonmacken Gardens (165 units) and Annacotty (137 units, now past expiry).</w:t>
+        <w:t xml:space="preserve">Standard planning applications and Part 8 schemes start at similar rates by units (74% and 80%). Three of the six SHD permissions have started, accounting for 74% of their 1,287 units. The three not started are Clonmacken Gardens (165 units), Annacotty (137 units, now past expiry, with a fresh application for the site lodged) and Punches Cross student accommodation (30 units).</w:t>
       </w:r>
     </w:p>
     <w:tbl>
@@ -11774,7 +11774,7 @@
                 <w:sz w:val="17"/>
                 <w:szCs w:val="17"/>
               </w:rPr>
-              <w:t xml:space="preserve">2,004</w:t>
+              <w:t xml:space="preserve">2,388</w:t>
             </w:r>
           </w:p>
         </w:tc>
@@ -11806,7 +11806,7 @@
                 <w:sz w:val="17"/>
                 <w:szCs w:val="17"/>
               </w:rPr>
-              <w:t xml:space="preserve">70%</w:t>
+              <w:t xml:space="preserve">83%</w:t>
             </w:r>
           </w:p>
         </w:tc>
@@ -11838,7 +11838,7 @@
                 <w:sz w:val="17"/>
                 <w:szCs w:val="17"/>
               </w:rPr>
-              <w:t xml:space="preserve">1.5</w:t>
+              <w:t xml:space="preserve">1.6</w:t>
             </w:r>
           </w:p>
         </w:tc>
@@ -12508,7 +12508,7 @@
       <w:r>
         <w:drawing>
           <wp:inline distT="0" distB="0" distL="0" distR="0">
-            <wp:extent cx="5220000" cy="2397512"/>
+            <wp:extent cx="5220000" cy="2437604"/>
             <wp:effectExtent t="0" r="0" b="0" l="0"/>
             <wp:docPr id="6" name="charts/c5_expiry_profile.png" descr="charts/c5_expiry_profile.png" title="charts/c5_expiry_profile.png"/>
             <wp:cNvGraphicFramePr>
@@ -12533,7 +12533,7 @@
                   <pic:spPr bwMode="auto">
                     <a:xfrm>
                       <a:off x="0" y="0"/>
-                      <a:ext cx="5220000" cy="2397512"/>
+                      <a:ext cx="5220000" cy="2437604"/>
                     </a:xfrm>
                     <a:prstGeom prst="rect">
                       <a:avLst/>
@@ -12572,7 +12572,7 @@
           <w:sz w:val="21"/>
           <w:szCs w:val="21"/>
         </w:rPr>
-        <w:t xml:space="preserve">Of the 5,862 permitted units not started, 4,200 have more than three years left on their permission. The near-term pipeline at risk is smaller: 311 units are already past expiry, 360 expire within 12 months and 235 within 12 to 24 months.</w:t>
+        <w:t xml:space="preserve">Of the 5,478 permitted units not started, 3,816 have more than three years left on their permission. The near-term pipeline at risk is smaller: 311 units are already past expiry, 360 expire within 12 months and 235 within 12 to 24 months.</w:t>
       </w:r>
     </w:p>
     <w:tbl>
@@ -14160,7 +14160,7 @@
                 <w:sz w:val="15"/>
                 <w:szCs w:val="15"/>
               </w:rPr>
-              <w:t xml:space="preserve">43</w:t>
+              <w:t xml:space="preserve">42</w:t>
             </w:r>
           </w:p>
         </w:tc>
@@ -14320,7 +14320,7 @@
                 <w:sz w:val="15"/>
                 <w:szCs w:val="15"/>
               </w:rPr>
-              <w:t xml:space="preserve">1,641</w:t>
+              <w:t xml:space="preserve">1,257</w:t>
             </w:r>
           </w:p>
         </w:tc>
@@ -14384,7 +14384,7 @@
                 <w:sz w:val="15"/>
                 <w:szCs w:val="15"/>
               </w:rPr>
-              <w:t xml:space="preserve">4,200</w:t>
+              <w:t xml:space="preserve">3,816</w:t>
             </w:r>
           </w:p>
         </w:tc>
@@ -19253,7 +19253,7 @@
           <w:sz w:val="21"/>
           <w:szCs w:val="21"/>
         </w:rPr>
-        <w:t xml:space="preserve">Among older permissions, Limerick City East has the highest start rate (91% of units), followed by City West (68%) and City North (62%). The county LEAs have smaller volumes and lower start rates: 31 of 165 units in Adare-Rathkeale and 206 of 418 in Newcastle West. Of the unstarted units in City East, 93% are on permissions granted since January 2025.</w:t>
+        <w:t xml:space="preserve">Among older permissions, Limerick City East has the highest start rate (91% of units), followed by City West (83%) and City North (62%). The county LEAs have smaller volumes and lower start rates: 31 of 165 units in Adare-Rathkeale and 206 of 418 in Newcastle West. Of the unstarted units in City East, 93% are on permissions granted since January 2025.</w:t>
       </w:r>
     </w:p>
     <w:tbl>
@@ -20017,7 +20017,7 @@
                 <w:sz w:val="17"/>
                 <w:szCs w:val="17"/>
               </w:rPr>
-              <w:t xml:space="preserve">1,700</w:t>
+              <w:t xml:space="preserve">2,084</w:t>
             </w:r>
           </w:p>
         </w:tc>
@@ -20049,7 +20049,7 @@
                 <w:sz w:val="17"/>
                 <w:szCs w:val="17"/>
               </w:rPr>
-              <w:t xml:space="preserve">68%</w:t>
+              <w:t xml:space="preserve">83%</w:t>
             </w:r>
           </w:p>
         </w:tc>
@@ -22871,7 +22871,7 @@
                 <w:sz w:val="15"/>
                 <w:szCs w:val="15"/>
               </w:rPr>
-              <w:t xml:space="preserve">749</w:t>
+              <w:t xml:space="preserve">1,133</w:t>
             </w:r>
           </w:p>
         </w:tc>
@@ -22903,7 +22903,7 @@
                 <w:sz w:val="15"/>
                 <w:szCs w:val="15"/>
               </w:rPr>
-              <w:t xml:space="preserve">1,073</w:t>
+              <w:t xml:space="preserve">689</w:t>
             </w:r>
           </w:p>
         </w:tc>
@@ -23822,7 +23822,7 @@
           <w:sz w:val="21"/>
           <w:szCs w:val="21"/>
         </w:rPr>
-        <w:t xml:space="preserve">Castletroy/Annacotty carries the largest volume, mostly large private permissions: 1,590 of its units have not yet started, almost all on permissions granted in 2025 and 2026. Dooradoyle is similar: 1,073 units not started, most on 2025–26 permissions. In Caherdavin, by contrast, the unstarted units are on older permissions.</w:t>
+        <w:t xml:space="preserve">Castletroy/Annacotty carries the largest volume, mostly large private permissions: 1,590 of its units have not yet started, almost all on permissions granted in 2025 and 2026. Dooradoyle is similar: 689 units not started, most on 2025–26 permissions. In Caherdavin, by contrast, the unstarted units are on older permissions.</w:t>
       </w:r>
     </w:p>
     <w:p>
@@ -25391,7 +25391,7 @@
                 <w:sz w:val="17"/>
                 <w:szCs w:val="17"/>
               </w:rPr>
-              <w:t xml:space="preserve">847</w:t>
+              <w:t xml:space="preserve">1,231</w:t>
             </w:r>
           </w:p>
         </w:tc>
@@ -25423,7 +25423,7 @@
                 <w:sz w:val="17"/>
                 <w:szCs w:val="17"/>
               </w:rPr>
-              <w:t xml:space="preserve">66%</w:t>
+              <w:t xml:space="preserve">96%</w:t>
             </w:r>
           </w:p>
         </w:tc>
@@ -26707,7 +26707,7 @@
                 <w:sz w:val="17"/>
                 <w:szCs w:val="17"/>
               </w:rPr>
-              <w:t xml:space="preserve">131</w:t>
+              <w:t xml:space="preserve">132</w:t>
             </w:r>
           </w:p>
         </w:tc>
@@ -28600,7 +28600,7 @@
                 <w:sz w:val="17"/>
                 <w:szCs w:val="17"/>
               </w:rPr>
-              <w:t xml:space="preserve">1,564</w:t>
+              <w:t xml:space="preserve">1,948</w:t>
             </w:r>
           </w:p>
         </w:tc>
@@ -28632,7 +28632,7 @@
                 <w:sz w:val="17"/>
                 <w:szCs w:val="17"/>
               </w:rPr>
-              <w:t xml:space="preserve">70%</w:t>
+              <w:t xml:space="preserve">87%</w:t>
             </w:r>
           </w:p>
         </w:tc>
@@ -28664,7 +28664,7 @@
                 <w:sz w:val="17"/>
                 <w:szCs w:val="17"/>
               </w:rPr>
-              <w:t xml:space="preserve">1.6</w:t>
+              <w:t xml:space="preserve">1.7</w:t>
             </w:r>
           </w:p>
         </w:tc>

</xml_diff>

<commit_message>
Use planning register locations; treat quashed permissions as not live
- Scheme points now come from the planning register (SHDs via their council
  register copy), then the KPMG site boundary, then CIS. All 70 KPMG-matched
  schemes now fall inside their KPMG polygon; Raheen was 2.2 km out.
- An Bord Pleanala case history is read for quashed decisions: Punches Cross
  (ABP-315273-22) was quashed by the High Court in Dec 2023 and is no longer
  counted.

Co-Authored-By: Claude Opus 5.5 <noreply@anthropic.com>
Claude-Session: https://claude.ai/code/session_01NzU6RZjdYh3MCXCEtKHHfb
</commit_message>
<xml_diff>
--- a/limerick_pipeline/delivery_study/Limerick_Residential_Delivery_Study.docx
+++ b/limerick_pipeline/delivery_study/Limerick_Residential_Delivery_Study.docx
@@ -112,7 +112,7 @@
           <w:sz w:val="21"/>
           <w:szCs w:val="21"/>
         </w:rPr>
-        <w:t xml:space="preserve">This study tracks 251 permitted residential schemes in County Limerick, totalling 10,817 units, from planning application to completion. It joins the national planning applications register, building control commencement notices and CIS project records at scheme level, and classifies each scheme as public (local authority, approved housing body or Land Development Agency) or private. The aim is to show how quickly permitted housing gets built, where it stalls, and which permissions are close to expiry.</w:t>
+        <w:t xml:space="preserve">This study tracks 250 permitted residential schemes in County Limerick, totalling 10,787 units, from planning application to completion. It joins the national planning applications register, building control commencement notices and CIS project records at scheme level, and classifies each scheme as public (local authority, approved housing body or Land Development Agency) or private. The aim is to show how quickly permitted housing gets built, where it stalls, and which permissions are close to expiry.</w:t>
       </w:r>
     </w:p>
     <w:p>
@@ -219,7 +219,7 @@
           <w:sz w:val="21"/>
           <w:szCs w:val="21"/>
         </w:rPr>
-        <w:t xml:space="preserve">5,478 permitted units have not started. </w:t>
+        <w:t xml:space="preserve">5,448 permitted units have not started. </w:t>
       </w:r>
       <w:r>
         <w:rPr>
@@ -227,7 +227,7 @@
           <w:sz w:val="21"/>
           <w:szCs w:val="21"/>
         </w:rPr>
-        <w:t xml:space="preserve">Most sit on recent permissions: 3,816 units have more than three years left to run. The near-term risk is 906 units: 311 already past expiry and 595 expiring within two years.</w:t>
+        <w:t xml:space="preserve">Most sit on recent permissions: 3,816 units have more than three years left to run. The near-term risk is 876 units: 311 already past expiry and 565 expiring within two years.</w:t>
       </w:r>
     </w:p>
     <w:p>
@@ -2019,7 +2019,7 @@
                 <w:sz w:val="17"/>
                 <w:szCs w:val="17"/>
               </w:rPr>
-              <w:t xml:space="preserve">0.6 (n=48)</w:t>
+              <w:t xml:space="preserve">0.6 (n=47)</w:t>
             </w:r>
           </w:p>
         </w:tc>
@@ -2517,7 +2517,7 @@
                 <w:sz w:val="17"/>
                 <w:szCs w:val="17"/>
               </w:rPr>
-              <w:t xml:space="preserve">0.6 (n=240)</w:t>
+              <w:t xml:space="preserve">0.6 (n=239)</w:t>
             </w:r>
           </w:p>
         </w:tc>
@@ -3977,7 +3977,7 @@
                 <w:sz w:val="17"/>
                 <w:szCs w:val="17"/>
               </w:rPr>
-              <w:t xml:space="preserve">22% (73)</w:t>
+              <w:t xml:space="preserve">22% (72)</w:t>
             </w:r>
           </w:p>
         </w:tc>
@@ -4009,7 +4009,7 @@
                 <w:sz w:val="17"/>
                 <w:szCs w:val="17"/>
               </w:rPr>
-              <w:t xml:space="preserve">46% (61)</w:t>
+              <w:t xml:space="preserve">47% (60)</w:t>
             </w:r>
           </w:p>
         </w:tc>
@@ -4041,7 +4041,7 @@
                 <w:sz w:val="17"/>
                 <w:szCs w:val="17"/>
               </w:rPr>
-              <w:t xml:space="preserve">63% (49)</w:t>
+              <w:t xml:space="preserve">65% (48)</w:t>
             </w:r>
           </w:p>
         </w:tc>
@@ -4373,7 +4373,7 @@
                 <w:sz w:val="17"/>
                 <w:szCs w:val="17"/>
               </w:rPr>
-              <w:t xml:space="preserve">25% (208)</w:t>
+              <w:t xml:space="preserve">25% (207)</w:t>
             </w:r>
           </w:p>
         </w:tc>
@@ -4405,7 +4405,7 @@
                 <w:sz w:val="17"/>
                 <w:szCs w:val="17"/>
               </w:rPr>
-              <w:t xml:space="preserve">48% (182)</w:t>
+              <w:t xml:space="preserve">48% (181)</w:t>
             </w:r>
           </w:p>
         </w:tc>
@@ -4437,7 +4437,7 @@
                 <w:sz w:val="17"/>
                 <w:szCs w:val="17"/>
               </w:rPr>
-              <w:t xml:space="preserve">57% (143)</w:t>
+              <w:t xml:space="preserve">58% (142)</w:t>
             </w:r>
           </w:p>
         </w:tc>
@@ -4545,7 +4545,7 @@
           <w:sz w:val="21"/>
           <w:szCs w:val="21"/>
         </w:rPr>
-        <w:t xml:space="preserve">Public schemes account for 78 of the 266 schemes and 1,768 units (16%). Most are local authority schemes (61 schemes, 1,144 units), followed by approved housing bodies (16 schemes, 339 units). The Land Development Agency has one scheme in the sample: the former Limerick Gasworks site on Dock Road (25/60780, 285 units), granted in February 2026 and at tender stage.</w:t>
+        <w:t xml:space="preserve">Public schemes account for 78 of the 265 schemes and 1,768 units (16%). Most are local authority schemes (61 schemes, 1,144 units), followed by approved housing bodies (16 schemes, 339 units). The Land Development Agency has one scheme in the sample: the former Limerick Gasworks site on Dock Road (25/60780, 285 units), granted in February 2026 and at tender stage.</w:t>
       </w:r>
     </w:p>
     <w:tbl>
@@ -5115,7 +5115,7 @@
                 <w:sz w:val="17"/>
                 <w:szCs w:val="17"/>
               </w:rPr>
-              <w:t xml:space="preserve">188</w:t>
+              <w:t xml:space="preserve">187</w:t>
             </w:r>
           </w:p>
         </w:tc>
@@ -5147,7 +5147,7 @@
                 <w:sz w:val="17"/>
                 <w:szCs w:val="17"/>
               </w:rPr>
-              <w:t xml:space="preserve">9,312</w:t>
+              <w:t xml:space="preserve">9,282</w:t>
             </w:r>
           </w:p>
         </w:tc>
@@ -5892,7 +5892,7 @@
                 <w:sz w:val="17"/>
                 <w:szCs w:val="17"/>
               </w:rPr>
-              <w:t xml:space="preserve">31% (154)</w:t>
+              <w:t xml:space="preserve">31% (153)</w:t>
             </w:r>
           </w:p>
         </w:tc>
@@ -5924,7 +5924,7 @@
                 <w:sz w:val="17"/>
                 <w:szCs w:val="17"/>
               </w:rPr>
-              <w:t xml:space="preserve">50% (131)</w:t>
+              <w:t xml:space="preserve">50% (130)</w:t>
             </w:r>
           </w:p>
         </w:tc>
@@ -5956,7 +5956,7 @@
                 <w:sz w:val="17"/>
                 <w:szCs w:val="17"/>
               </w:rPr>
-              <w:t xml:space="preserve">58% (99)</w:t>
+              <w:t xml:space="preserve">58% (98)</w:t>
             </w:r>
           </w:p>
         </w:tc>
@@ -6757,7 +6757,7 @@
                 <w:sz w:val="17"/>
                 <w:szCs w:val="17"/>
               </w:rPr>
-              <w:t xml:space="preserve">131</w:t>
+              <w:t xml:space="preserve">130</w:t>
             </w:r>
           </w:p>
         </w:tc>
@@ -6789,7 +6789,7 @@
                 <w:sz w:val="17"/>
                 <w:szCs w:val="17"/>
               </w:rPr>
-              <w:t xml:space="preserve">5,444</w:t>
+              <w:t xml:space="preserve">5,414</w:t>
             </w:r>
           </w:p>
         </w:tc>
@@ -9044,7 +9044,7 @@
                 <w:sz w:val="17"/>
                 <w:szCs w:val="17"/>
               </w:rPr>
-              <w:t xml:space="preserve">94</w:t>
+              <w:t xml:space="preserve">93</w:t>
             </w:r>
           </w:p>
         </w:tc>
@@ -9076,7 +9076,7 @@
                 <w:sz w:val="17"/>
                 <w:szCs w:val="17"/>
               </w:rPr>
-              <w:t xml:space="preserve">5,167</w:t>
+              <w:t xml:space="preserve">5,137</w:t>
             </w:r>
           </w:p>
         </w:tc>
@@ -9452,7 +9452,7 @@
                 <w:sz w:val="17"/>
                 <w:szCs w:val="17"/>
               </w:rPr>
-              <w:t xml:space="preserve">1</w:t>
+              <w:t xml:space="preserve">0</w:t>
             </w:r>
           </w:p>
         </w:tc>
@@ -9484,7 +9484,7 @@
                 <w:sz w:val="17"/>
                 <w:szCs w:val="17"/>
               </w:rPr>
-              <w:t xml:space="preserve">30</w:t>
+              <w:t xml:space="preserve">0</w:t>
             </w:r>
           </w:p>
         </w:tc>
@@ -9860,7 +9860,7 @@
                 <w:sz w:val="17"/>
                 <w:szCs w:val="17"/>
               </w:rPr>
-              <w:t xml:space="preserve">13</w:t>
+              <w:t xml:space="preserve">14</w:t>
             </w:r>
           </w:p>
         </w:tc>
@@ -9892,7 +9892,7 @@
                 <w:sz w:val="17"/>
                 <w:szCs w:val="17"/>
               </w:rPr>
-              <w:t xml:space="preserve">488</w:t>
+              <w:t xml:space="preserve">518</w:t>
             </w:r>
           </w:p>
         </w:tc>
@@ -10145,7 +10145,7 @@
           <w:sz w:val="21"/>
           <w:szCs w:val="21"/>
         </w:rPr>
-        <w:t xml:space="preserve">The tables below cover permissions granted at least two years before September 2026 (182 schemes, 6,619 units), so every scheme has had time to start. 76% of those units have started.</w:t>
+        <w:t xml:space="preserve">The tables below cover permissions granted at least two years before September 2026 (181 schemes, 6,589 units), so every scheme has had time to start. 76% of those units have started.</w:t>
       </w:r>
     </w:p>
     <w:tbl>
@@ -10845,7 +10845,7 @@
                 <w:sz w:val="17"/>
                 <w:szCs w:val="17"/>
               </w:rPr>
-              <w:t xml:space="preserve">6</w:t>
+              <w:t xml:space="preserve">5</w:t>
             </w:r>
           </w:p>
         </w:tc>
@@ -10877,7 +10877,7 @@
                 <w:sz w:val="17"/>
                 <w:szCs w:val="17"/>
               </w:rPr>
-              <w:t xml:space="preserve">1,287</w:t>
+              <w:t xml:space="preserve">1,257</w:t>
             </w:r>
           </w:p>
         </w:tc>
@@ -10941,7 +10941,7 @@
                 <w:sz w:val="17"/>
                 <w:szCs w:val="17"/>
               </w:rPr>
-              <w:t xml:space="preserve">74%</w:t>
+              <w:t xml:space="preserve">76%</w:t>
             </w:r>
           </w:p>
         </w:tc>
@@ -11208,7 +11208,7 @@
           <w:sz w:val="21"/>
           <w:szCs w:val="21"/>
         </w:rPr>
-        <w:t xml:space="preserve">Standard planning applications and Part 8 schemes start at similar rates by units (74% and 80%). Three of the six SHD permissions have started, accounting for 74% of their 1,287 units. The three not started are Clonmacken Gardens (165 units), Annacotty (137 units, now past expiry, with a fresh application for the site lodged) and Punches Cross student accommodation (30 units).</w:t>
+        <w:t xml:space="preserve">Standard planning applications and Part 8 schemes start at similar rates by units (74% and 80%). Three of the 5 live SHD permissions have started, accounting for 76% of their 1,257 units. Not yet started: Clonmacken Gardens (165 units) and Annacotty (137 units, now past expiry). A sixth SHD, Punches Cross student accommodation, was quashed by the High Court in December 2023 and is excluded.</w:t>
       </w:r>
     </w:p>
     <w:tbl>
@@ -12106,7 +12106,7 @@
                 <w:sz w:val="17"/>
                 <w:szCs w:val="17"/>
               </w:rPr>
-              <w:t xml:space="preserve">5</w:t>
+              <w:t xml:space="preserve">4</w:t>
             </w:r>
           </w:p>
         </w:tc>
@@ -12138,7 +12138,7 @@
                 <w:sz w:val="17"/>
                 <w:szCs w:val="17"/>
               </w:rPr>
-              <w:t xml:space="preserve">112</w:t>
+              <w:t xml:space="preserve">82</w:t>
             </w:r>
           </w:p>
         </w:tc>
@@ -12202,7 +12202,7 @@
                 <w:sz w:val="17"/>
                 <w:szCs w:val="17"/>
               </w:rPr>
-              <w:t xml:space="preserve">23%</w:t>
+              <w:t xml:space="preserve">32%</w:t>
             </w:r>
           </w:p>
         </w:tc>
@@ -12572,7 +12572,7 @@
           <w:sz w:val="21"/>
           <w:szCs w:val="21"/>
         </w:rPr>
-        <w:t xml:space="preserve">Of the 5,478 permitted units not started, 3,816 have more than three years left on their permission. The near-term pipeline at risk is smaller: 311 units are already past expiry, 360 expire within 12 months and 235 within 12 to 24 months.</w:t>
+        <w:t xml:space="preserve">Of the 5,448 permitted units not started, 3,816 have more than three years left on their permission. The near-term pipeline at risk is smaller: 311 units are already past expiry, 360 expire within 12 months and 205 within 12 to 24 months.</w:t>
       </w:r>
     </w:p>
     <w:tbl>
@@ -13572,7 +13572,7 @@
                 <w:sz w:val="15"/>
                 <w:szCs w:val="15"/>
               </w:rPr>
-              <w:t xml:space="preserve">7</w:t>
+              <w:t xml:space="preserve">6</w:t>
             </w:r>
           </w:p>
         </w:tc>
@@ -13732,7 +13732,7 @@
                 <w:sz w:val="15"/>
                 <w:szCs w:val="15"/>
               </w:rPr>
-              <w:t xml:space="preserve">113</w:t>
+              <w:t xml:space="preserve">83</w:t>
             </w:r>
           </w:p>
         </w:tc>
@@ -13796,7 +13796,7 @@
                 <w:sz w:val="15"/>
                 <w:szCs w:val="15"/>
               </w:rPr>
-              <w:t xml:space="preserve">235</w:t>
+              <w:t xml:space="preserve">205</w:t>
             </w:r>
           </w:p>
         </w:tc>
@@ -18130,204 +18130,6 @@
                 <w:szCs w:val="17"/>
               </w:rPr>
               <w:t xml:space="preserve">19/02/2028</w:t>
-            </w:r>
-          </w:p>
-        </w:tc>
-      </w:tr>
-      <w:tr>
-        <w:trPr>
-          <w:cantSplit/>
-          <w:tblHeader w:val="off"/>
-        </w:trPr>
-        <w:tc>
-          <w:tcPr>
-            <w:tcW w:type="dxa" w:w="3100"/>
-            <w:tcBorders>
-              <w:top w:val="single" w:color="D0CFCA" w:sz="4"/>
-              <w:left w:val="single" w:color="D0CFCA" w:sz="4"/>
-              <w:bottom w:val="single" w:color="D0CFCA" w:sz="4"/>
-              <w:right w:val="single" w:color="D0CFCA" w:sz="4"/>
-            </w:tcBorders>
-            <w:tcMar>
-              <w:top w:type="dxa" w:w="50"/>
-              <w:left w:type="dxa" w:w="90"/>
-              <w:bottom w:type="dxa" w:w="50"/>
-              <w:right w:type="dxa" w:w="90"/>
-            </w:tcMar>
-          </w:tcPr>
-          <w:p>
-            <w:pPr>
-              <w:keepNext/>
-              <w:jc w:val="left"/>
-            </w:pPr>
-            <w:r>
-              <w:rPr>
-                <w:rFonts w:ascii="Arial" w:cs="Arial" w:eastAsia="Arial" w:hAnsi="Arial"/>
-                <w:color w:val="0B0B0B"/>
-                <w:sz w:val="17"/>
-                <w:szCs w:val="17"/>
-              </w:rPr>
-              <w:t xml:space="preserve">Punches Cross Student Accommodation - Limerick</w:t>
-            </w:r>
-          </w:p>
-        </w:tc>
-        <w:tc>
-          <w:tcPr>
-            <w:tcW w:type="dxa" w:w="1250"/>
-            <w:tcBorders>
-              <w:top w:val="single" w:color="D0CFCA" w:sz="4"/>
-              <w:left w:val="single" w:color="D0CFCA" w:sz="4"/>
-              <w:bottom w:val="single" w:color="D0CFCA" w:sz="4"/>
-              <w:right w:val="single" w:color="D0CFCA" w:sz="4"/>
-            </w:tcBorders>
-            <w:tcMar>
-              <w:top w:type="dxa" w:w="50"/>
-              <w:left w:type="dxa" w:w="90"/>
-              <w:bottom w:type="dxa" w:w="50"/>
-              <w:right w:type="dxa" w:w="90"/>
-            </w:tcMar>
-          </w:tcPr>
-          <w:p>
-            <w:pPr>
-              <w:keepNext/>
-              <w:jc w:val="right"/>
-            </w:pPr>
-            <w:r>
-              <w:rPr>
-                <w:rFonts w:ascii="Arial" w:cs="Arial" w:eastAsia="Arial" w:hAnsi="Arial"/>
-                <w:color w:val="0B0B0B"/>
-                <w:sz w:val="17"/>
-                <w:szCs w:val="17"/>
-              </w:rPr>
-              <w:t xml:space="preserve">ABP-315273</w:t>
-            </w:r>
-          </w:p>
-        </w:tc>
-        <w:tc>
-          <w:tcPr>
-            <w:tcW w:type="dxa" w:w="1900"/>
-            <w:tcBorders>
-              <w:top w:val="single" w:color="D0CFCA" w:sz="4"/>
-              <w:left w:val="single" w:color="D0CFCA" w:sz="4"/>
-              <w:bottom w:val="single" w:color="D0CFCA" w:sz="4"/>
-              <w:right w:val="single" w:color="D0CFCA" w:sz="4"/>
-            </w:tcBorders>
-            <w:tcMar>
-              <w:top w:type="dxa" w:w="50"/>
-              <w:left w:type="dxa" w:w="90"/>
-              <w:bottom w:type="dxa" w:w="50"/>
-              <w:right w:type="dxa" w:w="90"/>
-            </w:tcMar>
-          </w:tcPr>
-          <w:p>
-            <w:pPr>
-              <w:keepNext/>
-              <w:jc w:val="right"/>
-            </w:pPr>
-            <w:r>
-              <w:rPr>
-                <w:rFonts w:ascii="Arial" w:cs="Arial" w:eastAsia="Arial" w:hAnsi="Arial"/>
-                <w:color w:val="0B0B0B"/>
-                <w:sz w:val="17"/>
-                <w:szCs w:val="17"/>
-              </w:rPr>
-              <w:t xml:space="preserve">Ballinacurra</w:t>
-            </w:r>
-          </w:p>
-        </w:tc>
-        <w:tc>
-          <w:tcPr>
-            <w:tcW w:type="dxa" w:w="900"/>
-            <w:tcBorders>
-              <w:top w:val="single" w:color="D0CFCA" w:sz="4"/>
-              <w:left w:val="single" w:color="D0CFCA" w:sz="4"/>
-              <w:bottom w:val="single" w:color="D0CFCA" w:sz="4"/>
-              <w:right w:val="single" w:color="D0CFCA" w:sz="4"/>
-            </w:tcBorders>
-            <w:tcMar>
-              <w:top w:type="dxa" w:w="50"/>
-              <w:left w:type="dxa" w:w="90"/>
-              <w:bottom w:type="dxa" w:w="50"/>
-              <w:right w:type="dxa" w:w="90"/>
-            </w:tcMar>
-          </w:tcPr>
-          <w:p>
-            <w:pPr>
-              <w:keepNext/>
-              <w:jc w:val="right"/>
-            </w:pPr>
-            <w:r>
-              <w:rPr>
-                <w:rFonts w:ascii="Arial" w:cs="Arial" w:eastAsia="Arial" w:hAnsi="Arial"/>
-                <w:color w:val="0B0B0B"/>
-                <w:sz w:val="17"/>
-                <w:szCs w:val="17"/>
-              </w:rPr>
-              <w:t xml:space="preserve">Private</w:t>
-            </w:r>
-          </w:p>
-        </w:tc>
-        <w:tc>
-          <w:tcPr>
-            <w:tcW w:type="dxa" w:w="700"/>
-            <w:tcBorders>
-              <w:top w:val="single" w:color="D0CFCA" w:sz="4"/>
-              <w:left w:val="single" w:color="D0CFCA" w:sz="4"/>
-              <w:bottom w:val="single" w:color="D0CFCA" w:sz="4"/>
-              <w:right w:val="single" w:color="D0CFCA" w:sz="4"/>
-            </w:tcBorders>
-            <w:tcMar>
-              <w:top w:type="dxa" w:w="50"/>
-              <w:left w:type="dxa" w:w="90"/>
-              <w:bottom w:type="dxa" w:w="50"/>
-              <w:right w:type="dxa" w:w="90"/>
-            </w:tcMar>
-          </w:tcPr>
-          <w:p>
-            <w:pPr>
-              <w:keepNext/>
-              <w:jc w:val="right"/>
-            </w:pPr>
-            <w:r>
-              <w:rPr>
-                <w:rFonts w:ascii="Arial" w:cs="Arial" w:eastAsia="Arial" w:hAnsi="Arial"/>
-                <w:color w:val="0B0B0B"/>
-                <w:sz w:val="17"/>
-                <w:szCs w:val="17"/>
-              </w:rPr>
-              <w:t xml:space="preserve">30</w:t>
-            </w:r>
-          </w:p>
-        </w:tc>
-        <w:tc>
-          <w:tcPr>
-            <w:tcW w:type="dxa" w:w="1562"/>
-            <w:tcBorders>
-              <w:top w:val="single" w:color="D0CFCA" w:sz="4"/>
-              <w:left w:val="single" w:color="D0CFCA" w:sz="4"/>
-              <w:bottom w:val="single" w:color="D0CFCA" w:sz="4"/>
-              <w:right w:val="single" w:color="D0CFCA" w:sz="4"/>
-            </w:tcBorders>
-            <w:tcMar>
-              <w:top w:type="dxa" w:w="50"/>
-              <w:left w:type="dxa" w:w="90"/>
-              <w:bottom w:type="dxa" w:w="50"/>
-              <w:right w:type="dxa" w:w="90"/>
-            </w:tcMar>
-          </w:tcPr>
-          <w:p>
-            <w:pPr>
-              <w:keepNext/>
-              <w:jc w:val="right"/>
-            </w:pPr>
-            <w:r>
-              <w:rPr>
-                <w:rFonts w:ascii="Arial" w:cs="Arial" w:eastAsia="Arial" w:hAnsi="Arial"/>
-                <w:color w:val="0B0B0B"/>
-                <w:sz w:val="17"/>
-                <w:szCs w:val="17"/>
-              </w:rPr>
-              <w:t xml:space="preserve">22/02/2028</w:t>
             </w:r>
           </w:p>
         </w:tc>
@@ -19253,7 +19055,7 @@
           <w:sz w:val="21"/>
           <w:szCs w:val="21"/>
         </w:rPr>
-        <w:t xml:space="preserve">Among older permissions, Limerick City East has the highest start rate (91% of units), followed by City West (83%) and City North (62%). The county LEAs have smaller volumes and lower start rates: 31 of 165 units in Adare-Rathkeale and 206 of 418 in Newcastle West. Of the unstarted units in City East, 93% are on permissions granted since January 2025.</w:t>
+        <w:t xml:space="preserve">Among older permissions, Limerick City East has the highest start rate (91% of units), followed by City West (84%) and City North (62%). The county LEAs have smaller volumes and lower start rates: 31 of 165 units in Adare-Rathkeale and 206 of 418 in Newcastle West. Of the unstarted units in City East, 93% are on permissions granted since January 2025.</w:t>
       </w:r>
     </w:p>
     <w:tbl>
@@ -19953,7 +19755,7 @@
                 <w:sz w:val="17"/>
                 <w:szCs w:val="17"/>
               </w:rPr>
-              <w:t xml:space="preserve">59</w:t>
+              <w:t xml:space="preserve">58</w:t>
             </w:r>
           </w:p>
         </w:tc>
@@ -19985,7 +19787,7 @@
                 <w:sz w:val="17"/>
                 <w:szCs w:val="17"/>
               </w:rPr>
-              <w:t xml:space="preserve">2,517</w:t>
+              <w:t xml:space="preserve">2,487</w:t>
             </w:r>
           </w:p>
         </w:tc>
@@ -20049,7 +19851,7 @@
                 <w:sz w:val="17"/>
                 <w:szCs w:val="17"/>
               </w:rPr>
-              <w:t xml:space="preserve">83%</w:t>
+              <w:t xml:space="preserve">84%</w:t>
             </w:r>
           </w:p>
         </w:tc>
@@ -20781,7 +20583,7 @@
           <w:sz w:val="21"/>
           <w:szCs w:val="21"/>
         </w:rPr>
-        <w:t xml:space="preserve">The nine city neighbourhoods hold 8,781 permitted units across 157 schemes, 81% of the county total. The boundaries follow the Council’s grouping of 42 Electoral Divisions; King’s Island (coded 1a) is shown separately from the rest of the City Centre. Mungret, Patrickswell and the county towns fall outside the nine neighbourhoods and are reported as outside.</w:t>
+        <w:t xml:space="preserve">The nine city neighbourhoods hold 8,751 permitted units across 156 schemes, 81% of the county total. The boundaries follow the Council’s grouping of 42 Electoral Divisions; King’s Island (coded 1a) is shown separately from the rest of the City Centre. Mungret, Patrickswell and the county towns fall outside the nine neighbourhoods and are reported as outside.</w:t>
       </w:r>
     </w:p>
     <w:p>
@@ -23069,7 +22871,7 @@
                 <w:sz w:val="15"/>
                 <w:szCs w:val="15"/>
               </w:rPr>
-              <w:t xml:space="preserve">5</w:t>
+              <w:t xml:space="preserve">4</w:t>
             </w:r>
           </w:p>
         </w:tc>
@@ -23165,7 +22967,7 @@
                 <w:sz w:val="15"/>
                 <w:szCs w:val="15"/>
               </w:rPr>
-              <w:t xml:space="preserve">30</w:t>
+              <w:t xml:space="preserve">0</w:t>
             </w:r>
           </w:p>
         </w:tc>
@@ -23229,7 +23031,7 @@
                 <w:sz w:val="15"/>
                 <w:szCs w:val="15"/>
               </w:rPr>
-              <w:t xml:space="preserve">445</w:t>
+              <w:t xml:space="preserve">415</w:t>
             </w:r>
           </w:p>
         </w:tc>
@@ -25525,7 +25327,7 @@
                 <w:sz w:val="17"/>
                 <w:szCs w:val="17"/>
               </w:rPr>
-              <w:t xml:space="preserve">5</w:t>
+              <w:t xml:space="preserve">4</w:t>
             </w:r>
           </w:p>
         </w:tc>
@@ -25557,7 +25359,7 @@
                 <w:sz w:val="17"/>
                 <w:szCs w:val="17"/>
               </w:rPr>
-              <w:t xml:space="preserve">445</w:t>
+              <w:t xml:space="preserve">415</w:t>
             </w:r>
           </w:p>
         </w:tc>
@@ -25621,7 +25423,7 @@
                 <w:sz w:val="17"/>
                 <w:szCs w:val="17"/>
               </w:rPr>
-              <w:t xml:space="preserve">93%</w:t>
+              <w:t xml:space="preserve">100%</w:t>
             </w:r>
           </w:p>
         </w:tc>
@@ -26199,7 +26001,7 @@
           <w:sz w:val="21"/>
           <w:szCs w:val="21"/>
         </w:rPr>
-        <w:t xml:space="preserve">About 906 units are past expiry or will expire within two years without starting. Contacting the owners of the larger schemes on the watchlist would establish which are likely to proceed, which need an extension, and which are unlikely to be built.</w:t>
+        <w:t xml:space="preserve">About 876 units are past expiry or will expire within two years without starting. Contacting the owners of the larger schemes on the watchlist would establish which are likely to proceed, which need an extension, and which are unlikely to be built.</w:t>
       </w:r>
     </w:p>
     <w:p>
@@ -26567,7 +26369,7 @@
                 <w:sz w:val="17"/>
                 <w:szCs w:val="17"/>
               </w:rPr>
-              <w:t xml:space="preserve">266</w:t>
+              <w:t xml:space="preserve">265</w:t>
             </w:r>
           </w:p>
         </w:tc>
@@ -26637,7 +26439,7 @@
                 <w:sz w:val="17"/>
                 <w:szCs w:val="17"/>
               </w:rPr>
-              <w:t xml:space="preserve">251</w:t>
+              <w:t xml:space="preserve">250</w:t>
             </w:r>
           </w:p>
         </w:tc>
@@ -28140,7 +27942,7 @@
                 <w:sz w:val="17"/>
                 <w:szCs w:val="17"/>
               </w:rPr>
-              <w:t xml:space="preserve">33</w:t>
+              <w:t xml:space="preserve">32</w:t>
             </w:r>
           </w:p>
         </w:tc>
@@ -28172,7 +27974,7 @@
                 <w:sz w:val="17"/>
                 <w:szCs w:val="17"/>
               </w:rPr>
-              <w:t xml:space="preserve">1,123</w:t>
+              <w:t xml:space="preserve">1,093</w:t>
             </w:r>
           </w:p>
         </w:tc>
@@ -28236,7 +28038,7 @@
                 <w:sz w:val="17"/>
                 <w:szCs w:val="17"/>
               </w:rPr>
-              <w:t xml:space="preserve">58%</w:t>
+              <w:t xml:space="preserve">60%</w:t>
             </w:r>
           </w:p>
         </w:tc>

</xml_diff>

<commit_message>
Refresh all outputs; fold EOI landowner into Unknown; note CSO check in study report
Co-Authored-By: Claude Opus 5.5 <noreply@anthropic.com>
Claude-Session: https://claude.ai/code/session_01NzU6RZjdYh3MCXCEtKHHfb
</commit_message>
<xml_diff>
--- a/limerick_pipeline/delivery_study/Limerick_Residential_Delivery_Study.docx
+++ b/limerick_pipeline/delivery_study/Limerick_Residential_Delivery_Study.docx
@@ -112,7 +112,7 @@
           <w:sz w:val="21"/>
           <w:szCs w:val="21"/>
         </w:rPr>
-        <w:t xml:space="preserve">This study tracks 250 permitted residential schemes in County Limerick, totalling 10,787 units, from planning application to completion. It joins the national planning applications register, building control commencement notices and CIS project records at scheme level, and classifies each scheme as public (local authority, approved housing body or Land Development Agency) or private. The aim is to show how quickly permitted housing gets built, where it stalls, and which permissions are close to expiry.</w:t>
+        <w:t xml:space="preserve">This study tracks 252 permitted residential schemes in County Limerick, totalling 10,811 units, from planning application to completion. It joins the national planning applications register, building control commencement notices and CIS project records at scheme level, and classifies each scheme as public (local authority, approved housing body or Land Development Agency) or private. The aim is to show how quickly permitted housing gets built, where it stalls, and which permissions are close to expiry.</w:t>
       </w:r>
     </w:p>
     <w:p>
@@ -135,7 +135,7 @@
           <w:sz w:val="21"/>
           <w:szCs w:val="21"/>
         </w:rPr>
-        <w:t xml:space="preserve">The median time from application to permission is about 7 months. It is about 12 weeks where no further information is requested and there is no appeal, 0.7 years with a further information request, and 1.3 years on appeal. Further information was requested on 79% of private and LRD applications.</w:t>
+        <w:t xml:space="preserve">The median time from application to permission is about 7 months. It is about 12 weeks where no further information is requested and there is no appeal, 0.7 years with a further information request, and 1.3 years on appeal. Further information was requested on 80% of private and LRD applications.</w:t>
       </w:r>
     </w:p>
     <w:p>
@@ -219,7 +219,7 @@
           <w:sz w:val="21"/>
           <w:szCs w:val="21"/>
         </w:rPr>
-        <w:t xml:space="preserve">5,448 permitted units have not started. </w:t>
+        <w:t xml:space="preserve">5,472 permitted units have not started. </w:t>
       </w:r>
       <w:r>
         <w:rPr>
@@ -227,7 +227,7 @@
           <w:sz w:val="21"/>
           <w:szCs w:val="21"/>
         </w:rPr>
-        <w:t xml:space="preserve">Most sit on recent permissions: 3,816 units have more than three years left to run. The near-term risk is 876 units: 311 already past expiry and 565 expiring within two years.</w:t>
+        <w:t xml:space="preserve">Most sit on recent permissions: 3,826 units have more than three years left to run. The near-term risk is 890 units: 311 already past expiry and 579 expiring within two years.</w:t>
       </w:r>
     </w:p>
     <w:p>
@@ -1182,7 +1182,7 @@
           <w:sz w:val="21"/>
           <w:szCs w:val="21"/>
         </w:rPr>
-        <w:t xml:space="preserve">Limerick files Part 8 schemes in the planning register as “yy/8nnn”. CIS records many Part 8s under its own project numbers rather than the council file number, so these were matched to the register by location, date and unit count. The study includes 57 Part 8 schemes. 8 residential Part 8s in the register (80 units) were not held by CIS and have been added. Their start dates come from building control; their completion is not tracked, so those that have started are counted as under construction. Two further 2017 Part 8s have no recorded decision or commencement and are excluded: 178003 (27 units) and 178016 (20 units). Part 8 schemes before 2017 are not in the register.</w:t>
+        <w:t xml:space="preserve">Limerick files Part 8 schemes in the planning register as “yy/8nnn”. CIS records many Part 8s under its own project numbers rather than the council file number, so these were matched to the register by location, date and unit count. The study includes 57 Part 8 schemes. 10 residential Part 8s in the register (104 units) were not held by CIS and have been added. Their start dates come from building control; their completion is not tracked, so those that have started are counted as under construction. Two further 2017 Part 8s have no recorded decision or commencement and are excluded: 178003 (27 units) and 178016 (20 units). Part 8 schemes before 2017 are not in the register.</w:t>
       </w:r>
     </w:p>
     <w:p>
@@ -1233,6 +1233,19 @@
           <w:szCs w:val="21"/>
         </w:rPr>
         <w:t xml:space="preserve">The scheme list was checked against the KPMG audit of the Limerick city and suburbs pipeline. 11 live Limerick schemes (377 units) in that audit were missing from our CIS extracts and have been added, after confirming each one in the planning register. Schemes the audit lists that the register shows as refused, withdrawn or invalid were not added, and two audit schemes in County Clare fall outside this study. The check also found 6 Part 8 schemes (112 units) held twice in CIS, once under a CIS project number and once under the council file number; each is now counted once. Bedspace counts for permitted student accommodation schemes are taken from the purpose-built student accommodation (PBSA) schedule supplied for this study; existing student accommodation is not part of the pipeline.</w:t>
+      </w:r>
+    </w:p>
+    <w:p>
+      <w:pPr>
+        <w:spacing w:after="120" w:line="290"/>
+      </w:pPr>
+      <w:r>
+        <w:rPr>
+          <w:rFonts w:ascii="Arial" w:cs="Arial" w:eastAsia="Arial" w:hAnsi="Arial"/>
+          <w:sz w:val="21"/>
+          <w:szCs w:val="21"/>
+        </w:rPr>
+        <w:t xml:space="preserve">Granted residential applications in the planning register were also compared with Central Statistics Office figures on units granted permission in Limerick (BHQ17). Register grants of 10 or more units since 2021 that CIS does not hold were checked one by one against the register and An Coimisiún Pleanála case records: 2 live private schemes (24 units) were added, and the rest had been refused on appeal or were not new supply. One-off houses and schemes of under 10 units outside CIS are not covered by this study.</w:t>
       </w:r>
     </w:p>
     <w:p>
@@ -1853,7 +1866,7 @@
                 <w:sz w:val="17"/>
                 <w:szCs w:val="17"/>
               </w:rPr>
-              <w:t xml:space="preserve">0.5 (n=64)</w:t>
+              <w:t xml:space="preserve">0.6 (n=66)</w:t>
             </w:r>
           </w:p>
         </w:tc>
@@ -2517,7 +2530,7 @@
                 <w:sz w:val="17"/>
                 <w:szCs w:val="17"/>
               </w:rPr>
-              <w:t xml:space="preserve">0.6 (n=239)</w:t>
+              <w:t xml:space="preserve">0.6 (n=241)</w:t>
             </w:r>
           </w:p>
         </w:tc>
@@ -2657,7 +2670,7 @@
           <w:sz w:val="21"/>
           <w:szCs w:val="21"/>
         </w:rPr>
-        <w:t xml:space="preserve">Further information requests and appeals account for most of the variation in approval times. Where the Council asked for further information, the median rose from 0.2 to 0.7 years. Appealed decisions took a median of 1.3 years. Further information was requested on 79% of the applications in this group.</w:t>
+        <w:t xml:space="preserve">Further information requests and appeals account for most of the variation in approval times. Where the Council asked for further information, the median rose from 0.2 to 0.7 years. Appealed decisions took a median of 1.3 years. Further information was requested on 80% of the applications in this group.</w:t>
       </w:r>
     </w:p>
     <w:tbl>
@@ -3091,7 +3104,7 @@
                 <w:sz w:val="17"/>
                 <w:szCs w:val="17"/>
               </w:rPr>
-              <w:t xml:space="preserve">125</w:t>
+              <w:t xml:space="preserve">126</w:t>
             </w:r>
           </w:p>
         </w:tc>
@@ -3257,7 +3270,7 @@
                 <w:sz w:val="17"/>
                 <w:szCs w:val="17"/>
               </w:rPr>
-              <w:t xml:space="preserve">47</w:t>
+              <w:t xml:space="preserve">48</w:t>
             </w:r>
           </w:p>
         </w:tc>
@@ -3779,7 +3792,7 @@
                 <w:sz w:val="17"/>
                 <w:szCs w:val="17"/>
               </w:rPr>
-              <w:t xml:space="preserve">27% (118)</w:t>
+              <w:t xml:space="preserve">27% (120)</w:t>
             </w:r>
           </w:p>
         </w:tc>
@@ -3811,7 +3824,7 @@
                 <w:sz w:val="17"/>
                 <w:szCs w:val="17"/>
               </w:rPr>
-              <w:t xml:space="preserve">47% (106)</w:t>
+              <w:t xml:space="preserve">47% (107)</w:t>
             </w:r>
           </w:p>
         </w:tc>
@@ -3843,7 +3856,7 @@
                 <w:sz w:val="17"/>
                 <w:szCs w:val="17"/>
               </w:rPr>
-              <w:t xml:space="preserve">54% (82)</w:t>
+              <w:t xml:space="preserve">53% (83)</w:t>
             </w:r>
           </w:p>
         </w:tc>
@@ -3875,7 +3888,7 @@
                 <w:sz w:val="17"/>
                 <w:szCs w:val="17"/>
               </w:rPr>
-              <w:t xml:space="preserve">64% (70)</w:t>
+              <w:t xml:space="preserve">63% (71)</w:t>
             </w:r>
           </w:p>
         </w:tc>
@@ -4373,7 +4386,7 @@
                 <w:sz w:val="17"/>
                 <w:szCs w:val="17"/>
               </w:rPr>
-              <w:t xml:space="preserve">25% (207)</w:t>
+              <w:t xml:space="preserve">24% (209)</w:t>
             </w:r>
           </w:p>
         </w:tc>
@@ -4405,7 +4418,7 @@
                 <w:sz w:val="17"/>
                 <w:szCs w:val="17"/>
               </w:rPr>
-              <w:t xml:space="preserve">48% (181)</w:t>
+              <w:t xml:space="preserve">48% (182)</w:t>
             </w:r>
           </w:p>
         </w:tc>
@@ -4437,7 +4450,7 @@
                 <w:sz w:val="17"/>
                 <w:szCs w:val="17"/>
               </w:rPr>
-              <w:t xml:space="preserve">58% (142)</w:t>
+              <w:t xml:space="preserve">57% (143)</w:t>
             </w:r>
           </w:p>
         </w:tc>
@@ -4469,7 +4482,7 @@
                 <w:sz w:val="17"/>
                 <w:szCs w:val="17"/>
               </w:rPr>
-              <w:t xml:space="preserve">66% (119)</w:t>
+              <w:t xml:space="preserve">65% (120)</w:t>
             </w:r>
           </w:p>
         </w:tc>
@@ -4545,7 +4558,7 @@
           <w:sz w:val="21"/>
           <w:szCs w:val="21"/>
         </w:rPr>
-        <w:t xml:space="preserve">Public schemes account for 78 of the 265 schemes and 1,768 units (16%). Most are local authority schemes (61 schemes, 1,144 units), followed by approved housing bodies (16 schemes, 339 units). The Land Development Agency has one scheme in the sample: the former Limerick Gasworks site on Dock Road (25/60780, 285 units), granted in February 2026 and at tender stage.</w:t>
+        <w:t xml:space="preserve">Public schemes account for 78 of the 267 schemes and 1,768 units (16%). Most are local authority schemes (61 schemes, 1,144 units), followed by approved housing bodies (16 schemes, 339 units). The Land Development Agency has one scheme in the sample: the former Limerick Gasworks site on Dock Road (25/60780, 285 units), granted in February 2026 and at tender stage.</w:t>
       </w:r>
     </w:p>
     <w:tbl>
@@ -5115,7 +5128,7 @@
                 <w:sz w:val="17"/>
                 <w:szCs w:val="17"/>
               </w:rPr>
-              <w:t xml:space="preserve">187</w:t>
+              <w:t xml:space="preserve">189</w:t>
             </w:r>
           </w:p>
         </w:tc>
@@ -5147,7 +5160,7 @@
                 <w:sz w:val="17"/>
                 <w:szCs w:val="17"/>
               </w:rPr>
-              <w:t xml:space="preserve">9,282</w:t>
+              <w:t xml:space="preserve">9,306</w:t>
             </w:r>
           </w:p>
         </w:tc>
@@ -5892,7 +5905,7 @@
                 <w:sz w:val="17"/>
                 <w:szCs w:val="17"/>
               </w:rPr>
-              <w:t xml:space="preserve">31% (153)</w:t>
+              <w:t xml:space="preserve">30% (155)</w:t>
             </w:r>
           </w:p>
         </w:tc>
@@ -5924,7 +5937,7 @@
                 <w:sz w:val="17"/>
                 <w:szCs w:val="17"/>
               </w:rPr>
-              <w:t xml:space="preserve">50% (130)</w:t>
+              <w:t xml:space="preserve">50% (131)</w:t>
             </w:r>
           </w:p>
         </w:tc>
@@ -5956,7 +5969,7 @@
                 <w:sz w:val="17"/>
                 <w:szCs w:val="17"/>
               </w:rPr>
-              <w:t xml:space="preserve">58% (98)</w:t>
+              <w:t xml:space="preserve">58% (99)</w:t>
             </w:r>
           </w:p>
         </w:tc>
@@ -5988,7 +6001,7 @@
                 <w:sz w:val="17"/>
                 <w:szCs w:val="17"/>
               </w:rPr>
-              <w:t xml:space="preserve">65% (83)</w:t>
+              <w:t xml:space="preserve">64% (84)</w:t>
             </w:r>
           </w:p>
         </w:tc>
@@ -6757,7 +6770,7 @@
                 <w:sz w:val="17"/>
                 <w:szCs w:val="17"/>
               </w:rPr>
-              <w:t xml:space="preserve">130</w:t>
+              <w:t xml:space="preserve">131</w:t>
             </w:r>
           </w:p>
         </w:tc>
@@ -6789,7 +6802,7 @@
                 <w:sz w:val="17"/>
                 <w:szCs w:val="17"/>
               </w:rPr>
-              <w:t xml:space="preserve">5,414</w:t>
+              <w:t xml:space="preserve">5,428</w:t>
             </w:r>
           </w:p>
         </w:tc>
@@ -9044,7 +9057,7 @@
                 <w:sz w:val="17"/>
                 <w:szCs w:val="17"/>
               </w:rPr>
-              <w:t xml:space="preserve">93</w:t>
+              <w:t xml:space="preserve">95</w:t>
             </w:r>
           </w:p>
         </w:tc>
@@ -9076,7 +9089,7 @@
                 <w:sz w:val="17"/>
                 <w:szCs w:val="17"/>
               </w:rPr>
-              <w:t xml:space="preserve">5,137</w:t>
+              <w:t xml:space="preserve">5,161</w:t>
             </w:r>
           </w:p>
         </w:tc>
@@ -9656,7 +9669,7 @@
                 <w:sz w:val="17"/>
                 <w:szCs w:val="17"/>
               </w:rPr>
-              <w:t xml:space="preserve">161</w:t>
+              <w:t xml:space="preserve">163</w:t>
             </w:r>
           </w:p>
         </w:tc>
@@ -9688,7 +9701,7 @@
                 <w:sz w:val="17"/>
                 <w:szCs w:val="17"/>
               </w:rPr>
-              <w:t xml:space="preserve">6,454</w:t>
+              <w:t xml:space="preserve">6,478</w:t>
             </w:r>
           </w:p>
         </w:tc>
@@ -9758,7 +9771,7 @@
                 <w:sz w:val="17"/>
                 <w:szCs w:val="17"/>
               </w:rPr>
-              <w:t xml:space="preserve">47</w:t>
+              <w:t xml:space="preserve">48</w:t>
             </w:r>
           </w:p>
         </w:tc>
@@ -9790,7 +9803,7 @@
                 <w:sz w:val="17"/>
                 <w:szCs w:val="17"/>
               </w:rPr>
-              <w:t xml:space="preserve">2,689</w:t>
+              <w:t xml:space="preserve">2,703</w:t>
             </w:r>
           </w:p>
         </w:tc>
@@ -10145,7 +10158,7 @@
           <w:sz w:val="21"/>
           <w:szCs w:val="21"/>
         </w:rPr>
-        <w:t xml:space="preserve">The tables below cover permissions granted at least two years before September 2026 (181 schemes, 6,589 units), so every scheme has had time to start. 76% of those units have started.</w:t>
+        <w:t xml:space="preserve">The tables below cover permissions granted at least two years before September 2026 (182 schemes, 6,603 units), so every scheme has had time to start. 76% of those units have started.</w:t>
       </w:r>
     </w:p>
     <w:tbl>
@@ -10449,7 +10462,7 @@
                 <w:sz w:val="17"/>
                 <w:szCs w:val="17"/>
               </w:rPr>
-              <w:t xml:space="preserve">137</w:t>
+              <w:t xml:space="preserve">138</w:t>
             </w:r>
           </w:p>
         </w:tc>
@@ -10481,7 +10494,7 @@
                 <w:sz w:val="17"/>
                 <w:szCs w:val="17"/>
               </w:rPr>
-              <w:t xml:space="preserve">4,164</w:t>
+              <w:t xml:space="preserve">4,178</w:t>
             </w:r>
           </w:p>
         </w:tc>
@@ -11512,7 +11525,7 @@
                 <w:sz w:val="17"/>
                 <w:szCs w:val="17"/>
               </w:rPr>
-              <w:t xml:space="preserve">74</w:t>
+              <w:t xml:space="preserve">75</w:t>
             </w:r>
           </w:p>
         </w:tc>
@@ -11544,7 +11557,7 @@
                 <w:sz w:val="17"/>
                 <w:szCs w:val="17"/>
               </w:rPr>
-              <w:t xml:space="preserve">1,367</w:t>
+              <w:t xml:space="preserve">1,381</w:t>
             </w:r>
           </w:p>
         </w:tc>
@@ -11608,7 +11621,7 @@
                 <w:sz w:val="17"/>
                 <w:szCs w:val="17"/>
               </w:rPr>
-              <w:t xml:space="preserve">70%</w:t>
+              <w:t xml:space="preserve">69%</w:t>
             </w:r>
           </w:p>
         </w:tc>
@@ -12508,7 +12521,7 @@
       <w:r>
         <w:drawing>
           <wp:inline distT="0" distB="0" distL="0" distR="0">
-            <wp:extent cx="5220000" cy="2437604"/>
+            <wp:extent cx="5220000" cy="2429585"/>
             <wp:effectExtent t="0" r="0" b="0" l="0"/>
             <wp:docPr id="6" name="charts/c5_expiry_profile.png" descr="charts/c5_expiry_profile.png" title="charts/c5_expiry_profile.png"/>
             <wp:cNvGraphicFramePr>
@@ -12533,7 +12546,7 @@
                   <pic:spPr bwMode="auto">
                     <a:xfrm>
                       <a:off x="0" y="0"/>
-                      <a:ext cx="5220000" cy="2437604"/>
+                      <a:ext cx="5220000" cy="2429585"/>
                     </a:xfrm>
                     <a:prstGeom prst="rect">
                       <a:avLst/>
@@ -12572,7 +12585,7 @@
           <w:sz w:val="21"/>
           <w:szCs w:val="21"/>
         </w:rPr>
-        <w:t xml:space="preserve">Of the 5,448 permitted units not started, 3,816 have more than three years left on their permission. The near-term pipeline at risk is smaller: 311 units are already past expiry, 360 expire within 12 months and 205 within 12 to 24 months.</w:t>
+        <w:t xml:space="preserve">Of the 5,472 permitted units not started, 3,826 have more than three years left on their permission. The near-term pipeline at risk is smaller: 311 units are already past expiry, 374 expire within 12 months and 205 within 12 to 24 months.</w:t>
       </w:r>
     </w:p>
     <w:tbl>
@@ -13278,7 +13291,7 @@
                 <w:sz w:val="15"/>
                 <w:szCs w:val="15"/>
               </w:rPr>
-              <w:t xml:space="preserve">7</w:t>
+              <w:t xml:space="preserve">8</w:t>
             </w:r>
           </w:p>
         </w:tc>
@@ -13310,7 +13323,7 @@
                 <w:sz w:val="15"/>
                 <w:szCs w:val="15"/>
               </w:rPr>
-              <w:t xml:space="preserve">51</w:t>
+              <w:t xml:space="preserve">65</w:t>
             </w:r>
           </w:p>
         </w:tc>
@@ -13502,7 +13515,7 @@
                 <w:sz w:val="15"/>
                 <w:szCs w:val="15"/>
               </w:rPr>
-              <w:t xml:space="preserve">360</w:t>
+              <w:t xml:space="preserve">374</w:t>
             </w:r>
           </w:p>
         </w:tc>
@@ -14160,7 +14173,7 @@
                 <w:sz w:val="15"/>
                 <w:szCs w:val="15"/>
               </w:rPr>
-              <w:t xml:space="preserve">42</w:t>
+              <w:t xml:space="preserve">43</w:t>
             </w:r>
           </w:p>
         </w:tc>
@@ -14192,7 +14205,7 @@
                 <w:sz w:val="15"/>
                 <w:szCs w:val="15"/>
               </w:rPr>
-              <w:t xml:space="preserve">180</w:t>
+              <w:t xml:space="preserve">190</w:t>
             </w:r>
           </w:p>
         </w:tc>
@@ -14384,7 +14397,7 @@
                 <w:sz w:val="15"/>
                 <w:szCs w:val="15"/>
               </w:rPr>
-              <w:t xml:space="preserve">3,816</w:t>
+              <w:t xml:space="preserve">3,826</w:t>
             </w:r>
           </w:p>
         </w:tc>
@@ -16546,6 +16559,204 @@
                 <w:szCs w:val="17"/>
               </w:rPr>
               <w:t xml:space="preserve">04/08/2026</w:t>
+            </w:r>
+          </w:p>
+        </w:tc>
+      </w:tr>
+      <w:tr>
+        <w:trPr>
+          <w:cantSplit/>
+          <w:tblHeader w:val="off"/>
+        </w:trPr>
+        <w:tc>
+          <w:tcPr>
+            <w:tcW w:type="dxa" w:w="3100"/>
+            <w:tcBorders>
+              <w:top w:val="single" w:color="D0CFCA" w:sz="4"/>
+              <w:left w:val="single" w:color="D0CFCA" w:sz="4"/>
+              <w:bottom w:val="single" w:color="D0CFCA" w:sz="4"/>
+              <w:right w:val="single" w:color="D0CFCA" w:sz="4"/>
+            </w:tcBorders>
+            <w:tcMar>
+              <w:top w:type="dxa" w:w="50"/>
+              <w:left w:type="dxa" w:w="90"/>
+              <w:bottom w:type="dxa" w:w="50"/>
+              <w:right w:type="dxa" w:w="90"/>
+            </w:tcMar>
+          </w:tcPr>
+          <w:p>
+            <w:pPr>
+              <w:keepNext/>
+              <w:jc w:val="left"/>
+            </w:pPr>
+            <w:r>
+              <w:rPr>
+                <w:rFonts w:ascii="Arial" w:cs="Arial" w:eastAsia="Arial" w:hAnsi="Arial"/>
+                <w:color w:val="0B0B0B"/>
+                <w:sz w:val="17"/>
+                <w:szCs w:val="17"/>
+              </w:rPr>
+              <w:t xml:space="preserve">Register: the construction of 14 dwelling houses, including 2 no semi-detached 2</w:t>
+            </w:r>
+          </w:p>
+        </w:tc>
+        <w:tc>
+          <w:tcPr>
+            <w:tcW w:type="dxa" w:w="1250"/>
+            <w:tcBorders>
+              <w:top w:val="single" w:color="D0CFCA" w:sz="4"/>
+              <w:left w:val="single" w:color="D0CFCA" w:sz="4"/>
+              <w:bottom w:val="single" w:color="D0CFCA" w:sz="4"/>
+              <w:right w:val="single" w:color="D0CFCA" w:sz="4"/>
+            </w:tcBorders>
+            <w:tcMar>
+              <w:top w:type="dxa" w:w="50"/>
+              <w:left w:type="dxa" w:w="90"/>
+              <w:bottom w:type="dxa" w:w="50"/>
+              <w:right w:type="dxa" w:w="90"/>
+            </w:tcMar>
+          </w:tcPr>
+          <w:p>
+            <w:pPr>
+              <w:keepNext/>
+              <w:jc w:val="right"/>
+            </w:pPr>
+            <w:r>
+              <w:rPr>
+                <w:rFonts w:ascii="Arial" w:cs="Arial" w:eastAsia="Arial" w:hAnsi="Arial"/>
+                <w:color w:val="0B0B0B"/>
+                <w:sz w:val="17"/>
+                <w:szCs w:val="17"/>
+              </w:rPr>
+              <w:t xml:space="preserve">20525</w:t>
+            </w:r>
+          </w:p>
+        </w:tc>
+        <w:tc>
+          <w:tcPr>
+            <w:tcW w:type="dxa" w:w="1900"/>
+            <w:tcBorders>
+              <w:top w:val="single" w:color="D0CFCA" w:sz="4"/>
+              <w:left w:val="single" w:color="D0CFCA" w:sz="4"/>
+              <w:bottom w:val="single" w:color="D0CFCA" w:sz="4"/>
+              <w:right w:val="single" w:color="D0CFCA" w:sz="4"/>
+            </w:tcBorders>
+            <w:tcMar>
+              <w:top w:type="dxa" w:w="50"/>
+              <w:left w:type="dxa" w:w="90"/>
+              <w:bottom w:type="dxa" w:w="50"/>
+              <w:right w:type="dxa" w:w="90"/>
+            </w:tcMar>
+          </w:tcPr>
+          <w:p>
+            <w:pPr>
+              <w:keepNext/>
+              <w:jc w:val="right"/>
+            </w:pPr>
+            <w:r>
+              <w:rPr>
+                <w:rFonts w:ascii="Arial" w:cs="Arial" w:eastAsia="Arial" w:hAnsi="Arial"/>
+                <w:color w:val="0B0B0B"/>
+                <w:sz w:val="17"/>
+                <w:szCs w:val="17"/>
+              </w:rPr>
+              <w:t xml:space="preserve">Adare-Rathkeale</w:t>
+            </w:r>
+          </w:p>
+        </w:tc>
+        <w:tc>
+          <w:tcPr>
+            <w:tcW w:type="dxa" w:w="900"/>
+            <w:tcBorders>
+              <w:top w:val="single" w:color="D0CFCA" w:sz="4"/>
+              <w:left w:val="single" w:color="D0CFCA" w:sz="4"/>
+              <w:bottom w:val="single" w:color="D0CFCA" w:sz="4"/>
+              <w:right w:val="single" w:color="D0CFCA" w:sz="4"/>
+            </w:tcBorders>
+            <w:tcMar>
+              <w:top w:type="dxa" w:w="50"/>
+              <w:left w:type="dxa" w:w="90"/>
+              <w:bottom w:type="dxa" w:w="50"/>
+              <w:right w:type="dxa" w:w="90"/>
+            </w:tcMar>
+          </w:tcPr>
+          <w:p>
+            <w:pPr>
+              <w:keepNext/>
+              <w:jc w:val="right"/>
+            </w:pPr>
+            <w:r>
+              <w:rPr>
+                <w:rFonts w:ascii="Arial" w:cs="Arial" w:eastAsia="Arial" w:hAnsi="Arial"/>
+                <w:color w:val="0B0B0B"/>
+                <w:sz w:val="17"/>
+                <w:szCs w:val="17"/>
+              </w:rPr>
+              <w:t xml:space="preserve">Private</w:t>
+            </w:r>
+          </w:p>
+        </w:tc>
+        <w:tc>
+          <w:tcPr>
+            <w:tcW w:type="dxa" w:w="700"/>
+            <w:tcBorders>
+              <w:top w:val="single" w:color="D0CFCA" w:sz="4"/>
+              <w:left w:val="single" w:color="D0CFCA" w:sz="4"/>
+              <w:bottom w:val="single" w:color="D0CFCA" w:sz="4"/>
+              <w:right w:val="single" w:color="D0CFCA" w:sz="4"/>
+            </w:tcBorders>
+            <w:tcMar>
+              <w:top w:type="dxa" w:w="50"/>
+              <w:left w:type="dxa" w:w="90"/>
+              <w:bottom w:type="dxa" w:w="50"/>
+              <w:right w:type="dxa" w:w="90"/>
+            </w:tcMar>
+          </w:tcPr>
+          <w:p>
+            <w:pPr>
+              <w:keepNext/>
+              <w:jc w:val="right"/>
+            </w:pPr>
+            <w:r>
+              <w:rPr>
+                <w:rFonts w:ascii="Arial" w:cs="Arial" w:eastAsia="Arial" w:hAnsi="Arial"/>
+                <w:color w:val="0B0B0B"/>
+                <w:sz w:val="17"/>
+                <w:szCs w:val="17"/>
+              </w:rPr>
+              <w:t xml:space="preserve">14</w:t>
+            </w:r>
+          </w:p>
+        </w:tc>
+        <w:tc>
+          <w:tcPr>
+            <w:tcW w:type="dxa" w:w="1562"/>
+            <w:tcBorders>
+              <w:top w:val="single" w:color="D0CFCA" w:sz="4"/>
+              <w:left w:val="single" w:color="D0CFCA" w:sz="4"/>
+              <w:bottom w:val="single" w:color="D0CFCA" w:sz="4"/>
+              <w:right w:val="single" w:color="D0CFCA" w:sz="4"/>
+            </w:tcBorders>
+            <w:tcMar>
+              <w:top w:type="dxa" w:w="50"/>
+              <w:left w:type="dxa" w:w="90"/>
+              <w:bottom w:type="dxa" w:w="50"/>
+              <w:right w:type="dxa" w:w="90"/>
+            </w:tcMar>
+          </w:tcPr>
+          <w:p>
+            <w:pPr>
+              <w:keepNext/>
+              <w:jc w:val="right"/>
+            </w:pPr>
+            <w:r>
+              <w:rPr>
+                <w:rFonts w:ascii="Arial" w:cs="Arial" w:eastAsia="Arial" w:hAnsi="Arial"/>
+                <w:color w:val="0B0B0B"/>
+                <w:sz w:val="17"/>
+                <w:szCs w:val="17"/>
+              </w:rPr>
+              <w:t xml:space="preserve">01/12/2026</w:t>
             </w:r>
           </w:p>
         </w:tc>
@@ -19055,7 +19266,7 @@
           <w:sz w:val="21"/>
           <w:szCs w:val="21"/>
         </w:rPr>
-        <w:t xml:space="preserve">Among older permissions, Limerick City East has the highest start rate (91% of units), followed by City West (84%) and City North (62%). The county LEAs have smaller volumes and lower start rates: 31 of 165 units in Adare-Rathkeale and 206 of 418 in Newcastle West. Of the unstarted units in City East, 93% are on permissions granted since January 2025.</w:t>
+        <w:t xml:space="preserve">Among older permissions, Limerick City East has the highest start rate (91% of units), followed by City West (84%) and City North (62%). The county LEAs have smaller volumes and lower start rates: 31 of 179 units in Adare-Rathkeale and 206 of 418 in Newcastle West. Of the unstarted units in City East, 93% are on permissions granted since January 2025.</w:t>
       </w:r>
     </w:p>
     <w:tbl>
@@ -19953,7 +20164,7 @@
                 <w:sz w:val="17"/>
                 <w:szCs w:val="17"/>
               </w:rPr>
-              <w:t xml:space="preserve">10</w:t>
+              <w:t xml:space="preserve">11</w:t>
             </w:r>
           </w:p>
         </w:tc>
@@ -19985,7 +20196,7 @@
                 <w:sz w:val="17"/>
                 <w:szCs w:val="17"/>
               </w:rPr>
-              <w:t xml:space="preserve">165</w:t>
+              <w:t xml:space="preserve">179</w:t>
             </w:r>
           </w:p>
         </w:tc>
@@ -20049,7 +20260,7 @@
                 <w:sz w:val="17"/>
                 <w:szCs w:val="17"/>
               </w:rPr>
-              <w:t xml:space="preserve">19%</w:t>
+              <w:t xml:space="preserve">17%</w:t>
             </w:r>
           </w:p>
         </w:tc>
@@ -23395,7 +23606,7 @@
                 <w:sz w:val="15"/>
                 <w:szCs w:val="15"/>
               </w:rPr>
-              <w:t xml:space="preserve">92</w:t>
+              <w:t xml:space="preserve">94</w:t>
             </w:r>
           </w:p>
         </w:tc>
@@ -23491,7 +23702,7 @@
                 <w:sz w:val="15"/>
                 <w:szCs w:val="15"/>
               </w:rPr>
-              <w:t xml:space="preserve">896</w:t>
+              <w:t xml:space="preserve">920</w:t>
             </w:r>
           </w:p>
         </w:tc>
@@ -23555,7 +23766,7 @@
                 <w:sz w:val="15"/>
                 <w:szCs w:val="15"/>
               </w:rPr>
-              <w:t xml:space="preserve">2,036</w:t>
+              <w:t xml:space="preserve">2,060</w:t>
             </w:r>
           </w:p>
         </w:tc>
@@ -25723,7 +25934,7 @@
                 <w:sz w:val="17"/>
                 <w:szCs w:val="17"/>
               </w:rPr>
-              <w:t xml:space="preserve">70</w:t>
+              <w:t xml:space="preserve">71</w:t>
             </w:r>
           </w:p>
         </w:tc>
@@ -25755,7 +25966,7 @@
                 <w:sz w:val="17"/>
                 <w:szCs w:val="17"/>
               </w:rPr>
-              <w:t xml:space="preserve">1,476</w:t>
+              <w:t xml:space="preserve">1,490</w:t>
             </w:r>
           </w:p>
         </w:tc>
@@ -25819,7 +26030,7 @@
                 <w:sz w:val="17"/>
                 <w:szCs w:val="17"/>
               </w:rPr>
-              <w:t xml:space="preserve">58%</w:t>
+              <w:t xml:space="preserve">57%</w:t>
             </w:r>
           </w:p>
         </w:tc>
@@ -26001,7 +26212,7 @@
           <w:sz w:val="21"/>
           <w:szCs w:val="21"/>
         </w:rPr>
-        <w:t xml:space="preserve">About 876 units are past expiry or will expire within two years without starting. Contacting the owners of the larger schemes on the watchlist would establish which are likely to proceed, which need an extension, and which are unlikely to be built.</w:t>
+        <w:t xml:space="preserve">About 890 units are past expiry or will expire within two years without starting. Contacting the owners of the larger schemes on the watchlist would establish which are likely to proceed, which need an extension, and which are unlikely to be built.</w:t>
       </w:r>
     </w:p>
     <w:p>
@@ -26029,7 +26240,7 @@
           <w:sz w:val="21"/>
           <w:szCs w:val="21"/>
         </w:rPr>
-        <w:t xml:space="preserve">About 3,848 unstarted units sit on permissions less than two years old, mostly large schemes in Castletroy/Annacotty, Dooradoyle, the City Centre and Mungret. Roughly half of permissions start within two years, so a 12-month check on each is worthwhile.</w:t>
+        <w:t xml:space="preserve">About 3,858 unstarted units sit on permissions less than two years old, mostly large schemes in Castletroy/Annacotty, Dooradoyle, the City Centre and Mungret. Roughly half of permissions start within two years, so a 12-month check on each is worthwhile.</w:t>
       </w:r>
     </w:p>
     <w:p>
@@ -26369,7 +26580,7 @@
                 <w:sz w:val="17"/>
                 <w:szCs w:val="17"/>
               </w:rPr>
-              <w:t xml:space="preserve">265</w:t>
+              <w:t xml:space="preserve">267</w:t>
             </w:r>
           </w:p>
         </w:tc>
@@ -26439,7 +26650,7 @@
                 <w:sz w:val="17"/>
                 <w:szCs w:val="17"/>
               </w:rPr>
-              <w:t xml:space="preserve">250</w:t>
+              <w:t xml:space="preserve">252</w:t>
             </w:r>
           </w:p>
         </w:tc>
@@ -26999,7 +27210,7 @@
                 <w:sz w:val="17"/>
                 <w:szCs w:val="17"/>
               </w:rPr>
-              <w:t xml:space="preserve">8</w:t>
+              <w:t xml:space="preserve">10</w:t>
             </w:r>
           </w:p>
         </w:tc>
@@ -27069,7 +27280,7 @@
                 <w:sz w:val="17"/>
                 <w:szCs w:val="17"/>
               </w:rPr>
-              <w:t xml:space="preserve">80</w:t>
+              <w:t xml:space="preserve">104</w:t>
             </w:r>
           </w:p>
         </w:tc>
@@ -27744,7 +27955,7 @@
                 <w:sz w:val="17"/>
                 <w:szCs w:val="17"/>
               </w:rPr>
-              <w:t xml:space="preserve">51</w:t>
+              <w:t xml:space="preserve">52</w:t>
             </w:r>
           </w:p>
         </w:tc>
@@ -27776,7 +27987,7 @@
                 <w:sz w:val="17"/>
                 <w:szCs w:val="17"/>
               </w:rPr>
-              <w:t xml:space="preserve">840</w:t>
+              <w:t xml:space="preserve">854</w:t>
             </w:r>
           </w:p>
         </w:tc>
@@ -27840,7 +28051,7 @@
                 <w:sz w:val="17"/>
                 <w:szCs w:val="17"/>
               </w:rPr>
-              <w:t xml:space="preserve">63%</w:t>
+              <w:t xml:space="preserve">62%</w:t>
             </w:r>
           </w:p>
         </w:tc>

</xml_diff>

<commit_message>
Register: finished parcels, extension-of-duration dating, indicative yield, validation script
- parcel_status Built out renamed Finished; active_parcels view leaves them out
- GeoDirectory counts addresses for extensions of duration from the parent permission year (fixes PC-197025)
- one-address tolerance for schemes of 10+ homes; vacancy of new homes recorded and checked
- capacity_used and density_estimate_units filled on every parcel
- validate_register.py and Validation_Report.xlsx; rebuilt supply, dashboard, workbook after duplicate fixes

Co-Authored-By: Claude Opus 5.5 <noreply@anthropic.com>
Claude-Session: https://claude.ai/code/session_01NzU6RZjdYh3MCXCEtKHHfb
</commit_message>
<xml_diff>
--- a/limerick_pipeline/delivery_study/Limerick_Residential_Delivery_Study.docx
+++ b/limerick_pipeline/delivery_study/Limerick_Residential_Delivery_Study.docx
@@ -112,7 +112,7 @@
           <w:sz w:val="21"/>
           <w:szCs w:val="21"/>
         </w:rPr>
-        <w:t xml:space="preserve">This study tracks 252 permitted residential schemes in County Limerick, totalling 10,811 units, from planning application to completion. It joins the national planning applications register, building control commencement notices and CIS project records at scheme level, and classifies each scheme as public (local authority, approved housing body or Land Development Agency) or private. The aim is to show how quickly permitted housing gets built, where it stalls, and which permissions are close to expiry.</w:t>
+        <w:t xml:space="preserve">This study tracks 251 permitted residential schemes in County Limerick, totalling 10,793 units, from planning application to completion. It joins the national planning applications register, building control commencement notices and CIS project records at scheme level, and classifies each scheme as public (local authority, approved housing body or Land Development Agency) or private. The aim is to show how quickly permitted housing gets built, where it stalls, and which permissions are close to expiry.</w:t>
       </w:r>
     </w:p>
     <w:p>
@@ -204,7 +204,7 @@
           <w:sz w:val="21"/>
           <w:szCs w:val="21"/>
         </w:rPr>
-        <w:t xml:space="preserve">Public schemes (78 schemes, 1,768 units, 16% of units) have a median approval period of 0.3 years against 0.7 for private schemes. After permission, 43% of public schemes had started within two years against 50% of private schemes. Over the longer run the gap narrows: on permissions at least two years old, 81% of public units and 75% of private units have started.</w:t>
+        <w:t xml:space="preserve">Public schemes (76 schemes, 1,737 units, 16% of units) have a median approval period of 0.3 years against 0.7 for private schemes. After permission, 44% of public schemes had started within two years against 50% of private schemes. Over the longer run the gap narrows: on permissions at least two years old, 82% of public units and 75% of private units have started.</w:t>
       </w:r>
     </w:p>
     <w:p>
@@ -219,7 +219,7 @@
           <w:sz w:val="21"/>
           <w:szCs w:val="21"/>
         </w:rPr>
-        <w:t xml:space="preserve">5,472 permitted units have not started. </w:t>
+        <w:t xml:space="preserve">5,454 permitted units have not started. </w:t>
       </w:r>
       <w:r>
         <w:rPr>
@@ -1182,7 +1182,7 @@
           <w:sz w:val="21"/>
           <w:szCs w:val="21"/>
         </w:rPr>
-        <w:t xml:space="preserve">Limerick files Part 8 schemes in the planning register as “yy/8nnn”. CIS records many Part 8s under its own project numbers rather than the council file number, so these were matched to the register by location, date and unit count. The study includes 57 Part 8 schemes. 10 residential Part 8s in the register (104 units) were not held by CIS and have been added. Their start dates come from building control; their completion is not tracked, so those that have started are counted as under construction. Two further 2017 Part 8s have no recorded decision or commencement and are excluded: 178003 (27 units) and 178016 (20 units). Part 8 schemes before 2017 are not in the register.</w:t>
+        <w:t xml:space="preserve">Limerick files Part 8 schemes in the planning register as “yy/8nnn”. CIS records many Part 8s under its own project numbers rather than the council file number, so these were matched to the register by location, date and unit count. The study includes 55 Part 8 schemes. 10 residential Part 8s in the register (104 units) were not held by CIS and have been added. Their start dates come from building control; their completion is not tracked, so those that have started are counted as under construction. Two further 2017 Part 8s have no recorded decision or commencement and are excluded: 178003 (27 units) and 218005 (18 units) and 178016 (20 units). Part 8 schemes before 2017 are not in the register.</w:t>
       </w:r>
     </w:p>
     <w:p>
@@ -1232,7 +1232,7 @@
           <w:sz w:val="21"/>
           <w:szCs w:val="21"/>
         </w:rPr>
-        <w:t xml:space="preserve">The scheme list was checked against the KPMG audit of the Limerick city and suburbs pipeline. 11 live Limerick schemes (377 units) in that audit were missing from our CIS extracts and have been added, after confirming each one in the planning register. Schemes the audit lists that the register shows as refused, withdrawn or invalid were not added, and two audit schemes in County Clare fall outside this study. The check also found 6 Part 8 schemes (112 units) held twice in CIS, once under a CIS project number and once under the council file number; each is now counted once. Bedspace counts for permitted student accommodation schemes are taken from the purpose-built student accommodation (PBSA) schedule supplied for this study; existing student accommodation is not part of the pipeline.</w:t>
+        <w:t xml:space="preserve">The scheme list was checked against the KPMG audit of the Limerick city and suburbs pipeline. 11 live Limerick schemes (377 units) in that audit were missing from our CIS extracts and have been added, after confirming each one in the planning register. Schemes the audit lists that the register shows as refused, withdrawn or invalid were not added, and two audit schemes in County Clare fall outside this study. The check also found 8 Part 8 schemes (143 units) held twice in CIS, once under a CIS project number and once under the council file number; each is now counted once. Bedspace counts for permitted student accommodation schemes are taken from the purpose-built student accommodation (PBSA) schedule supplied for this study; existing student accommodation is not part of the pipeline.</w:t>
       </w:r>
     </w:p>
     <w:p>
@@ -1866,7 +1866,7 @@
                 <w:sz w:val="17"/>
                 <w:szCs w:val="17"/>
               </w:rPr>
-              <w:t xml:space="preserve">0.6 (n=66)</w:t>
+              <w:t xml:space="preserve">0.6 (n=65)</w:t>
             </w:r>
           </w:p>
         </w:tc>
@@ -2530,7 +2530,7 @@
                 <w:sz w:val="17"/>
                 <w:szCs w:val="17"/>
               </w:rPr>
-              <w:t xml:space="preserve">0.6 (n=241)</w:t>
+              <w:t xml:space="preserve">0.6 (n=240)</w:t>
             </w:r>
           </w:p>
         </w:tc>
@@ -3792,7 +3792,7 @@
                 <w:sz w:val="17"/>
                 <w:szCs w:val="17"/>
               </w:rPr>
-              <w:t xml:space="preserve">27% (120)</w:t>
+              <w:t xml:space="preserve">27% (119)</w:t>
             </w:r>
           </w:p>
         </w:tc>
@@ -3824,7 +3824,7 @@
                 <w:sz w:val="17"/>
                 <w:szCs w:val="17"/>
               </w:rPr>
-              <w:t xml:space="preserve">47% (107)</w:t>
+              <w:t xml:space="preserve">47% (106)</w:t>
             </w:r>
           </w:p>
         </w:tc>
@@ -3856,7 +3856,7 @@
                 <w:sz w:val="17"/>
                 <w:szCs w:val="17"/>
               </w:rPr>
-              <w:t xml:space="preserve">53% (83)</w:t>
+              <w:t xml:space="preserve">54% (82)</w:t>
             </w:r>
           </w:p>
         </w:tc>
@@ -3888,7 +3888,7 @@
                 <w:sz w:val="17"/>
                 <w:szCs w:val="17"/>
               </w:rPr>
-              <w:t xml:space="preserve">63% (71)</w:t>
+              <w:t xml:space="preserve">64% (70)</w:t>
             </w:r>
           </w:p>
         </w:tc>
@@ -4386,7 +4386,7 @@
                 <w:sz w:val="17"/>
                 <w:szCs w:val="17"/>
               </w:rPr>
-              <w:t xml:space="preserve">24% (209)</w:t>
+              <w:t xml:space="preserve">25% (208)</w:t>
             </w:r>
           </w:p>
         </w:tc>
@@ -4418,7 +4418,7 @@
                 <w:sz w:val="17"/>
                 <w:szCs w:val="17"/>
               </w:rPr>
-              <w:t xml:space="preserve">48% (182)</w:t>
+              <w:t xml:space="preserve">48% (181)</w:t>
             </w:r>
           </w:p>
         </w:tc>
@@ -4450,7 +4450,7 @@
                 <w:sz w:val="17"/>
                 <w:szCs w:val="17"/>
               </w:rPr>
-              <w:t xml:space="preserve">57% (143)</w:t>
+              <w:t xml:space="preserve">58% (142)</w:t>
             </w:r>
           </w:p>
         </w:tc>
@@ -4482,7 +4482,7 @@
                 <w:sz w:val="17"/>
                 <w:szCs w:val="17"/>
               </w:rPr>
-              <w:t xml:space="preserve">65% (120)</w:t>
+              <w:t xml:space="preserve">66% (119)</w:t>
             </w:r>
           </w:p>
         </w:tc>
@@ -4558,7 +4558,7 @@
           <w:sz w:val="21"/>
           <w:szCs w:val="21"/>
         </w:rPr>
-        <w:t xml:space="preserve">Public schemes account for 78 of the 267 schemes and 1,768 units (16%). Most are local authority schemes (61 schemes, 1,144 units), followed by approved housing bodies (16 schemes, 339 units). The Land Development Agency has one scheme in the sample: the former Limerick Gasworks site on Dock Road (25/60780, 285 units), granted in February 2026 and at tender stage.</w:t>
+        <w:t xml:space="preserve">Public schemes account for 76 of the 265 schemes and 1,737 units (16%). Most are local authority schemes (59 schemes, 1,113 units), followed by approved housing bodies (16 schemes, 339 units). The Land Development Agency has one scheme in the sample: the former Limerick Gasworks site on Dock Road (25/60780, 285 units), granted in February 2026 and at tender stage.</w:t>
       </w:r>
     </w:p>
     <w:tbl>
@@ -4898,7 +4898,7 @@
                 <w:sz w:val="17"/>
                 <w:szCs w:val="17"/>
               </w:rPr>
-              <w:t xml:space="preserve">78</w:t>
+              <w:t xml:space="preserve">76</w:t>
             </w:r>
           </w:p>
         </w:tc>
@@ -4930,7 +4930,7 @@
                 <w:sz w:val="17"/>
                 <w:szCs w:val="17"/>
               </w:rPr>
-              <w:t xml:space="preserve">1,768</w:t>
+              <w:t xml:space="preserve">1,737</w:t>
             </w:r>
           </w:p>
         </w:tc>
@@ -5325,7 +5325,7 @@
           <w:sz w:val="21"/>
           <w:szCs w:val="21"/>
         </w:rPr>
-        <w:t xml:space="preserve">Public schemes get through planning faster, mainly because Part 8 approvals are not subject to further information requests or appeal. They are slower to start: 43% had started within two years of approval, against 50% of private schemes. In our experience, public schemes usually go to tender and seek funding approval after planning, which adds time before a contractor is on site.</w:t>
+        <w:t xml:space="preserve">Public schemes get through planning faster, mainly because Part 8 approvals are not subject to further information requests or appeal. They are slower to start: 44% had started within two years of approval, against 50% of private schemes. In our experience, public schemes usually go to tender and seek funding approval after planning, which adds time before a contractor is on site.</w:t>
       </w:r>
     </w:p>
     <w:p>
@@ -5707,7 +5707,7 @@
                 <w:sz w:val="17"/>
                 <w:szCs w:val="17"/>
               </w:rPr>
-              <w:t xml:space="preserve">7% (54)</w:t>
+              <w:t xml:space="preserve">8% (53)</w:t>
             </w:r>
           </w:p>
         </w:tc>
@@ -5739,7 +5739,7 @@
                 <w:sz w:val="17"/>
                 <w:szCs w:val="17"/>
               </w:rPr>
-              <w:t xml:space="preserve">43% (51)</w:t>
+              <w:t xml:space="preserve">44% (50)</w:t>
             </w:r>
           </w:p>
         </w:tc>
@@ -5771,7 +5771,7 @@
                 <w:sz w:val="17"/>
                 <w:szCs w:val="17"/>
               </w:rPr>
-              <w:t xml:space="preserve">57% (44)</w:t>
+              <w:t xml:space="preserve">58% (43)</w:t>
             </w:r>
           </w:p>
         </w:tc>
@@ -5803,7 +5803,7 @@
                 <w:sz w:val="17"/>
                 <w:szCs w:val="17"/>
               </w:rPr>
-              <w:t xml:space="preserve">67% (36)</w:t>
+              <w:t xml:space="preserve">69% (35)</w:t>
             </w:r>
           </w:p>
         </w:tc>
@@ -6070,7 +6070,7 @@
           <w:sz w:val="21"/>
           <w:szCs w:val="21"/>
         </w:rPr>
-        <w:t xml:space="preserve">Measured by units rather than schemes, public delivery holds up: on permissions at least two years old, 81% of public units have started against 75% of private units. The difference reflects a larger number of small public schemes that have not started alongside larger public schemes that have.</w:t>
+        <w:t xml:space="preserve">Measured by units rather than schemes, public delivery holds up: on permissions at least two years old, 82% of public units have started against 75% of private units. The difference reflects a larger number of small public schemes that have not started alongside larger public schemes that have.</w:t>
       </w:r>
     </w:p>
     <w:tbl>
@@ -6374,7 +6374,7 @@
                 <w:sz w:val="17"/>
                 <w:szCs w:val="17"/>
               </w:rPr>
-              <w:t xml:space="preserve">37</w:t>
+              <w:t xml:space="preserve">36</w:t>
             </w:r>
           </w:p>
         </w:tc>
@@ -6406,7 +6406,7 @@
                 <w:sz w:val="17"/>
                 <w:szCs w:val="17"/>
               </w:rPr>
-              <w:t xml:space="preserve">856</w:t>
+              <w:t xml:space="preserve">838</w:t>
             </w:r>
           </w:p>
         </w:tc>
@@ -6470,7 +6470,7 @@
                 <w:sz w:val="17"/>
                 <w:szCs w:val="17"/>
               </w:rPr>
-              <w:t xml:space="preserve">80%</w:t>
+              <w:t xml:space="preserve">82%</w:t>
             </w:r>
           </w:p>
         </w:tc>
@@ -8450,7 +8450,7 @@
                 <w:sz w:val="17"/>
                 <w:szCs w:val="17"/>
               </w:rPr>
-              <w:t xml:space="preserve">10</w:t>
+              <w:t xml:space="preserve">9</w:t>
             </w:r>
           </w:p>
         </w:tc>
@@ -8514,7 +8514,7 @@
                 <w:sz w:val="17"/>
                 <w:szCs w:val="17"/>
               </w:rPr>
-              <w:t xml:space="preserve">9.3</w:t>
+              <w:t xml:space="preserve">8</w:t>
             </w:r>
           </w:p>
         </w:tc>
@@ -8546,7 +8546,7 @@
                 <w:sz w:val="17"/>
                 <w:szCs w:val="17"/>
               </w:rPr>
-              <w:t xml:space="preserve">5.8–11.4</w:t>
+              <w:t xml:space="preserve">5.3–10.7</w:t>
             </w:r>
           </w:p>
         </w:tc>
@@ -8616,7 +8616,7 @@
                 <w:sz w:val="17"/>
                 <w:szCs w:val="17"/>
               </w:rPr>
-              <w:t xml:space="preserve">7</w:t>
+              <w:t xml:space="preserve">8</w:t>
             </w:r>
           </w:p>
         </w:tc>
@@ -8648,7 +8648,7 @@
                 <w:sz w:val="17"/>
                 <w:szCs w:val="17"/>
               </w:rPr>
-              <w:t xml:space="preserve">1.9</w:t>
+              <w:t xml:space="preserve">2</w:t>
             </w:r>
           </w:p>
         </w:tc>
@@ -8680,7 +8680,7 @@
                 <w:sz w:val="17"/>
                 <w:szCs w:val="17"/>
               </w:rPr>
-              <w:t xml:space="preserve">26.5</w:t>
+              <w:t xml:space="preserve">34.3</w:t>
             </w:r>
           </w:p>
         </w:tc>
@@ -8712,7 +8712,7 @@
                 <w:sz w:val="17"/>
                 <w:szCs w:val="17"/>
               </w:rPr>
-              <w:t xml:space="preserve">16.7–46.2</w:t>
+              <w:t xml:space="preserve">20.9–50.3</w:t>
             </w:r>
           </w:p>
         </w:tc>
@@ -9057,7 +9057,7 @@
                 <w:sz w:val="17"/>
                 <w:szCs w:val="17"/>
               </w:rPr>
-              <w:t xml:space="preserve">95</w:t>
+              <w:t xml:space="preserve">94</w:t>
             </w:r>
           </w:p>
         </w:tc>
@@ -9089,7 +9089,7 @@
                 <w:sz w:val="17"/>
                 <w:szCs w:val="17"/>
               </w:rPr>
-              <w:t xml:space="preserve">5,161</w:t>
+              <w:t xml:space="preserve">5,143</w:t>
             </w:r>
           </w:p>
         </w:tc>
@@ -10158,7 +10158,7 @@
           <w:sz w:val="21"/>
           <w:szCs w:val="21"/>
         </w:rPr>
-        <w:t xml:space="preserve">The tables below cover permissions granted at least two years before September 2026 (182 schemes, 6,603 units), so every scheme has had time to start. 76% of those units have started.</w:t>
+        <w:t xml:space="preserve">The tables below cover permissions granted at least two years before September 2026 (181 schemes, 6,585 units), so every scheme has had time to start. 76% of those units have started.</w:t>
       </w:r>
     </w:p>
     <w:tbl>
@@ -11056,7 +11056,7 @@
                 <w:sz w:val="17"/>
                 <w:szCs w:val="17"/>
               </w:rPr>
-              <w:t xml:space="preserve">36</w:t>
+              <w:t xml:space="preserve">35</w:t>
             </w:r>
           </w:p>
         </w:tc>
@@ -11088,7 +11088,7 @@
                 <w:sz w:val="17"/>
                 <w:szCs w:val="17"/>
               </w:rPr>
-              <w:t xml:space="preserve">853</w:t>
+              <w:t xml:space="preserve">835</w:t>
             </w:r>
           </w:p>
         </w:tc>
@@ -11152,7 +11152,7 @@
                 <w:sz w:val="17"/>
                 <w:szCs w:val="17"/>
               </w:rPr>
-              <w:t xml:space="preserve">80%</w:t>
+              <w:t xml:space="preserve">82%</w:t>
             </w:r>
           </w:p>
         </w:tc>
@@ -11221,7 +11221,7 @@
           <w:sz w:val="21"/>
           <w:szCs w:val="21"/>
         </w:rPr>
-        <w:t xml:space="preserve">Standard planning applications and Part 8 schemes start at similar rates by units (74% and 80%). Three of the 5 live SHD permissions have started, accounting for 76% of their 1,257 units. Not yet started: Clonmacken Gardens (165 units) and Annacotty (137 units, now past expiry). A sixth SHD, Punches Cross student accommodation, was quashed by the High Court in December 2023 and is excluded.</w:t>
+        <w:t xml:space="preserve">Standard planning applications and Part 8 schemes start at similar rates by units (74% and 82%). Three of the 5 live SHD permissions have started, accounting for 76% of their 1,257 units. Not yet started: Clonmacken Gardens (165 units) and Annacotty (137 units, now past expiry). A sixth SHD, Punches Cross student accommodation, was quashed by the High Court in December 2023 and is excluded.</w:t>
       </w:r>
     </w:p>
     <w:tbl>
@@ -11723,7 +11723,7 @@
                 <w:sz w:val="17"/>
                 <w:szCs w:val="17"/>
               </w:rPr>
-              <w:t xml:space="preserve">25</w:t>
+              <w:t xml:space="preserve">28</w:t>
             </w:r>
           </w:p>
         </w:tc>
@@ -11755,7 +11755,7 @@
                 <w:sz w:val="17"/>
                 <w:szCs w:val="17"/>
               </w:rPr>
-              <w:t xml:space="preserve">2,875</w:t>
+              <w:t xml:space="preserve">3,260</w:t>
             </w:r>
           </w:p>
         </w:tc>
@@ -11787,7 +11787,7 @@
                 <w:sz w:val="17"/>
                 <w:szCs w:val="17"/>
               </w:rPr>
-              <w:t xml:space="preserve">2,388</w:t>
+              <w:t xml:space="preserve">2,773</w:t>
             </w:r>
           </w:p>
         </w:tc>
@@ -11819,7 +11819,7 @@
                 <w:sz w:val="17"/>
                 <w:szCs w:val="17"/>
               </w:rPr>
-              <w:t xml:space="preserve">83%</w:t>
+              <w:t xml:space="preserve">85%</w:t>
             </w:r>
           </w:p>
         </w:tc>
@@ -11851,7 +11851,7 @@
                 <w:sz w:val="17"/>
                 <w:szCs w:val="17"/>
               </w:rPr>
-              <w:t xml:space="preserve">1.6</w:t>
+              <w:t xml:space="preserve">1.7</w:t>
             </w:r>
           </w:p>
         </w:tc>
@@ -11921,7 +11921,7 @@
                 <w:sz w:val="17"/>
                 <w:szCs w:val="17"/>
               </w:rPr>
-              <w:t xml:space="preserve">55</w:t>
+              <w:t xml:space="preserve">52</w:t>
             </w:r>
           </w:p>
         </w:tc>
@@ -11953,7 +11953,7 @@
                 <w:sz w:val="17"/>
                 <w:szCs w:val="17"/>
               </w:rPr>
-              <w:t xml:space="preserve">1,837</w:t>
+              <w:t xml:space="preserve">1,452</w:t>
             </w:r>
           </w:p>
         </w:tc>
@@ -11985,7 +11985,7 @@
                 <w:sz w:val="17"/>
                 <w:szCs w:val="17"/>
               </w:rPr>
-              <w:t xml:space="preserve">1,363</w:t>
+              <w:t xml:space="preserve">978</w:t>
             </w:r>
           </w:p>
         </w:tc>
@@ -12017,7 +12017,7 @@
                 <w:sz w:val="17"/>
                 <w:szCs w:val="17"/>
               </w:rPr>
-              <w:t xml:space="preserve">74%</w:t>
+              <w:t xml:space="preserve">67%</w:t>
             </w:r>
           </w:p>
         </w:tc>
@@ -12317,7 +12317,7 @@
                 <w:sz w:val="17"/>
                 <w:szCs w:val="17"/>
               </w:rPr>
-              <w:t xml:space="preserve">23</w:t>
+              <w:t xml:space="preserve">22</w:t>
             </w:r>
           </w:p>
         </w:tc>
@@ -12349,7 +12349,7 @@
                 <w:sz w:val="17"/>
                 <w:szCs w:val="17"/>
               </w:rPr>
-              <w:t xml:space="preserve">428</w:t>
+              <w:t xml:space="preserve">410</w:t>
             </w:r>
           </w:p>
         </w:tc>
@@ -12413,7 +12413,7 @@
                 <w:sz w:val="17"/>
                 <w:szCs w:val="17"/>
               </w:rPr>
-              <w:t xml:space="preserve">68%</w:t>
+              <w:t xml:space="preserve">71%</w:t>
             </w:r>
           </w:p>
         </w:tc>
@@ -12585,7 +12585,7 @@
           <w:sz w:val="21"/>
           <w:szCs w:val="21"/>
         </w:rPr>
-        <w:t xml:space="preserve">Of the 5,472 permitted units not started, 3,826 have more than three years left on their permission. The near-term pipeline at risk is smaller: 311 units are already past expiry, 374 expire within 12 months and 205 within 12 to 24 months.</w:t>
+        <w:t xml:space="preserve">Of the 5,454 permitted units not started, 3,826 have more than three years left on their permission. The near-term pipeline at risk is smaller: 311 units are already past expiry, 374 expire within 12 months and 205 within 12 to 24 months.</w:t>
       </w:r>
     </w:p>
     <w:tbl>
@@ -14467,7 +14467,7 @@
                 <w:sz w:val="15"/>
                 <w:szCs w:val="15"/>
               </w:rPr>
-              <w:t xml:space="preserve">18</w:t>
+              <w:t xml:space="preserve">17</w:t>
             </w:r>
           </w:p>
         </w:tc>
@@ -14659,7 +14659,7 @@
                 <w:sz w:val="15"/>
                 <w:szCs w:val="15"/>
               </w:rPr>
-              <w:t xml:space="preserve">72</w:t>
+              <w:t xml:space="preserve">54</w:t>
             </w:r>
           </w:p>
         </w:tc>
@@ -14691,7 +14691,7 @@
                 <w:sz w:val="15"/>
                 <w:szCs w:val="15"/>
               </w:rPr>
-              <w:t xml:space="preserve">230</w:t>
+              <w:t xml:space="preserve">212</w:t>
             </w:r>
           </w:p>
         </w:tc>
@@ -19266,7 +19266,7 @@
           <w:sz w:val="21"/>
           <w:szCs w:val="21"/>
         </w:rPr>
-        <w:t xml:space="preserve">Among older permissions, Limerick City East has the highest start rate (91% of units), followed by City West (84%) and City North (62%). The county LEAs have smaller volumes and lower start rates: 31 of 179 units in Adare-Rathkeale and 206 of 418 in Newcastle West. Of the unstarted units in City East, 93% are on permissions granted since January 2025.</w:t>
+        <w:t xml:space="preserve">Among older permissions, Limerick City East has the highest start rate (91% of units), followed by City West (84%) and City North (62%). The county LEAs have smaller volumes and lower start rates: 31 of 179 units in Adare-Rathkeale and 206 of 400 in Newcastle West. Of the unstarted units in City East, 93% are on permissions granted since January 2025.</w:t>
       </w:r>
     </w:p>
     <w:tbl>
@@ -20560,7 +20560,7 @@
                 <w:sz w:val="17"/>
                 <w:szCs w:val="17"/>
               </w:rPr>
-              <w:t xml:space="preserve">17</w:t>
+              <w:t xml:space="preserve">16</w:t>
             </w:r>
           </w:p>
         </w:tc>
@@ -20592,7 +20592,7 @@
                 <w:sz w:val="17"/>
                 <w:szCs w:val="17"/>
               </w:rPr>
-              <w:t xml:space="preserve">418</w:t>
+              <w:t xml:space="preserve">400</w:t>
             </w:r>
           </w:p>
         </w:tc>
@@ -20656,7 +20656,7 @@
                 <w:sz w:val="17"/>
                 <w:szCs w:val="17"/>
               </w:rPr>
-              <w:t xml:space="preserve">49%</w:t>
+              <w:t xml:space="preserve">52%</w:t>
             </w:r>
           </w:p>
         </w:tc>
@@ -23606,7 +23606,7 @@
                 <w:sz w:val="15"/>
                 <w:szCs w:val="15"/>
               </w:rPr>
-              <w:t xml:space="preserve">94</w:t>
+              <w:t xml:space="preserve">93</w:t>
             </w:r>
           </w:p>
         </w:tc>
@@ -23702,7 +23702,7 @@
                 <w:sz w:val="15"/>
                 <w:szCs w:val="15"/>
               </w:rPr>
-              <w:t xml:space="preserve">920</w:t>
+              <w:t xml:space="preserve">902</w:t>
             </w:r>
           </w:p>
         </w:tc>
@@ -23766,7 +23766,7 @@
                 <w:sz w:val="15"/>
                 <w:szCs w:val="15"/>
               </w:rPr>
-              <w:t xml:space="preserve">2,060</w:t>
+              <w:t xml:space="preserve">2,042</w:t>
             </w:r>
           </w:p>
         </w:tc>
@@ -25934,7 +25934,7 @@
                 <w:sz w:val="17"/>
                 <w:szCs w:val="17"/>
               </w:rPr>
-              <w:t xml:space="preserve">71</w:t>
+              <w:t xml:space="preserve">70</w:t>
             </w:r>
           </w:p>
         </w:tc>
@@ -25966,7 +25966,7 @@
                 <w:sz w:val="17"/>
                 <w:szCs w:val="17"/>
               </w:rPr>
-              <w:t xml:space="preserve">1,490</w:t>
+              <w:t xml:space="preserve">1,472</w:t>
             </w:r>
           </w:p>
         </w:tc>
@@ -26030,7 +26030,7 @@
                 <w:sz w:val="17"/>
                 <w:szCs w:val="17"/>
               </w:rPr>
-              <w:t xml:space="preserve">57%</w:t>
+              <w:t xml:space="preserve">58%</w:t>
             </w:r>
           </w:p>
         </w:tc>
@@ -26580,7 +26580,7 @@
                 <w:sz w:val="17"/>
                 <w:szCs w:val="17"/>
               </w:rPr>
-              <w:t xml:space="preserve">267</w:t>
+              <w:t xml:space="preserve">265</w:t>
             </w:r>
           </w:p>
         </w:tc>
@@ -26650,7 +26650,7 @@
                 <w:sz w:val="17"/>
                 <w:szCs w:val="17"/>
               </w:rPr>
-              <w:t xml:space="preserve">252</w:t>
+              <w:t xml:space="preserve">251</w:t>
             </w:r>
           </w:p>
         </w:tc>
@@ -27140,7 +27140,7 @@
                 <w:sz w:val="17"/>
                 <w:szCs w:val="17"/>
               </w:rPr>
-              <w:t xml:space="preserve">57</w:t>
+              <w:t xml:space="preserve">55</w:t>
             </w:r>
           </w:p>
         </w:tc>
@@ -27350,7 +27350,7 @@
                 <w:sz w:val="17"/>
                 <w:szCs w:val="17"/>
               </w:rPr>
-              <w:t xml:space="preserve">78</w:t>
+              <w:t xml:space="preserve">76</w:t>
             </w:r>
           </w:p>
         </w:tc>
@@ -27420,7 +27420,7 @@
                 <w:sz w:val="17"/>
                 <w:szCs w:val="17"/>
               </w:rPr>
-              <w:t xml:space="preserve">1,768</w:t>
+              <w:t xml:space="preserve">1,737</w:t>
             </w:r>
           </w:p>
         </w:tc>
@@ -27955,7 +27955,7 @@
                 <w:sz w:val="17"/>
                 <w:szCs w:val="17"/>
               </w:rPr>
-              <w:t xml:space="preserve">52</w:t>
+              <w:t xml:space="preserve">51</w:t>
             </w:r>
           </w:p>
         </w:tc>
@@ -27987,7 +27987,7 @@
                 <w:sz w:val="17"/>
                 <w:szCs w:val="17"/>
               </w:rPr>
-              <w:t xml:space="preserve">854</w:t>
+              <w:t xml:space="preserve">836</w:t>
             </w:r>
           </w:p>
         </w:tc>
@@ -28051,7 +28051,7 @@
                 <w:sz w:val="17"/>
                 <w:szCs w:val="17"/>
               </w:rPr>
-              <w:t xml:space="preserve">62%</w:t>
+              <w:t xml:space="preserve">63%</w:t>
             </w:r>
           </w:p>
         </w:tc>

</xml_diff>